<commit_message>
Tantara T6 : sary 2 isaky ny seho ao amin'ny LESONA (22 diagrama SVG vaovao), fanisana Sary mandeha ho azy (1-47)
Co-authored-by: arena-agent <297053741+arena-agent@users.noreply.github.com>
</commit_message>
<xml_diff>
--- a/manuel-tantara-t6/livrables/Echantillon_Seho1_Tantara_T6_JLearn.docx
+++ b/manuel-tantara-t6/livrables/Echantillon_Seho1_Tantara_T6_JLearn.docx
@@ -4188,6 +4188,90 @@
           <w:szCs w:val="22"/>
         </w:rPr>
         <w:t xml:space="preserve"> dinihina ho loharano ahalalana ny fomba fisainan'ny Ntaolo.</w:t>
+      </w:r>
+    </w:p>
+    <w:p>
+      <w:pPr>
+        <w:spacing w:after="40" w:before="0"/>
+        <w:jc w:val="left"/>
+      </w:pPr>
+      <w:r>
+        <w:rPr>
+          <w:rFonts w:ascii="Times New Roman" w:cs="Times New Roman" w:eastAsia="Times New Roman" w:hAnsi="Times New Roman"/>
+          <w:b w:val="false"/>
+          <w:bCs w:val="false"/>
+          <w:i w:val="false"/>
+          <w:iCs w:val="false"/>
+          <w:color w:val="000000"/>
+          <w:sz w:val="10"/>
+          <w:szCs w:val="10"/>
+        </w:rPr>
+        <w:t xml:space="preserve"/>
+      </w:r>
+    </w:p>
+    <w:p>
+      <w:pPr>
+        <w:spacing w:after="120"/>
+        <w:jc w:val="center"/>
+      </w:pPr>
+      <w:r>
+        <w:drawing>
+          <wp:inline distT="0" distB="0" distL="0" distR="0">
+            <wp:extent cx="4572000" cy="1790700"/>
+            <wp:effectExtent t="0" r="0" b="0" l="0"/>
+            <wp:docPr id="1" name="" descr="" title=""/>
+            <wp:cNvGraphicFramePr>
+              <a:graphicFrameLocks xmlns:a="http://schemas.openxmlformats.org/drawingml/2006/main" noChangeAspect="1"/>
+            </wp:cNvGraphicFramePr>
+            <a:graphic xmlns:a="http://schemas.openxmlformats.org/drawingml/2006/main">
+              <a:graphicData uri="http://schemas.openxmlformats.org/drawingml/2006/picture">
+                <pic:pic xmlns:pic="http://schemas.openxmlformats.org/drawingml/2006/picture">
+                  <pic:nvPicPr>
+                    <pic:cNvPr id="0" name="" descr=""/>
+                    <pic:cNvPicPr>
+                      <a:picLocks noChangeAspect="1" noChangeArrowheads="1"/>
+                    </pic:cNvPicPr>
+                  </pic:nvPicPr>
+                  <pic:blipFill>
+                    <a:blip r:embed="rId8" cstate="none"/>
+                    <a:srcRect/>
+                    <a:stretch>
+                      <a:fillRect/>
+                    </a:stretch>
+                  </pic:blipFill>
+                  <pic:spPr bwMode="auto">
+                    <a:xfrm>
+                      <a:off x="0" y="0"/>
+                      <a:ext cx="4572000" cy="1790700"/>
+                    </a:xfrm>
+                    <a:prstGeom prst="rect">
+                      <a:avLst/>
+                    </a:prstGeom>
+                  </pic:spPr>
+                </pic:pic>
+              </a:graphicData>
+            </a:graphic>
+          </wp:inline>
+        </w:drawing>
+      </w:r>
+    </w:p>
+    <w:p>
+      <w:pPr>
+        <w:spacing w:after="160" w:before="0"/>
+        <w:jc w:val="center"/>
+      </w:pPr>
+      <w:r>
+        <w:rPr>
+          <w:rFonts w:ascii="Times New Roman" w:cs="Times New Roman" w:eastAsia="Times New Roman" w:hAnsi="Times New Roman"/>
+          <w:b w:val="false"/>
+          <w:bCs w:val="false"/>
+          <w:i/>
+          <w:iCs/>
+          <w:color w:val="000000"/>
+          <w:sz w:val="18"/>
+          <w:szCs w:val="18"/>
+        </w:rPr>
+        <w:t xml:space="preserve">Sary 2 — Ny dingana mankany amin'ny fahalalana ara-tantara</w:t>
       </w:r>
     </w:p>
     <w:p>

</xml_diff>

<commit_message>
Tantara T6 : corrections audit externe (dates, sigles, sources, notes) + Word pro (12pt, marges, n° pages, Heading1, mg-MG, alt text, metadonnees) ; skills a jour
Co-authored-by: arena-agent <297053741+arena-agent@users.noreply.github.com>
</commit_message>
<xml_diff>
--- a/manuel-tantara-t6/livrables/Echantillon_Seho1_Tantara_T6_JLearn.docx
+++ b/manuel-tantara-t6/livrables/Echantillon_Seho1_Tantara_T6_JLearn.docx
@@ -53,8 +53,8 @@
           <w:i w:val="false"/>
           <w:iCs w:val="false"/>
           <w:color w:val="000000"/>
-          <w:sz w:val="26"/>
-          <w:szCs w:val="26"/>
+          <w:sz w:val="28"/>
+          <w:szCs w:val="28"/>
         </w:rPr>
         <w:t xml:space="preserve">SANTIONANY VAVOLOMBELONA — Seho 1</w:t>
       </w:r>
@@ -72,8 +72,8 @@
           <w:i w:val="false"/>
           <w:iCs w:val="false"/>
           <w:color w:val="000000"/>
-          <w:sz w:val="24"/>
-          <w:szCs w:val="24"/>
+          <w:sz w:val="26"/>
+          <w:szCs w:val="26"/>
         </w:rPr>
         <w:t xml:space="preserve">Famaritana ny Tantara : ny toetrany sy ny tombontsoa entiny</w:t>
       </w:r>
@@ -91,8 +91,8 @@
           <w:i/>
           <w:iCs/>
           <w:color w:val="000000"/>
-          <w:sz w:val="20"/>
-          <w:szCs w:val="20"/>
+          <w:sz w:val="24"/>
+          <w:szCs w:val="24"/>
         </w:rPr>
         <w:t xml:space="preserve">Version V1 — ho fankatoavana alohan'ny famokarana feno</w:t>
       </w:r>
@@ -104,6 +104,7 @@
     </w:p>
     <w:p>
       <w:pPr>
+        <w:pStyle w:val="Heading1"/>
         <w:spacing w:after="60" w:before="120"/>
         <w:jc w:val="center"/>
       </w:pPr>
@@ -134,8 +135,8 @@
           <w:i w:val="false"/>
           <w:iCs w:val="false"/>
           <w:color w:val="C00000"/>
-          <w:sz w:val="26"/>
-          <w:szCs w:val="26"/>
+          <w:sz w:val="28"/>
+          <w:szCs w:val="28"/>
         </w:rPr>
         <w:t xml:space="preserve">Famaritana ny Tantara : ny toetrany sy ny tombontsoa entiny</w:t>
       </w:r>
@@ -153,8 +154,8 @@
           <w:i w:val="false"/>
           <w:iCs w:val="false"/>
           <w:color w:val="000000"/>
-          <w:sz w:val="26"/>
-          <w:szCs w:val="26"/>
+          <w:sz w:val="28"/>
+          <w:szCs w:val="28"/>
         </w:rPr>
         <w:t xml:space="preserve">TAKELA-PANOMANAN-DESONA</w:t>
       </w:r>
@@ -199,8 +200,8 @@
                 <w:i w:val="false"/>
                 <w:iCs w:val="false"/>
                 <w:color w:val="000000"/>
-                <w:sz w:val="20"/>
-                <w:szCs w:val="20"/>
+                <w:sz w:val="24"/>
+                <w:szCs w:val="24"/>
               </w:rPr>
               <w:t xml:space="preserve">Taranja : </w:t>
             </w:r>
@@ -212,8 +213,8 @@
                 <w:i w:val="false"/>
                 <w:iCs w:val="false"/>
                 <w:color w:val="000000"/>
-                <w:sz w:val="20"/>
-                <w:szCs w:val="20"/>
+                <w:sz w:val="24"/>
+                <w:szCs w:val="24"/>
               </w:rPr>
               <w:t xml:space="preserve">Tantara</w:t>
             </w:r>
@@ -231,8 +232,8 @@
                 <w:i w:val="false"/>
                 <w:iCs w:val="false"/>
                 <w:color w:val="000000"/>
-                <w:sz w:val="20"/>
-                <w:szCs w:val="20"/>
+                <w:sz w:val="24"/>
+                <w:szCs w:val="24"/>
               </w:rPr>
               <w:t xml:space="preserve">Lohahevitra : </w:t>
             </w:r>
@@ -244,8 +245,8 @@
                 <w:i w:val="false"/>
                 <w:iCs w:val="false"/>
                 <w:color w:val="000000"/>
-                <w:sz w:val="20"/>
-                <w:szCs w:val="20"/>
+                <w:sz w:val="24"/>
+                <w:szCs w:val="24"/>
               </w:rPr>
               <w:t xml:space="preserve">Lohahevitra I — Fampidirana ny fianarana Tantara</w:t>
             </w:r>
@@ -263,8 +264,8 @@
                 <w:i w:val="false"/>
                 <w:iCs w:val="false"/>
                 <w:color w:val="000000"/>
-                <w:sz w:val="20"/>
-                <w:szCs w:val="20"/>
+                <w:sz w:val="24"/>
+                <w:szCs w:val="24"/>
               </w:rPr>
               <w:t xml:space="preserve">Lohateny : </w:t>
             </w:r>
@@ -276,8 +277,8 @@
                 <w:i w:val="false"/>
                 <w:iCs w:val="false"/>
                 <w:color w:val="000000"/>
-                <w:sz w:val="20"/>
-                <w:szCs w:val="20"/>
+                <w:sz w:val="24"/>
+                <w:szCs w:val="24"/>
               </w:rPr>
               <w:t xml:space="preserve">Famaritana ny Tantara : ny toetrany sy ny tombontsoa entiny</w:t>
             </w:r>
@@ -295,8 +296,8 @@
                 <w:i w:val="false"/>
                 <w:iCs w:val="false"/>
                 <w:color w:val="000000"/>
-                <w:sz w:val="20"/>
-                <w:szCs w:val="20"/>
+                <w:sz w:val="24"/>
+                <w:szCs w:val="24"/>
               </w:rPr>
               <w:t xml:space="preserve">Tanjona manokana : </w:t>
             </w:r>
@@ -308,8 +309,8 @@
                 <w:i w:val="false"/>
                 <w:iCs w:val="false"/>
                 <w:color w:val="000000"/>
-                <w:sz w:val="20"/>
-                <w:szCs w:val="20"/>
+                <w:sz w:val="24"/>
+                <w:szCs w:val="24"/>
               </w:rPr>
               <w:t xml:space="preserve">Amin'ny fiafaran'ny seho, ny mpianatra dia afaka mamaritra ny atao hoe Tantara, milaza ny toetrany ary manazava ny tombontsoa entin'ny fahaizana tantara.</w:t>
             </w:r>
@@ -327,8 +328,8 @@
                 <w:i w:val="false"/>
                 <w:iCs w:val="false"/>
                 <w:color w:val="000000"/>
-                <w:sz w:val="20"/>
-                <w:szCs w:val="20"/>
+                <w:sz w:val="24"/>
+                <w:szCs w:val="24"/>
               </w:rPr>
               <w:t xml:space="preserve">Fanovozan-kevitra : </w:t>
             </w:r>
@@ -340,10 +341,10 @@
                 <w:i w:val="false"/>
                 <w:iCs w:val="false"/>
                 <w:color w:val="000000"/>
-                <w:sz w:val="20"/>
-                <w:szCs w:val="20"/>
-              </w:rPr>
-              <w:t xml:space="preserve">PE T6 (MEN, nohavaozina) ; FRP Tantara T6 (LFK 1-b, 1-d, 1-e) ; boky Tantara J-Learn</w:t>
+                <w:sz w:val="24"/>
+                <w:szCs w:val="24"/>
+              </w:rPr>
+              <w:t xml:space="preserve">PE T6 (MEN, nohavaozina) ; FRP Tantara T6 (FRP T6, fizarana 1-b, 1-d, 1-e) ; boky Tantara J-Learn</w:t>
             </w:r>
           </w:p>
           <w:p>
@@ -359,8 +360,8 @@
                 <w:i w:val="false"/>
                 <w:iCs w:val="false"/>
                 <w:color w:val="000000"/>
-                <w:sz w:val="20"/>
-                <w:szCs w:val="20"/>
+                <w:sz w:val="24"/>
+                <w:szCs w:val="24"/>
               </w:rPr>
               <w:t xml:space="preserve">Fitaovana sy akora : </w:t>
             </w:r>
@@ -372,8 +373,8 @@
                 <w:i w:val="false"/>
                 <w:iCs w:val="false"/>
                 <w:color w:val="000000"/>
-                <w:sz w:val="20"/>
-                <w:szCs w:val="20"/>
+                <w:sz w:val="24"/>
+                <w:szCs w:val="24"/>
               </w:rPr>
               <w:t xml:space="preserve">Lahatsoratra (tahirin-kevitra), sary, solaitrabe, kahie</w:t>
             </w:r>
@@ -402,8 +403,8 @@
                 <w:i w:val="false"/>
                 <w:iCs w:val="false"/>
                 <w:color w:val="000000"/>
-                <w:sz w:val="20"/>
-                <w:szCs w:val="20"/>
+                <w:sz w:val="24"/>
+                <w:szCs w:val="24"/>
               </w:rPr>
               <w:t xml:space="preserve">Daty : </w:t>
             </w:r>
@@ -415,8 +416,8 @@
                 <w:i w:val="false"/>
                 <w:iCs w:val="false"/>
                 <w:color w:val="000000"/>
-                <w:sz w:val="20"/>
-                <w:szCs w:val="20"/>
+                <w:sz w:val="24"/>
+                <w:szCs w:val="24"/>
               </w:rPr>
               <w:t xml:space="preserve">________________</w:t>
             </w:r>
@@ -434,8 +435,8 @@
                 <w:i w:val="false"/>
                 <w:iCs w:val="false"/>
                 <w:color w:val="000000"/>
-                <w:sz w:val="20"/>
-                <w:szCs w:val="20"/>
+                <w:sz w:val="24"/>
+                <w:szCs w:val="24"/>
               </w:rPr>
               <w:t xml:space="preserve">Kilasy : </w:t>
             </w:r>
@@ -447,8 +448,8 @@
                 <w:i w:val="false"/>
                 <w:iCs w:val="false"/>
                 <w:color w:val="000000"/>
-                <w:sz w:val="20"/>
-                <w:szCs w:val="20"/>
+                <w:sz w:val="24"/>
+                <w:szCs w:val="24"/>
               </w:rPr>
               <w:t xml:space="preserve">T6</w:t>
             </w:r>
@@ -466,8 +467,8 @@
                 <w:i w:val="false"/>
                 <w:iCs w:val="false"/>
                 <w:color w:val="000000"/>
-                <w:sz w:val="20"/>
-                <w:szCs w:val="20"/>
+                <w:sz w:val="24"/>
+                <w:szCs w:val="24"/>
               </w:rPr>
               <w:t xml:space="preserve">Seho : </w:t>
             </w:r>
@@ -479,8 +480,8 @@
                 <w:i w:val="false"/>
                 <w:iCs w:val="false"/>
                 <w:color w:val="000000"/>
-                <w:sz w:val="20"/>
-                <w:szCs w:val="20"/>
+                <w:sz w:val="24"/>
+                <w:szCs w:val="24"/>
               </w:rPr>
               <w:t xml:space="preserve">voalohany (1/27)</w:t>
             </w:r>
@@ -498,8 +499,8 @@
                 <w:i w:val="false"/>
                 <w:iCs w:val="false"/>
                 <w:color w:val="000000"/>
-                <w:sz w:val="20"/>
-                <w:szCs w:val="20"/>
+                <w:sz w:val="24"/>
+                <w:szCs w:val="24"/>
               </w:rPr>
               <w:t xml:space="preserve">Faharetany : </w:t>
             </w:r>
@@ -511,8 +512,8 @@
                 <w:i w:val="false"/>
                 <w:iCs w:val="false"/>
                 <w:color w:val="000000"/>
-                <w:sz w:val="20"/>
-                <w:szCs w:val="20"/>
+                <w:sz w:val="24"/>
+                <w:szCs w:val="24"/>
               </w:rPr>
               <w:t xml:space="preserve">________________</w:t>
             </w:r>
@@ -588,8 +589,8 @@
                 <w:i w:val="false"/>
                 <w:iCs w:val="false"/>
                 <w:color w:val="000000"/>
-                <w:sz w:val="19"/>
-                <w:szCs w:val="19"/>
+                <w:sz w:val="22"/>
+                <w:szCs w:val="22"/>
               </w:rPr>
               <w:t xml:space="preserve">Dingana sy Faharetany</w:t>
             </w:r>
@@ -620,8 +621,8 @@
                 <w:i w:val="false"/>
                 <w:iCs w:val="false"/>
                 <w:color w:val="000000"/>
-                <w:sz w:val="19"/>
-                <w:szCs w:val="19"/>
+                <w:sz w:val="22"/>
+                <w:szCs w:val="22"/>
               </w:rPr>
               <w:t xml:space="preserve">Fizotry ny lesona</w:t>
             </w:r>
@@ -652,8 +653,8 @@
                 <w:i w:val="false"/>
                 <w:iCs w:val="false"/>
                 <w:color w:val="000000"/>
-                <w:sz w:val="19"/>
-                <w:szCs w:val="19"/>
+                <w:sz w:val="22"/>
+                <w:szCs w:val="22"/>
               </w:rPr>
               <w:t xml:space="preserve">Teknika sy Paikady</w:t>
             </w:r>
@@ -684,8 +685,8 @@
                 <w:i w:val="false"/>
                 <w:iCs w:val="false"/>
                 <w:color w:val="000000"/>
-                <w:sz w:val="19"/>
-                <w:szCs w:val="19"/>
+                <w:sz w:val="22"/>
+                <w:szCs w:val="22"/>
               </w:rPr>
               <w:t xml:space="preserve">Fitaovana</w:t>
             </w:r>
@@ -716,8 +717,8 @@
                 <w:i w:val="false"/>
                 <w:iCs w:val="false"/>
                 <w:color w:val="000000"/>
-                <w:sz w:val="19"/>
-                <w:szCs w:val="19"/>
+                <w:sz w:val="22"/>
+                <w:szCs w:val="22"/>
               </w:rPr>
               <w:t xml:space="preserve">Fanamarihana</w:t>
             </w:r>
@@ -783,8 +784,8 @@
                 <w:i w:val="false"/>
                 <w:iCs w:val="false"/>
                 <w:color w:val="000000"/>
-                <w:sz w:val="19"/>
-                <w:szCs w:val="19"/>
+                <w:sz w:val="22"/>
+                <w:szCs w:val="22"/>
               </w:rPr>
               <w:t xml:space="preserve">Mpampianatra</w:t>
             </w:r>
@@ -814,8 +815,8 @@
                 <w:i w:val="false"/>
                 <w:iCs w:val="false"/>
                 <w:color w:val="000000"/>
-                <w:sz w:val="19"/>
-                <w:szCs w:val="19"/>
+                <w:sz w:val="22"/>
+                <w:szCs w:val="22"/>
               </w:rPr>
               <w:t xml:space="preserve">Mpianatra</w:t>
             </w:r>
@@ -939,10 +940,924 @@
                 <w:i w:val="false"/>
                 <w:iCs w:val="false"/>
                 <w:color w:val="000000"/>
+                <w:sz w:val="22"/>
+                <w:szCs w:val="22"/>
+              </w:rPr>
+              <w:t xml:space="preserve">I. Famerenana</w:t>
+            </w:r>
+          </w:p>
+        </w:tc>
+        <w:tc>
+          <w:tcPr>
+            <w:tcW w:type="pct" w:w="27%"/>
+            <w:tcMar>
+              <w:top w:type="dxa" w:w="60"/>
+              <w:left w:type="dxa" w:w="100"/>
+              <w:bottom w:type="dxa" w:w="60"/>
+              <w:right w:type="dxa" w:w="100"/>
+            </w:tcMar>
+          </w:tcPr>
+          <w:p>
+            <w:pPr>
+              <w:spacing w:after="30" w:before="0"/>
+              <w:jc w:val="left"/>
+            </w:pPr>
+            <w:r>
+              <w:rPr>
+                <w:rFonts w:ascii="Times New Roman" w:cs="Times New Roman" w:eastAsia="Times New Roman" w:hAnsi="Times New Roman"/>
+                <w:b w:val="false"/>
+                <w:bCs w:val="false"/>
+                <w:i/>
+                <w:iCs/>
+                <w:color w:val="000000"/>
+                <w:sz w:val="22"/>
+                <w:szCs w:val="22"/>
+              </w:rPr>
+              <w:t xml:space="preserve">Inona no tsaroanao tamin'ny lesona Tantara tany amin'ny ambaratonga fototra ?</w:t>
+            </w:r>
+          </w:p>
+          <w:p>
+            <w:pPr>
+              <w:spacing w:after="30" w:before="0"/>
+              <w:jc w:val="left"/>
+            </w:pPr>
+            <w:r>
+              <w:rPr>
+                <w:rFonts w:ascii="Times New Roman" w:cs="Times New Roman" w:eastAsia="Times New Roman" w:hAnsi="Times New Roman"/>
+                <w:b w:val="false"/>
+                <w:bCs w:val="false"/>
+                <w:i/>
+                <w:iCs/>
+                <w:color w:val="000000"/>
+                <w:sz w:val="22"/>
+                <w:szCs w:val="22"/>
+              </w:rPr>
+              <w:t xml:space="preserve">Milazà zava-nitranga iray efa lasa fantatrao eto amin'ny firenena.</w:t>
+            </w:r>
+          </w:p>
+          <w:p>
+            <w:pPr>
+              <w:spacing w:after="30" w:before="0"/>
+              <w:jc w:val="left"/>
+            </w:pPr>
+            <w:r>
+              <w:rPr>
+                <w:rFonts w:ascii="Times New Roman" w:cs="Times New Roman" w:eastAsia="Times New Roman" w:hAnsi="Times New Roman"/>
+                <w:b w:val="false"/>
+                <w:bCs w:val="false"/>
+                <w:i/>
+                <w:iCs/>
+                <w:color w:val="000000"/>
+                <w:sz w:val="22"/>
+                <w:szCs w:val="22"/>
+              </w:rPr>
+              <w:t xml:space="preserve">Iza no mitantara ny zavatra efa lasa ao amin'ny fianakaviana ?</w:t>
+            </w:r>
+          </w:p>
+        </w:tc>
+        <w:tc>
+          <w:tcPr>
+            <w:tcW w:type="pct" w:w="21%"/>
+            <w:tcMar>
+              <w:top w:type="dxa" w:w="60"/>
+              <w:left w:type="dxa" w:w="100"/>
+              <w:bottom w:type="dxa" w:w="60"/>
+              <w:right w:type="dxa" w:w="100"/>
+            </w:tcMar>
+          </w:tcPr>
+          <w:p>
+            <w:pPr>
+              <w:spacing w:after="40" w:before="0"/>
+              <w:jc w:val="left"/>
+            </w:pPr>
+            <w:r>
+              <w:rPr>
+                <w:rFonts w:ascii="Times New Roman" w:cs="Times New Roman" w:eastAsia="Times New Roman" w:hAnsi="Times New Roman"/>
+                <w:b/>
+                <w:bCs/>
+                <w:i w:val="false"/>
+                <w:iCs w:val="false"/>
+                <w:color w:val="000000"/>
                 <w:sz w:val="18"/>
                 <w:szCs w:val="18"/>
               </w:rPr>
-              <w:t xml:space="preserve">I. Famerenana</w:t>
+              <w:t xml:space="preserve">V.A. : </w:t>
+            </w:r>
+            <w:r>
+              <w:rPr>
+                <w:rFonts w:ascii="Times New Roman" w:cs="Times New Roman" w:eastAsia="Times New Roman" w:hAnsi="Times New Roman"/>
+                <w:b w:val="false"/>
+                <w:bCs w:val="false"/>
+                <w:i w:val="false"/>
+                <w:iCs w:val="false"/>
+                <w:color w:val="000000"/>
+                <w:sz w:val="18"/>
+                <w:szCs w:val="18"/>
+              </w:rPr>
+              <w:t xml:space="preserve">Nianatra momba ny razam-ben'ny Malagasy sy ny mpanjaka fahiny isika.</w:t>
+            </w:r>
+          </w:p>
+          <w:p>
+            <w:pPr>
+              <w:spacing w:after="40" w:before="0"/>
+              <w:jc w:val="left"/>
+            </w:pPr>
+            <w:r>
+              <w:rPr>
+                <w:rFonts w:ascii="Times New Roman" w:cs="Times New Roman" w:eastAsia="Times New Roman" w:hAnsi="Times New Roman"/>
+                <w:b/>
+                <w:bCs/>
+                <w:i w:val="false"/>
+                <w:iCs w:val="false"/>
+                <w:color w:val="000000"/>
+                <w:sz w:val="18"/>
+                <w:szCs w:val="18"/>
+              </w:rPr>
+              <w:t xml:space="preserve">V.A. : </w:t>
+            </w:r>
+            <w:r>
+              <w:rPr>
+                <w:rFonts w:ascii="Times New Roman" w:cs="Times New Roman" w:eastAsia="Times New Roman" w:hAnsi="Times New Roman"/>
+                <w:b w:val="false"/>
+                <w:bCs w:val="false"/>
+                <w:i w:val="false"/>
+                <w:iCs w:val="false"/>
+                <w:color w:val="000000"/>
+                <w:sz w:val="18"/>
+                <w:szCs w:val="18"/>
+              </w:rPr>
+              <w:t xml:space="preserve">Ohatra : ny fahaleovantenan'i Madagasikara tamin'ny 26 jona 1960.</w:t>
+            </w:r>
+          </w:p>
+          <w:p>
+            <w:pPr>
+              <w:spacing w:after="40" w:before="0"/>
+              <w:jc w:val="left"/>
+            </w:pPr>
+            <w:r>
+              <w:rPr>
+                <w:rFonts w:ascii="Times New Roman" w:cs="Times New Roman" w:eastAsia="Times New Roman" w:hAnsi="Times New Roman"/>
+                <w:b/>
+                <w:bCs/>
+                <w:i w:val="false"/>
+                <w:iCs w:val="false"/>
+                <w:color w:val="000000"/>
+                <w:sz w:val="18"/>
+                <w:szCs w:val="18"/>
+              </w:rPr>
+              <w:t xml:space="preserve">V.A. : </w:t>
+            </w:r>
+            <w:r>
+              <w:rPr>
+                <w:rFonts w:ascii="Times New Roman" w:cs="Times New Roman" w:eastAsia="Times New Roman" w:hAnsi="Times New Roman"/>
+                <w:b w:val="false"/>
+                <w:bCs w:val="false"/>
+                <w:i w:val="false"/>
+                <w:iCs w:val="false"/>
+                <w:color w:val="000000"/>
+                <w:sz w:val="18"/>
+                <w:szCs w:val="18"/>
+              </w:rPr>
+              <w:t xml:space="preserve">Ny ray aman-dreny sy ny raiamandreny be : lovan-tsofina izany.</w:t>
+            </w:r>
+          </w:p>
+        </w:tc>
+        <w:tc>
+          <w:tcPr>
+            <w:tcW w:type="pct" w:w="13%"/>
+            <w:tcMar>
+              <w:top w:type="dxa" w:w="60"/>
+              <w:left w:type="dxa" w:w="100"/>
+              <w:bottom w:type="dxa" w:w="60"/>
+              <w:right w:type="dxa" w:w="100"/>
+            </w:tcMar>
+          </w:tcPr>
+          <w:p>
+            <w:pPr>
+              <w:spacing w:after="20" w:before="0"/>
+              <w:jc w:val="left"/>
+            </w:pPr>
+            <w:r>
+              <w:rPr>
+                <w:rFonts w:ascii="Times New Roman" w:cs="Times New Roman" w:eastAsia="Times New Roman" w:hAnsi="Times New Roman"/>
+                <w:b w:val="false"/>
+                <w:bCs w:val="false"/>
+                <w:i w:val="false"/>
+                <w:iCs w:val="false"/>
+                <w:color w:val="000000"/>
+                <w:sz w:val="22"/>
+                <w:szCs w:val="22"/>
+              </w:rPr>
+              <w:t xml:space="preserve">Fanontaniana sy valiny am-bava</w:t>
+            </w:r>
+          </w:p>
+        </w:tc>
+        <w:tc>
+          <w:tcPr>
+            <w:tcW w:type="pct" w:w="13%"/>
+            <w:tcMar>
+              <w:top w:type="dxa" w:w="60"/>
+              <w:left w:type="dxa" w:w="100"/>
+              <w:bottom w:type="dxa" w:w="60"/>
+              <w:right w:type="dxa" w:w="100"/>
+            </w:tcMar>
+          </w:tcPr>
+          <w:p>
+            <w:pPr>
+              <w:spacing w:after="20" w:before="0"/>
+              <w:jc w:val="left"/>
+            </w:pPr>
+            <w:r>
+              <w:rPr>
+                <w:rFonts w:ascii="Times New Roman" w:cs="Times New Roman" w:eastAsia="Times New Roman" w:hAnsi="Times New Roman"/>
+                <w:b w:val="false"/>
+                <w:bCs w:val="false"/>
+                <w:i w:val="false"/>
+                <w:iCs w:val="false"/>
+                <w:color w:val="000000"/>
+                <w:sz w:val="22"/>
+                <w:szCs w:val="22"/>
+              </w:rPr>
+              <w:t xml:space="preserve">—</w:t>
+            </w:r>
+          </w:p>
+        </w:tc>
+        <w:tc>
+          <w:tcPr>
+            <w:tcW w:type="pct" w:w="12%"/>
+            <w:tcMar>
+              <w:top w:type="dxa" w:w="60"/>
+              <w:left w:type="dxa" w:w="100"/>
+              <w:bottom w:type="dxa" w:w="60"/>
+              <w:right w:type="dxa" w:w="100"/>
+            </w:tcMar>
+          </w:tcPr>
+          <w:p>
+            <w:pPr>
+              <w:spacing w:after="0" w:before="0"/>
+              <w:jc w:val="left"/>
+            </w:pPr>
+            <w:r>
+              <w:rPr>
+                <w:rFonts w:ascii="Times New Roman" w:cs="Times New Roman" w:eastAsia="Times New Roman" w:hAnsi="Times New Roman"/>
+                <w:b w:val="false"/>
+                <w:bCs w:val="false"/>
+                <w:i w:val="false"/>
+                <w:iCs w:val="false"/>
+                <w:color w:val="000000"/>
+                <w:sz w:val="22"/>
+                <w:szCs w:val="22"/>
+              </w:rPr>
+              <w:t xml:space="preserve"/>
+            </w:r>
+          </w:p>
+        </w:tc>
+      </w:tr>
+      <w:tr>
+        <w:tc>
+          <w:tcPr>
+            <w:gridSpan w:val="6"/>
+            <w:shd w:fill="E8F0E4" w:color="auto" w:val="clear"/>
+            <w:tcMar>
+              <w:top w:type="dxa" w:w="60"/>
+              <w:left w:type="dxa" w:w="100"/>
+              <w:bottom w:type="dxa" w:w="60"/>
+              <w:right w:type="dxa" w:w="100"/>
+            </w:tcMar>
+          </w:tcPr>
+          <w:p>
+            <w:pPr>
+              <w:spacing w:after="20" w:before="0"/>
+              <w:jc w:val="center"/>
+            </w:pPr>
+            <w:r>
+              <w:rPr>
+                <w:rFonts w:ascii="Times New Roman" w:cs="Times New Roman" w:eastAsia="Times New Roman" w:hAnsi="Times New Roman"/>
+                <w:b/>
+                <w:bCs/>
+                <w:i w:val="false"/>
+                <w:iCs w:val="false"/>
+                <w:color w:val="000000"/>
+                <w:sz w:val="24"/>
+                <w:szCs w:val="24"/>
+              </w:rPr>
+              <w:t xml:space="preserve">II. LESONA VAOVAO</w:t>
+            </w:r>
+          </w:p>
+        </w:tc>
+      </w:tr>
+      <w:tr>
+        <w:tc>
+          <w:tcPr>
+            <w:tcW w:type="pct" w:w="14%"/>
+            <w:tcMar>
+              <w:top w:type="dxa" w:w="60"/>
+              <w:left w:type="dxa" w:w="100"/>
+              <w:bottom w:type="dxa" w:w="60"/>
+              <w:right w:type="dxa" w:w="100"/>
+            </w:tcMar>
+          </w:tcPr>
+          <w:p>
+            <w:pPr>
+              <w:spacing w:after="20" w:before="0"/>
+              <w:jc w:val="left"/>
+            </w:pPr>
+            <w:r>
+              <w:rPr>
+                <w:rFonts w:ascii="Times New Roman" w:cs="Times New Roman" w:eastAsia="Times New Roman" w:hAnsi="Times New Roman"/>
+                <w:b/>
+                <w:bCs/>
+                <w:i w:val="false"/>
+                <w:iCs w:val="false"/>
+                <w:color w:val="000000"/>
+                <w:sz w:val="22"/>
+                <w:szCs w:val="22"/>
+              </w:rPr>
+              <w:t xml:space="preserve">1. Fanentanana</w:t>
+            </w:r>
+          </w:p>
+        </w:tc>
+        <w:tc>
+          <w:tcPr>
+            <w:tcW w:type="pct" w:w="27%"/>
+            <w:tcMar>
+              <w:top w:type="dxa" w:w="60"/>
+              <w:left w:type="dxa" w:w="100"/>
+              <w:bottom w:type="dxa" w:w="60"/>
+              <w:right w:type="dxa" w:w="100"/>
+            </w:tcMar>
+          </w:tcPr>
+          <w:p>
+            <w:pPr>
+              <w:spacing w:after="30" w:before="0"/>
+              <w:jc w:val="left"/>
+            </w:pPr>
+            <w:r>
+              <w:rPr>
+                <w:rFonts w:ascii="Times New Roman" w:cs="Times New Roman" w:eastAsia="Times New Roman" w:hAnsi="Times New Roman"/>
+                <w:b w:val="false"/>
+                <w:bCs w:val="false"/>
+                <w:i w:val="false"/>
+                <w:iCs w:val="false"/>
+                <w:color w:val="000000"/>
+                <w:sz w:val="22"/>
+                <w:szCs w:val="22"/>
+              </w:rPr>
+              <w:t xml:space="preserve">Manontany ny mpampianatra : « Rehefa mody any an-tanàna ianao, iza no mitantara ny niandohan'ny fokontaninao ? Ahoana no ahalalantsika fa marina izany tantara izany ? »</w:t>
+            </w:r>
+          </w:p>
+          <w:p>
+            <w:pPr>
+              <w:spacing w:after="30" w:before="0"/>
+              <w:jc w:val="left"/>
+            </w:pPr>
+            <w:r>
+              <w:rPr>
+                <w:rFonts w:ascii="Times New Roman" w:cs="Times New Roman" w:eastAsia="Times New Roman" w:hAnsi="Times New Roman"/>
+                <w:b w:val="false"/>
+                <w:bCs w:val="false"/>
+                <w:i w:val="false"/>
+                <w:iCs w:val="false"/>
+                <w:color w:val="000000"/>
+                <w:sz w:val="22"/>
+                <w:szCs w:val="22"/>
+              </w:rPr>
+              <w:t xml:space="preserve">Inona àry no atao hoe Tantara, ary nahoana isika no mianatra azy ?</w:t>
+            </w:r>
+          </w:p>
+          <w:p>
+            <w:pPr>
+              <w:spacing w:after="30" w:before="0"/>
+              <w:jc w:val="left"/>
+            </w:pPr>
+            <w:r>
+              <w:rPr>
+                <w:rFonts w:ascii="Times New Roman" w:cs="Times New Roman" w:eastAsia="Times New Roman" w:hAnsi="Times New Roman"/>
+                <w:b w:val="false"/>
+                <w:bCs w:val="false"/>
+                <w:i w:val="false"/>
+                <w:iCs w:val="false"/>
+                <w:color w:val="000000"/>
+                <w:sz w:val="22"/>
+                <w:szCs w:val="22"/>
+              </w:rPr>
+              <w:t xml:space="preserve">V.A. : Ny Tantara dia fandinihana ny zava-nitranga tamin'ny lasa ; ianarantsika izy mba hahafantarana ny fototra niaviantsika sy hanatsarana ny hoavy.</w:t>
+            </w:r>
+          </w:p>
+        </w:tc>
+        <w:tc>
+          <w:tcPr>
+            <w:tcW w:type="pct" w:w="21%"/>
+            <w:tcMar>
+              <w:top w:type="dxa" w:w="60"/>
+              <w:left w:type="dxa" w:w="100"/>
+              <w:bottom w:type="dxa" w:w="60"/>
+              <w:right w:type="dxa" w:w="100"/>
+            </w:tcMar>
+          </w:tcPr>
+          <w:p>
+            <w:pPr>
+              <w:spacing w:after="20" w:before="0"/>
+              <w:jc w:val="left"/>
+            </w:pPr>
+            <w:r>
+              <w:rPr>
+                <w:rFonts w:ascii="Times New Roman" w:cs="Times New Roman" w:eastAsia="Times New Roman" w:hAnsi="Times New Roman"/>
+                <w:b w:val="false"/>
+                <w:bCs w:val="false"/>
+                <w:i w:val="false"/>
+                <w:iCs w:val="false"/>
+                <w:color w:val="000000"/>
+                <w:sz w:val="22"/>
+                <w:szCs w:val="22"/>
+              </w:rPr>
+              <w:t xml:space="preserve">Mihaino, maneho hevitra ary mifanakalo hevitra amin'ny mpiara-mianatra.</w:t>
+            </w:r>
+          </w:p>
+        </w:tc>
+        <w:tc>
+          <w:tcPr>
+            <w:tcW w:type="pct" w:w="13%"/>
+            <w:tcMar>
+              <w:top w:type="dxa" w:w="60"/>
+              <w:left w:type="dxa" w:w="100"/>
+              <w:bottom w:type="dxa" w:w="60"/>
+              <w:right w:type="dxa" w:w="100"/>
+            </w:tcMar>
+          </w:tcPr>
+          <w:p>
+            <w:pPr>
+              <w:spacing w:after="20" w:before="0"/>
+              <w:jc w:val="left"/>
+            </w:pPr>
+            <w:r>
+              <w:rPr>
+                <w:rFonts w:ascii="Times New Roman" w:cs="Times New Roman" w:eastAsia="Times New Roman" w:hAnsi="Times New Roman"/>
+                <w:b w:val="false"/>
+                <w:bCs w:val="false"/>
+                <w:i w:val="false"/>
+                <w:iCs w:val="false"/>
+                <w:color w:val="000000"/>
+                <w:sz w:val="22"/>
+                <w:szCs w:val="22"/>
+              </w:rPr>
+              <w:t xml:space="preserve">Ady hevitra kely (remue-méninges)</w:t>
+            </w:r>
+          </w:p>
+        </w:tc>
+        <w:tc>
+          <w:tcPr>
+            <w:tcW w:type="pct" w:w="13%"/>
+            <w:tcMar>
+              <w:top w:type="dxa" w:w="60"/>
+              <w:left w:type="dxa" w:w="100"/>
+              <w:bottom w:type="dxa" w:w="60"/>
+              <w:right w:type="dxa" w:w="100"/>
+            </w:tcMar>
+          </w:tcPr>
+          <w:p>
+            <w:pPr>
+              <w:spacing w:after="20" w:before="0"/>
+              <w:jc w:val="left"/>
+            </w:pPr>
+            <w:r>
+              <w:rPr>
+                <w:rFonts w:ascii="Times New Roman" w:cs="Times New Roman" w:eastAsia="Times New Roman" w:hAnsi="Times New Roman"/>
+                <w:b w:val="false"/>
+                <w:bCs w:val="false"/>
+                <w:i w:val="false"/>
+                <w:iCs w:val="false"/>
+                <w:color w:val="000000"/>
+                <w:sz w:val="22"/>
+                <w:szCs w:val="22"/>
+              </w:rPr>
+              <w:t xml:space="preserve">Solaitrabe</w:t>
+            </w:r>
+          </w:p>
+        </w:tc>
+        <w:tc>
+          <w:tcPr>
+            <w:tcW w:type="pct" w:w="12%"/>
+            <w:tcMar>
+              <w:top w:type="dxa" w:w="60"/>
+              <w:left w:type="dxa" w:w="100"/>
+              <w:bottom w:type="dxa" w:w="60"/>
+              <w:right w:type="dxa" w:w="100"/>
+            </w:tcMar>
+          </w:tcPr>
+          <w:p>
+            <w:pPr>
+              <w:spacing w:after="0" w:before="0"/>
+              <w:jc w:val="left"/>
+            </w:pPr>
+            <w:r>
+              <w:rPr>
+                <w:rFonts w:ascii="Times New Roman" w:cs="Times New Roman" w:eastAsia="Times New Roman" w:hAnsi="Times New Roman"/>
+                <w:b w:val="false"/>
+                <w:bCs w:val="false"/>
+                <w:i w:val="false"/>
+                <w:iCs w:val="false"/>
+                <w:color w:val="000000"/>
+                <w:sz w:val="22"/>
+                <w:szCs w:val="22"/>
+              </w:rPr>
+              <w:t xml:space="preserve"/>
+            </w:r>
+          </w:p>
+        </w:tc>
+      </w:tr>
+      <w:tr>
+        <w:tc>
+          <w:tcPr>
+            <w:tcW w:type="pct" w:w="14%"/>
+            <w:tcMar>
+              <w:top w:type="dxa" w:w="60"/>
+              <w:left w:type="dxa" w:w="100"/>
+              <w:bottom w:type="dxa" w:w="60"/>
+              <w:right w:type="dxa" w:w="100"/>
+            </w:tcMar>
+          </w:tcPr>
+          <w:p>
+            <w:pPr>
+              <w:spacing w:after="20" w:before="0"/>
+              <w:jc w:val="left"/>
+            </w:pPr>
+            <w:r>
+              <w:rPr>
+                <w:rFonts w:ascii="Times New Roman" w:cs="Times New Roman" w:eastAsia="Times New Roman" w:hAnsi="Times New Roman"/>
+                <w:b/>
+                <w:bCs/>
+                <w:i w:val="false"/>
+                <w:iCs w:val="false"/>
+                <w:color w:val="000000"/>
+                <w:sz w:val="22"/>
+                <w:szCs w:val="22"/>
+              </w:rPr>
+              <w:t xml:space="preserve">2. Fampahafantarana ny lesona</w:t>
+            </w:r>
+          </w:p>
+        </w:tc>
+        <w:tc>
+          <w:tcPr>
+            <w:tcW w:type="pct" w:w="27%"/>
+            <w:tcMar>
+              <w:top w:type="dxa" w:w="60"/>
+              <w:left w:type="dxa" w:w="100"/>
+              <w:bottom w:type="dxa" w:w="60"/>
+              <w:right w:type="dxa" w:w="100"/>
+            </w:tcMar>
+          </w:tcPr>
+          <w:p>
+            <w:pPr>
+              <w:spacing w:after="20" w:before="0"/>
+              <w:jc w:val="left"/>
+            </w:pPr>
+            <w:r>
+              <w:rPr>
+                <w:rFonts w:ascii="Times New Roman" w:cs="Times New Roman" w:eastAsia="Times New Roman" w:hAnsi="Times New Roman"/>
+                <w:b w:val="false"/>
+                <w:bCs w:val="false"/>
+                <w:i w:val="false"/>
+                <w:iCs w:val="false"/>
+                <w:color w:val="000000"/>
+                <w:sz w:val="22"/>
+                <w:szCs w:val="22"/>
+              </w:rPr>
+              <w:t xml:space="preserve">Androany isika dia hianatra ny lesona hoe : « Famaritana ny Tantara ». Rehefa vita ny seho dia afaka mamaritra ny Tantara ianareo, mahalaza ny toetrany ary manazava ny tombontsoa entin'ny fahaizana tantara.</w:t>
+            </w:r>
+          </w:p>
+        </w:tc>
+        <w:tc>
+          <w:tcPr>
+            <w:tcW w:type="pct" w:w="21%"/>
+            <w:tcMar>
+              <w:top w:type="dxa" w:w="60"/>
+              <w:left w:type="dxa" w:w="100"/>
+              <w:bottom w:type="dxa" w:w="60"/>
+              <w:right w:type="dxa" w:w="100"/>
+            </w:tcMar>
+          </w:tcPr>
+          <w:p>
+            <w:pPr>
+              <w:spacing w:after="20" w:before="0"/>
+              <w:jc w:val="left"/>
+            </w:pPr>
+            <w:r>
+              <w:rPr>
+                <w:rFonts w:ascii="Times New Roman" w:cs="Times New Roman" w:eastAsia="Times New Roman" w:hAnsi="Times New Roman"/>
+                <w:b w:val="false"/>
+                <w:bCs w:val="false"/>
+                <w:i w:val="false"/>
+                <w:iCs w:val="false"/>
+                <w:color w:val="000000"/>
+                <w:sz w:val="22"/>
+                <w:szCs w:val="22"/>
+              </w:rPr>
+              <w:t xml:space="preserve">Mihaino ary mandika ny lohateny ao amin'ny kahie.</w:t>
+            </w:r>
+          </w:p>
+        </w:tc>
+        <w:tc>
+          <w:tcPr>
+            <w:tcW w:type="pct" w:w="13%"/>
+            <w:tcMar>
+              <w:top w:type="dxa" w:w="60"/>
+              <w:left w:type="dxa" w:w="100"/>
+              <w:bottom w:type="dxa" w:w="60"/>
+              <w:right w:type="dxa" w:w="100"/>
+            </w:tcMar>
+          </w:tcPr>
+          <w:p>
+            <w:pPr>
+              <w:spacing w:after="20" w:before="0"/>
+              <w:jc w:val="left"/>
+            </w:pPr>
+            <w:r>
+              <w:rPr>
+                <w:rFonts w:ascii="Times New Roman" w:cs="Times New Roman" w:eastAsia="Times New Roman" w:hAnsi="Times New Roman"/>
+                <w:b w:val="false"/>
+                <w:bCs w:val="false"/>
+                <w:i w:val="false"/>
+                <w:iCs w:val="false"/>
+                <w:color w:val="000000"/>
+                <w:sz w:val="22"/>
+                <w:szCs w:val="22"/>
+              </w:rPr>
+              <w:t xml:space="preserve">Filazana mivantana</w:t>
+            </w:r>
+          </w:p>
+        </w:tc>
+        <w:tc>
+          <w:tcPr>
+            <w:tcW w:type="pct" w:w="13%"/>
+            <w:tcMar>
+              <w:top w:type="dxa" w:w="60"/>
+              <w:left w:type="dxa" w:w="100"/>
+              <w:bottom w:type="dxa" w:w="60"/>
+              <w:right w:type="dxa" w:w="100"/>
+            </w:tcMar>
+          </w:tcPr>
+          <w:p>
+            <w:pPr>
+              <w:spacing w:after="20" w:before="0"/>
+              <w:jc w:val="left"/>
+            </w:pPr>
+            <w:r>
+              <w:rPr>
+                <w:rFonts w:ascii="Times New Roman" w:cs="Times New Roman" w:eastAsia="Times New Roman" w:hAnsi="Times New Roman"/>
+                <w:b w:val="false"/>
+                <w:bCs w:val="false"/>
+                <w:i w:val="false"/>
+                <w:iCs w:val="false"/>
+                <w:color w:val="000000"/>
+                <w:sz w:val="22"/>
+                <w:szCs w:val="22"/>
+              </w:rPr>
+              <w:t xml:space="preserve">Solaitrabe</w:t>
+            </w:r>
+          </w:p>
+        </w:tc>
+        <w:tc>
+          <w:tcPr>
+            <w:tcW w:type="pct" w:w="12%"/>
+            <w:tcMar>
+              <w:top w:type="dxa" w:w="60"/>
+              <w:left w:type="dxa" w:w="100"/>
+              <w:bottom w:type="dxa" w:w="60"/>
+              <w:right w:type="dxa" w:w="100"/>
+            </w:tcMar>
+          </w:tcPr>
+          <w:p>
+            <w:pPr>
+              <w:spacing w:after="0" w:before="0"/>
+              <w:jc w:val="left"/>
+            </w:pPr>
+            <w:r>
+              <w:rPr>
+                <w:rFonts w:ascii="Times New Roman" w:cs="Times New Roman" w:eastAsia="Times New Roman" w:hAnsi="Times New Roman"/>
+                <w:b w:val="false"/>
+                <w:bCs w:val="false"/>
+                <w:i w:val="false"/>
+                <w:iCs w:val="false"/>
+                <w:color w:val="000000"/>
+                <w:sz w:val="22"/>
+                <w:szCs w:val="22"/>
+              </w:rPr>
+              <w:t xml:space="preserve"/>
+            </w:r>
+          </w:p>
+        </w:tc>
+      </w:tr>
+      <w:tr>
+        <w:tc>
+          <w:tcPr>
+            <w:tcW w:type="pct" w:w="14%"/>
+            <w:tcMar>
+              <w:top w:type="dxa" w:w="60"/>
+              <w:left w:type="dxa" w:w="100"/>
+              <w:bottom w:type="dxa" w:w="60"/>
+              <w:right w:type="dxa" w:w="100"/>
+            </w:tcMar>
+          </w:tcPr>
+          <w:p>
+            <w:pPr>
+              <w:spacing w:after="20" w:before="0"/>
+              <w:jc w:val="left"/>
+            </w:pPr>
+            <w:r>
+              <w:rPr>
+                <w:rFonts w:ascii="Times New Roman" w:cs="Times New Roman" w:eastAsia="Times New Roman" w:hAnsi="Times New Roman"/>
+                <w:b/>
+                <w:bCs/>
+                <w:i w:val="false"/>
+                <w:iCs w:val="false"/>
+                <w:color w:val="000000"/>
+                <w:sz w:val="22"/>
+                <w:szCs w:val="22"/>
+              </w:rPr>
+              <w:t xml:space="preserve">3. Fandinihana ny tahirin-kevitra</w:t>
+            </w:r>
+          </w:p>
+        </w:tc>
+        <w:tc>
+          <w:tcPr>
+            <w:tcW w:type="pct" w:w="27%"/>
+            <w:tcMar>
+              <w:top w:type="dxa" w:w="60"/>
+              <w:left w:type="dxa" w:w="100"/>
+              <w:bottom w:type="dxa" w:w="60"/>
+              <w:right w:type="dxa" w:w="100"/>
+            </w:tcMar>
+          </w:tcPr>
+          <w:p>
+            <w:pPr>
+              <w:spacing w:after="20" w:before="0"/>
+              <w:jc w:val="left"/>
+            </w:pPr>
+            <w:r>
+              <w:rPr>
+                <w:rFonts w:ascii="Times New Roman" w:cs="Times New Roman" w:eastAsia="Times New Roman" w:hAnsi="Times New Roman"/>
+                <w:b w:val="false"/>
+                <w:bCs w:val="false"/>
+                <w:i w:val="false"/>
+                <w:iCs w:val="false"/>
+                <w:color w:val="000000"/>
+                <w:sz w:val="22"/>
+                <w:szCs w:val="22"/>
+              </w:rPr>
+              <w:t xml:space="preserve">Mizara ny lahatsoratra (tahirin-kevitra) ny mpampianatra : « Ny tantara dia fandinihana ny zava-mitranga, ny zava-bita, ary ny zavatra mikasika azy… ». Asaina mamaky mangina ny mpianatra, avy eo mamaky mafy ; hazavaina ireo teny sarotra : ny lasa, ny daty, ny vanim-potoana, ny zava-nitranga ara-tantara, ny fahamarinana ara-tantara.</w:t>
+            </w:r>
+          </w:p>
+        </w:tc>
+        <w:tc>
+          <w:tcPr>
+            <w:tcW w:type="pct" w:w="21%"/>
+            <w:tcMar>
+              <w:top w:type="dxa" w:w="60"/>
+              <w:left w:type="dxa" w:w="100"/>
+              <w:bottom w:type="dxa" w:w="60"/>
+              <w:right w:type="dxa" w:w="100"/>
+            </w:tcMar>
+          </w:tcPr>
+          <w:p>
+            <w:pPr>
+              <w:spacing w:after="20" w:before="0"/>
+              <w:jc w:val="left"/>
+            </w:pPr>
+            <w:r>
+              <w:rPr>
+                <w:rFonts w:ascii="Times New Roman" w:cs="Times New Roman" w:eastAsia="Times New Roman" w:hAnsi="Times New Roman"/>
+                <w:b w:val="false"/>
+                <w:bCs w:val="false"/>
+                <w:i w:val="false"/>
+                <w:iCs w:val="false"/>
+                <w:color w:val="000000"/>
+                <w:sz w:val="22"/>
+                <w:szCs w:val="22"/>
+              </w:rPr>
+              <w:t xml:space="preserve">Mamaky ny lahatsoratra, manamarika ireo teny sarotra ary manontany.</w:t>
+            </w:r>
+          </w:p>
+        </w:tc>
+        <w:tc>
+          <w:tcPr>
+            <w:tcW w:type="pct" w:w="13%"/>
+            <w:tcMar>
+              <w:top w:type="dxa" w:w="60"/>
+              <w:left w:type="dxa" w:w="100"/>
+              <w:bottom w:type="dxa" w:w="60"/>
+              <w:right w:type="dxa" w:w="100"/>
+            </w:tcMar>
+          </w:tcPr>
+          <w:p>
+            <w:pPr>
+              <w:spacing w:after="20" w:before="0"/>
+              <w:jc w:val="left"/>
+            </w:pPr>
+            <w:r>
+              <w:rPr>
+                <w:rFonts w:ascii="Times New Roman" w:cs="Times New Roman" w:eastAsia="Times New Roman" w:hAnsi="Times New Roman"/>
+                <w:b w:val="false"/>
+                <w:bCs w:val="false"/>
+                <w:i w:val="false"/>
+                <w:iCs w:val="false"/>
+                <w:color w:val="000000"/>
+                <w:sz w:val="22"/>
+                <w:szCs w:val="22"/>
+              </w:rPr>
+              <w:t xml:space="preserve">Famakiana sy fanadihadiana lahatsoratra</w:t>
+            </w:r>
+          </w:p>
+        </w:tc>
+        <w:tc>
+          <w:tcPr>
+            <w:tcW w:type="pct" w:w="13%"/>
+            <w:tcMar>
+              <w:top w:type="dxa" w:w="60"/>
+              <w:left w:type="dxa" w:w="100"/>
+              <w:bottom w:type="dxa" w:w="60"/>
+              <w:right w:type="dxa" w:w="100"/>
+            </w:tcMar>
+          </w:tcPr>
+          <w:p>
+            <w:pPr>
+              <w:spacing w:after="20" w:before="0"/>
+              <w:jc w:val="left"/>
+            </w:pPr>
+            <w:r>
+              <w:rPr>
+                <w:rFonts w:ascii="Times New Roman" w:cs="Times New Roman" w:eastAsia="Times New Roman" w:hAnsi="Times New Roman"/>
+                <w:b w:val="false"/>
+                <w:bCs w:val="false"/>
+                <w:i w:val="false"/>
+                <w:iCs w:val="false"/>
+                <w:color w:val="000000"/>
+                <w:sz w:val="22"/>
+                <w:szCs w:val="22"/>
+              </w:rPr>
+              <w:t xml:space="preserve">Lahatsoratra (tahirin-kevitra)</w:t>
+            </w:r>
+          </w:p>
+        </w:tc>
+        <w:tc>
+          <w:tcPr>
+            <w:tcW w:type="pct" w:w="12%"/>
+            <w:tcMar>
+              <w:top w:type="dxa" w:w="60"/>
+              <w:left w:type="dxa" w:w="100"/>
+              <w:bottom w:type="dxa" w:w="60"/>
+              <w:right w:type="dxa" w:w="100"/>
+            </w:tcMar>
+          </w:tcPr>
+          <w:p>
+            <w:pPr>
+              <w:spacing w:after="0" w:before="0"/>
+              <w:jc w:val="left"/>
+            </w:pPr>
+            <w:r>
+              <w:rPr>
+                <w:rFonts w:ascii="Times New Roman" w:cs="Times New Roman" w:eastAsia="Times New Roman" w:hAnsi="Times New Roman"/>
+                <w:b w:val="false"/>
+                <w:bCs w:val="false"/>
+                <w:i w:val="false"/>
+                <w:iCs w:val="false"/>
+                <w:color w:val="000000"/>
+                <w:sz w:val="22"/>
+                <w:szCs w:val="22"/>
+              </w:rPr>
+              <w:t xml:space="preserve"/>
+            </w:r>
+          </w:p>
+        </w:tc>
+      </w:tr>
+      <w:tr>
+        <w:tc>
+          <w:tcPr>
+            <w:tcW w:type="pct" w:w="14%"/>
+            <w:tcMar>
+              <w:top w:type="dxa" w:w="60"/>
+              <w:left w:type="dxa" w:w="100"/>
+              <w:bottom w:type="dxa" w:w="60"/>
+              <w:right w:type="dxa" w:w="100"/>
+            </w:tcMar>
+          </w:tcPr>
+          <w:p>
+            <w:pPr>
+              <w:spacing w:after="20" w:before="0"/>
+              <w:jc w:val="left"/>
+            </w:pPr>
+            <w:r>
+              <w:rPr>
+                <w:rFonts w:ascii="Times New Roman" w:cs="Times New Roman" w:eastAsia="Times New Roman" w:hAnsi="Times New Roman"/>
+                <w:b/>
+                <w:bCs/>
+                <w:i w:val="false"/>
+                <w:iCs w:val="false"/>
+                <w:color w:val="000000"/>
+                <w:sz w:val="22"/>
+                <w:szCs w:val="22"/>
+              </w:rPr>
+              <w:t xml:space="preserve">4. Famakafakana</w:t>
             </w:r>
           </w:p>
         </w:tc>
@@ -969,61 +1884,163 @@
                 <w:i/>
                 <w:iCs/>
                 <w:color w:val="000000"/>
+                <w:sz w:val="22"/>
+                <w:szCs w:val="22"/>
+              </w:rPr>
+              <w:t xml:space="preserve">Araka ny lahatsoratra, inona no dinihin'ny Tantara ?</w:t>
+            </w:r>
+          </w:p>
+          <w:p>
+            <w:pPr>
+              <w:spacing w:after="30" w:before="0"/>
+              <w:jc w:val="left"/>
+            </w:pPr>
+            <w:r>
+              <w:rPr>
+                <w:rFonts w:ascii="Times New Roman" w:cs="Times New Roman" w:eastAsia="Times New Roman" w:hAnsi="Times New Roman"/>
+                <w:b w:val="false"/>
+                <w:bCs w:val="false"/>
+                <w:i/>
+                <w:iCs/>
+                <w:color w:val="000000"/>
+                <w:sz w:val="22"/>
+                <w:szCs w:val="22"/>
+              </w:rPr>
+              <w:t xml:space="preserve">Iza no antsoina hoe mpahay tantara ?</w:t>
+            </w:r>
+          </w:p>
+          <w:p>
+            <w:pPr>
+              <w:spacing w:after="30" w:before="0"/>
+              <w:jc w:val="left"/>
+            </w:pPr>
+            <w:r>
+              <w:rPr>
+                <w:rFonts w:ascii="Times New Roman" w:cs="Times New Roman" w:eastAsia="Times New Roman" w:hAnsi="Times New Roman"/>
+                <w:b w:val="false"/>
+                <w:bCs w:val="false"/>
+                <w:i/>
+                <w:iCs/>
+                <w:color w:val="000000"/>
+                <w:sz w:val="22"/>
+                <w:szCs w:val="22"/>
+              </w:rPr>
+              <w:t xml:space="preserve">Ny zava-nitranga ara-tantara ve azo noforonina fotsiny ? Nahoana ?</w:t>
+            </w:r>
+          </w:p>
+          <w:p>
+            <w:pPr>
+              <w:spacing w:after="30" w:before="0"/>
+              <w:jc w:val="left"/>
+            </w:pPr>
+            <w:r>
+              <w:rPr>
+                <w:rFonts w:ascii="Times New Roman" w:cs="Times New Roman" w:eastAsia="Times New Roman" w:hAnsi="Times New Roman"/>
+                <w:b w:val="false"/>
+                <w:bCs w:val="false"/>
+                <w:i/>
+                <w:iCs/>
+                <w:color w:val="000000"/>
+                <w:sz w:val="22"/>
+                <w:szCs w:val="22"/>
+              </w:rPr>
+              <w:t xml:space="preserve">Milazà ohatra roa amin'ny zava-nitranga ara-tantara eto Madagasikara.</w:t>
+            </w:r>
+          </w:p>
+          <w:p>
+            <w:pPr>
+              <w:spacing w:after="30" w:before="0"/>
+              <w:jc w:val="left"/>
+            </w:pPr>
+            <w:r>
+              <w:rPr>
+                <w:rFonts w:ascii="Times New Roman" w:cs="Times New Roman" w:eastAsia="Times New Roman" w:hAnsi="Times New Roman"/>
+                <w:b w:val="false"/>
+                <w:bCs w:val="false"/>
+                <w:i/>
+                <w:iCs/>
+                <w:color w:val="000000"/>
+                <w:sz w:val="22"/>
+                <w:szCs w:val="22"/>
+              </w:rPr>
+              <w:t xml:space="preserve">Inona no soa azontsika avy amin'ny fahaizana ny tantara ?</w:t>
+            </w:r>
+          </w:p>
+        </w:tc>
+        <w:tc>
+          <w:tcPr>
+            <w:tcW w:type="pct" w:w="21%"/>
+            <w:tcMar>
+              <w:top w:type="dxa" w:w="60"/>
+              <w:left w:type="dxa" w:w="100"/>
+              <w:bottom w:type="dxa" w:w="60"/>
+              <w:right w:type="dxa" w:w="100"/>
+            </w:tcMar>
+          </w:tcPr>
+          <w:p>
+            <w:pPr>
+              <w:spacing w:after="40" w:before="0"/>
+              <w:jc w:val="left"/>
+            </w:pPr>
+            <w:r>
+              <w:rPr>
+                <w:rFonts w:ascii="Times New Roman" w:cs="Times New Roman" w:eastAsia="Times New Roman" w:hAnsi="Times New Roman"/>
+                <w:b/>
+                <w:bCs/>
+                <w:i w:val="false"/>
+                <w:iCs w:val="false"/>
+                <w:color w:val="000000"/>
                 <w:sz w:val="18"/>
                 <w:szCs w:val="18"/>
               </w:rPr>
-              <w:t xml:space="preserve">Inona no tsaroanao tamin'ny lesona Tantara tany amin'ny ambaratonga fototra ?</w:t>
-            </w:r>
-          </w:p>
-          <w:p>
-            <w:pPr>
-              <w:spacing w:after="30" w:before="0"/>
-              <w:jc w:val="left"/>
-            </w:pPr>
-            <w:r>
-              <w:rPr>
-                <w:rFonts w:ascii="Times New Roman" w:cs="Times New Roman" w:eastAsia="Times New Roman" w:hAnsi="Times New Roman"/>
-                <w:b w:val="false"/>
-                <w:bCs w:val="false"/>
-                <w:i/>
-                <w:iCs/>
+              <w:t xml:space="preserve">V.A. : </w:t>
+            </w:r>
+            <w:r>
+              <w:rPr>
+                <w:rFonts w:ascii="Times New Roman" w:cs="Times New Roman" w:eastAsia="Times New Roman" w:hAnsi="Times New Roman"/>
+                <w:b w:val="false"/>
+                <w:bCs w:val="false"/>
+                <w:i w:val="false"/>
+                <w:iCs w:val="false"/>
                 <w:color w:val="000000"/>
                 <w:sz w:val="18"/>
                 <w:szCs w:val="18"/>
               </w:rPr>
-              <w:t xml:space="preserve">Milazà zava-nitranga iray efa lasa fantatrao eto amin'ny firenena.</w:t>
-            </w:r>
-          </w:p>
-          <w:p>
-            <w:pPr>
-              <w:spacing w:after="30" w:before="0"/>
-              <w:jc w:val="left"/>
-            </w:pPr>
-            <w:r>
-              <w:rPr>
-                <w:rFonts w:ascii="Times New Roman" w:cs="Times New Roman" w:eastAsia="Times New Roman" w:hAnsi="Times New Roman"/>
-                <w:b w:val="false"/>
-                <w:bCs w:val="false"/>
-                <w:i/>
-                <w:iCs/>
+              <w:t xml:space="preserve">Ny zava-mitranga sy ny zava-bita tamin'ny lasa.</w:t>
+            </w:r>
+          </w:p>
+          <w:p>
+            <w:pPr>
+              <w:spacing w:after="40" w:before="0"/>
+              <w:jc w:val="left"/>
+            </w:pPr>
+            <w:r>
+              <w:rPr>
+                <w:rFonts w:ascii="Times New Roman" w:cs="Times New Roman" w:eastAsia="Times New Roman" w:hAnsi="Times New Roman"/>
+                <w:b/>
+                <w:bCs/>
+                <w:i w:val="false"/>
+                <w:iCs w:val="false"/>
                 <w:color w:val="000000"/>
                 <w:sz w:val="18"/>
                 <w:szCs w:val="18"/>
               </w:rPr>
-              <w:t xml:space="preserve">Iza no mitantara ny zavatra efa lasa ao amin'ny fianakaviana ?</w:t>
-            </w:r>
-          </w:p>
-        </w:tc>
-        <w:tc>
-          <w:tcPr>
-            <w:tcW w:type="pct" w:w="21%"/>
-            <w:tcMar>
-              <w:top w:type="dxa" w:w="60"/>
-              <w:left w:type="dxa" w:w="100"/>
-              <w:bottom w:type="dxa" w:w="60"/>
-              <w:right w:type="dxa" w:w="100"/>
-            </w:tcMar>
-          </w:tcPr>
+              <w:t xml:space="preserve">V.A. : </w:t>
+            </w:r>
+            <w:r>
+              <w:rPr>
+                <w:rFonts w:ascii="Times New Roman" w:cs="Times New Roman" w:eastAsia="Times New Roman" w:hAnsi="Times New Roman"/>
+                <w:b w:val="false"/>
+                <w:bCs w:val="false"/>
+                <w:i w:val="false"/>
+                <w:iCs w:val="false"/>
+                <w:color w:val="000000"/>
+                <w:sz w:val="18"/>
+                <w:szCs w:val="18"/>
+              </w:rPr>
+              <w:t xml:space="preserve">Ny olona mandinika sy mitantara ny zava-nitranga tamin'ny lasa.</w:t>
+            </w:r>
+          </w:p>
           <w:p>
             <w:pPr>
               <w:spacing w:after="40" w:before="0"/>
@@ -1053,7 +2070,7 @@
                 <w:sz w:val="18"/>
                 <w:szCs w:val="18"/>
               </w:rPr>
-              <w:t xml:space="preserve">Nianatra momba ny razam-ben'ny Malagasy sy ny mpanjaka fahiny isika.</w:t>
+              <w:t xml:space="preserve">Tsia : zava-nisy marina izy ary misy porofo ara-tantara.</w:t>
             </w:r>
           </w:p>
           <w:p>
@@ -1085,7 +2102,7 @@
                 <w:sz w:val="18"/>
                 <w:szCs w:val="18"/>
               </w:rPr>
-              <w:t xml:space="preserve">Ohatra : ny fahaleovantenan'i Madagasikara tamin'ny 26 jona 1960.</w:t>
+              <w:t xml:space="preserve">Ny fiavian'ny razam-ben'ny Malagasy ; ny tolom-pahafahana malagasy.</w:t>
             </w:r>
           </w:p>
           <w:p>
@@ -1117,7 +2134,7 @@
                 <w:sz w:val="18"/>
                 <w:szCs w:val="18"/>
               </w:rPr>
-              <w:t xml:space="preserve">Ny ray aman-dreny sy ny raiamandreny be : lovan-tsofina izany.</w:t>
+              <w:t xml:space="preserve">Ahalalana ny fototra niaviana, hanazavana ny ankehitriny ary hanatsarana ny hoavy.</w:t>
             </w:r>
           </w:p>
         </w:tc>
@@ -1144,10 +2161,10 @@
                 <w:i w:val="false"/>
                 <w:iCs w:val="false"/>
                 <w:color w:val="000000"/>
-                <w:sz w:val="18"/>
-                <w:szCs w:val="18"/>
-              </w:rPr>
-              <w:t xml:space="preserve">Fanontaniana sy valiny am-bava</w:t>
+                <w:sz w:val="22"/>
+                <w:szCs w:val="22"/>
+              </w:rPr>
+              <w:t xml:space="preserve">Fanontaniana mitarika</w:t>
             </w:r>
           </w:p>
         </w:tc>
@@ -1174,10 +2191,10 @@
                 <w:i w:val="false"/>
                 <w:iCs w:val="false"/>
                 <w:color w:val="000000"/>
-                <w:sz w:val="18"/>
-                <w:szCs w:val="18"/>
-              </w:rPr>
-              <w:t xml:space="preserve">—</w:t>
+                <w:sz w:val="22"/>
+                <w:szCs w:val="22"/>
+              </w:rPr>
+              <w:t xml:space="preserve">Lahatsoratra nodinihina</w:t>
             </w:r>
           </w:p>
         </w:tc>
@@ -1204,8 +2221,8 @@
                 <w:i w:val="false"/>
                 <w:iCs w:val="false"/>
                 <w:color w:val="000000"/>
-                <w:sz w:val="18"/>
-                <w:szCs w:val="18"/>
+                <w:sz w:val="22"/>
+                <w:szCs w:val="22"/>
               </w:rPr>
               <w:t xml:space="preserve"/>
             </w:r>
@@ -1215,19 +2232,18 @@
       <w:tr>
         <w:tc>
           <w:tcPr>
-            <w:gridSpan w:val="6"/>
-            <w:shd w:fill="E8F0E4" w:color="auto" w:val="clear"/>
-            <w:tcMar>
-              <w:top w:type="dxa" w:w="60"/>
-              <w:left w:type="dxa" w:w="100"/>
-              <w:bottom w:type="dxa" w:w="60"/>
-              <w:right w:type="dxa" w:w="100"/>
-            </w:tcMar>
-          </w:tcPr>
-          <w:p>
-            <w:pPr>
-              <w:spacing w:after="20" w:before="0"/>
-              <w:jc w:val="center"/>
+            <w:tcW w:type="pct" w:w="14%"/>
+            <w:tcMar>
+              <w:top w:type="dxa" w:w="60"/>
+              <w:left w:type="dxa" w:w="100"/>
+              <w:bottom w:type="dxa" w:w="60"/>
+              <w:right w:type="dxa" w:w="100"/>
+            </w:tcMar>
+          </w:tcPr>
+          <w:p>
+            <w:pPr>
+              <w:spacing w:after="20" w:before="0"/>
+              <w:jc w:val="left"/>
             </w:pPr>
             <w:r>
               <w:rPr>
@@ -1237,10 +2253,160 @@
                 <w:i w:val="false"/>
                 <w:iCs w:val="false"/>
                 <w:color w:val="000000"/>
-                <w:sz w:val="20"/>
-                <w:szCs w:val="20"/>
-              </w:rPr>
-              <w:t xml:space="preserve">II. LESONA VAOVAO</w:t>
+                <w:sz w:val="22"/>
+                <w:szCs w:val="22"/>
+              </w:rPr>
+              <w:t xml:space="preserve">5. Famintinana</w:t>
+            </w:r>
+          </w:p>
+        </w:tc>
+        <w:tc>
+          <w:tcPr>
+            <w:tcW w:type="pct" w:w="27%"/>
+            <w:tcMar>
+              <w:top w:type="dxa" w:w="60"/>
+              <w:left w:type="dxa" w:w="100"/>
+              <w:bottom w:type="dxa" w:w="60"/>
+              <w:right w:type="dxa" w:w="100"/>
+            </w:tcMar>
+          </w:tcPr>
+          <w:p>
+            <w:pPr>
+              <w:spacing w:after="20" w:before="0"/>
+              <w:jc w:val="left"/>
+            </w:pPr>
+            <w:r>
+              <w:rPr>
+                <w:rFonts w:ascii="Times New Roman" w:cs="Times New Roman" w:eastAsia="Times New Roman" w:hAnsi="Times New Roman"/>
+                <w:b w:val="false"/>
+                <w:bCs w:val="false"/>
+                <w:i w:val="false"/>
+                <w:iCs w:val="false"/>
+                <w:color w:val="000000"/>
+                <w:sz w:val="22"/>
+                <w:szCs w:val="22"/>
+              </w:rPr>
+              <w:t xml:space="preserve">Mitarika ny mpianatra handravona : ny Tantara dia siansa mandalina ny lasan'ny olombelona ; manana toetra efatra izy ary mitondra tombontsoa maro ho an'ny fiainana andavanandro.</w:t>
+            </w:r>
+          </w:p>
+        </w:tc>
+        <w:tc>
+          <w:tcPr>
+            <w:tcW w:type="pct" w:w="21%"/>
+            <w:tcMar>
+              <w:top w:type="dxa" w:w="60"/>
+              <w:left w:type="dxa" w:w="100"/>
+              <w:bottom w:type="dxa" w:w="60"/>
+              <w:right w:type="dxa" w:w="100"/>
+            </w:tcMar>
+          </w:tcPr>
+          <w:p>
+            <w:pPr>
+              <w:spacing w:after="20" w:before="0"/>
+              <w:jc w:val="left"/>
+            </w:pPr>
+            <w:r>
+              <w:rPr>
+                <w:rFonts w:ascii="Times New Roman" w:cs="Times New Roman" w:eastAsia="Times New Roman" w:hAnsi="Times New Roman"/>
+                <w:b w:val="false"/>
+                <w:bCs w:val="false"/>
+                <w:i w:val="false"/>
+                <w:iCs w:val="false"/>
+                <w:color w:val="000000"/>
+                <w:sz w:val="22"/>
+                <w:szCs w:val="22"/>
+              </w:rPr>
+              <w:t xml:space="preserve">Mandravona ny lesona ary mandika ny famintinana ao amin'ny kahie.</w:t>
+            </w:r>
+          </w:p>
+        </w:tc>
+        <w:tc>
+          <w:tcPr>
+            <w:tcW w:type="pct" w:w="13%"/>
+            <w:tcMar>
+              <w:top w:type="dxa" w:w="60"/>
+              <w:left w:type="dxa" w:w="100"/>
+              <w:bottom w:type="dxa" w:w="60"/>
+              <w:right w:type="dxa" w:w="100"/>
+            </w:tcMar>
+          </w:tcPr>
+          <w:p>
+            <w:pPr>
+              <w:spacing w:after="20" w:before="0"/>
+              <w:jc w:val="left"/>
+            </w:pPr>
+            <w:r>
+              <w:rPr>
+                <w:rFonts w:ascii="Times New Roman" w:cs="Times New Roman" w:eastAsia="Times New Roman" w:hAnsi="Times New Roman"/>
+                <w:b w:val="false"/>
+                <w:bCs w:val="false"/>
+                <w:i w:val="false"/>
+                <w:iCs w:val="false"/>
+                <w:color w:val="000000"/>
+                <w:sz w:val="22"/>
+                <w:szCs w:val="22"/>
+              </w:rPr>
+              <w:t xml:space="preserve">Fandravonana iombonana</w:t>
+            </w:r>
+          </w:p>
+        </w:tc>
+        <w:tc>
+          <w:tcPr>
+            <w:tcW w:type="pct" w:w="13%"/>
+            <w:tcMar>
+              <w:top w:type="dxa" w:w="60"/>
+              <w:left w:type="dxa" w:w="100"/>
+              <w:bottom w:type="dxa" w:w="60"/>
+              <w:right w:type="dxa" w:w="100"/>
+            </w:tcMar>
+          </w:tcPr>
+          <w:p>
+            <w:pPr>
+              <w:spacing w:after="20" w:before="0"/>
+              <w:jc w:val="left"/>
+            </w:pPr>
+            <w:r>
+              <w:rPr>
+                <w:rFonts w:ascii="Times New Roman" w:cs="Times New Roman" w:eastAsia="Times New Roman" w:hAnsi="Times New Roman"/>
+                <w:b w:val="false"/>
+                <w:bCs w:val="false"/>
+                <w:i w:val="false"/>
+                <w:iCs w:val="false"/>
+                <w:color w:val="000000"/>
+                <w:sz w:val="22"/>
+                <w:szCs w:val="22"/>
+              </w:rPr>
+              <w:t xml:space="preserve">Solaitrabe, kahie</w:t>
+            </w:r>
+          </w:p>
+        </w:tc>
+        <w:tc>
+          <w:tcPr>
+            <w:tcW w:type="pct" w:w="12%"/>
+            <w:tcMar>
+              <w:top w:type="dxa" w:w="60"/>
+              <w:left w:type="dxa" w:w="100"/>
+              <w:bottom w:type="dxa" w:w="60"/>
+              <w:right w:type="dxa" w:w="100"/>
+            </w:tcMar>
+          </w:tcPr>
+          <w:p>
+            <w:pPr>
+              <w:spacing w:after="0" w:before="0"/>
+              <w:jc w:val="left"/>
+            </w:pPr>
+            <w:r>
+              <w:rPr>
+                <w:rFonts w:ascii="Times New Roman" w:cs="Times New Roman" w:eastAsia="Times New Roman" w:hAnsi="Times New Roman"/>
+                <w:b w:val="false"/>
+                <w:bCs w:val="false"/>
+                <w:i w:val="false"/>
+                <w:iCs w:val="false"/>
+                <w:color w:val="000000"/>
+                <w:sz w:val="22"/>
+                <w:szCs w:val="22"/>
+              </w:rPr>
+              <w:t xml:space="preserve"/>
             </w:r>
           </w:p>
         </w:tc>
@@ -1269,1173 +2435,8 @@
                 <w:i w:val="false"/>
                 <w:iCs w:val="false"/>
                 <w:color w:val="000000"/>
-                <w:sz w:val="18"/>
-                <w:szCs w:val="18"/>
-              </w:rPr>
-              <w:t xml:space="preserve">1. Fanentanana</w:t>
-            </w:r>
-          </w:p>
-        </w:tc>
-        <w:tc>
-          <w:tcPr>
-            <w:tcW w:type="pct" w:w="27%"/>
-            <w:tcMar>
-              <w:top w:type="dxa" w:w="60"/>
-              <w:left w:type="dxa" w:w="100"/>
-              <w:bottom w:type="dxa" w:w="60"/>
-              <w:right w:type="dxa" w:w="100"/>
-            </w:tcMar>
-          </w:tcPr>
-          <w:p>
-            <w:pPr>
-              <w:spacing w:after="30" w:before="0"/>
-              <w:jc w:val="left"/>
-            </w:pPr>
-            <w:r>
-              <w:rPr>
-                <w:rFonts w:ascii="Times New Roman" w:cs="Times New Roman" w:eastAsia="Times New Roman" w:hAnsi="Times New Roman"/>
-                <w:b w:val="false"/>
-                <w:bCs w:val="false"/>
-                <w:i w:val="false"/>
-                <w:iCs w:val="false"/>
-                <w:color w:val="000000"/>
-                <w:sz w:val="18"/>
-                <w:szCs w:val="18"/>
-              </w:rPr>
-              <w:t xml:space="preserve">Manontany ny mpampianatra : « Rehefa mody any an-tanàna ianao, iza no mitantara ny niandohan'ny fokontaninao ? Ahoana no ahalalantsika fa marina izany tantara izany ? »</w:t>
-            </w:r>
-          </w:p>
-          <w:p>
-            <w:pPr>
-              <w:spacing w:after="30" w:before="0"/>
-              <w:jc w:val="left"/>
-            </w:pPr>
-            <w:r>
-              <w:rPr>
-                <w:rFonts w:ascii="Times New Roman" w:cs="Times New Roman" w:eastAsia="Times New Roman" w:hAnsi="Times New Roman"/>
-                <w:b w:val="false"/>
-                <w:bCs w:val="false"/>
-                <w:i w:val="false"/>
-                <w:iCs w:val="false"/>
-                <w:color w:val="000000"/>
-                <w:sz w:val="18"/>
-                <w:szCs w:val="18"/>
-              </w:rPr>
-              <w:t xml:space="preserve">Inona àry no atao hoe Tantara, ary nahoana isika no mianatra azy ?</w:t>
-            </w:r>
-          </w:p>
-          <w:p>
-            <w:pPr>
-              <w:spacing w:after="30" w:before="0"/>
-              <w:jc w:val="left"/>
-            </w:pPr>
-            <w:r>
-              <w:rPr>
-                <w:rFonts w:ascii="Times New Roman" w:cs="Times New Roman" w:eastAsia="Times New Roman" w:hAnsi="Times New Roman"/>
-                <w:b w:val="false"/>
-                <w:bCs w:val="false"/>
-                <w:i w:val="false"/>
-                <w:iCs w:val="false"/>
-                <w:color w:val="000000"/>
-                <w:sz w:val="18"/>
-                <w:szCs w:val="18"/>
-              </w:rPr>
-              <w:t xml:space="preserve">V.A. : Ny Tantara dia fandinihana ny zava-nitranga tamin'ny lasa ; ianarantsika izy mba hahafantarana ny fototra niaviantsika sy hanatsarana ny hoavy.</w:t>
-            </w:r>
-          </w:p>
-        </w:tc>
-        <w:tc>
-          <w:tcPr>
-            <w:tcW w:type="pct" w:w="21%"/>
-            <w:tcMar>
-              <w:top w:type="dxa" w:w="60"/>
-              <w:left w:type="dxa" w:w="100"/>
-              <w:bottom w:type="dxa" w:w="60"/>
-              <w:right w:type="dxa" w:w="100"/>
-            </w:tcMar>
-          </w:tcPr>
-          <w:p>
-            <w:pPr>
-              <w:spacing w:after="20" w:before="0"/>
-              <w:jc w:val="left"/>
-            </w:pPr>
-            <w:r>
-              <w:rPr>
-                <w:rFonts w:ascii="Times New Roman" w:cs="Times New Roman" w:eastAsia="Times New Roman" w:hAnsi="Times New Roman"/>
-                <w:b w:val="false"/>
-                <w:bCs w:val="false"/>
-                <w:i w:val="false"/>
-                <w:iCs w:val="false"/>
-                <w:color w:val="000000"/>
-                <w:sz w:val="18"/>
-                <w:szCs w:val="18"/>
-              </w:rPr>
-              <w:t xml:space="preserve">Mihaino, maneho hevitra ary mifanakalo hevitra amin'ny mpiara-mianatra.</w:t>
-            </w:r>
-          </w:p>
-        </w:tc>
-        <w:tc>
-          <w:tcPr>
-            <w:tcW w:type="pct" w:w="13%"/>
-            <w:tcMar>
-              <w:top w:type="dxa" w:w="60"/>
-              <w:left w:type="dxa" w:w="100"/>
-              <w:bottom w:type="dxa" w:w="60"/>
-              <w:right w:type="dxa" w:w="100"/>
-            </w:tcMar>
-          </w:tcPr>
-          <w:p>
-            <w:pPr>
-              <w:spacing w:after="20" w:before="0"/>
-              <w:jc w:val="left"/>
-            </w:pPr>
-            <w:r>
-              <w:rPr>
-                <w:rFonts w:ascii="Times New Roman" w:cs="Times New Roman" w:eastAsia="Times New Roman" w:hAnsi="Times New Roman"/>
-                <w:b w:val="false"/>
-                <w:bCs w:val="false"/>
-                <w:i w:val="false"/>
-                <w:iCs w:val="false"/>
-                <w:color w:val="000000"/>
-                <w:sz w:val="18"/>
-                <w:szCs w:val="18"/>
-              </w:rPr>
-              <w:t xml:space="preserve">Ady hevitra kely (remue-méninges)</w:t>
-            </w:r>
-          </w:p>
-        </w:tc>
-        <w:tc>
-          <w:tcPr>
-            <w:tcW w:type="pct" w:w="13%"/>
-            <w:tcMar>
-              <w:top w:type="dxa" w:w="60"/>
-              <w:left w:type="dxa" w:w="100"/>
-              <w:bottom w:type="dxa" w:w="60"/>
-              <w:right w:type="dxa" w:w="100"/>
-            </w:tcMar>
-          </w:tcPr>
-          <w:p>
-            <w:pPr>
-              <w:spacing w:after="20" w:before="0"/>
-              <w:jc w:val="left"/>
-            </w:pPr>
-            <w:r>
-              <w:rPr>
-                <w:rFonts w:ascii="Times New Roman" w:cs="Times New Roman" w:eastAsia="Times New Roman" w:hAnsi="Times New Roman"/>
-                <w:b w:val="false"/>
-                <w:bCs w:val="false"/>
-                <w:i w:val="false"/>
-                <w:iCs w:val="false"/>
-                <w:color w:val="000000"/>
-                <w:sz w:val="18"/>
-                <w:szCs w:val="18"/>
-              </w:rPr>
-              <w:t xml:space="preserve">Solaitrabe</w:t>
-            </w:r>
-          </w:p>
-        </w:tc>
-        <w:tc>
-          <w:tcPr>
-            <w:tcW w:type="pct" w:w="12%"/>
-            <w:tcMar>
-              <w:top w:type="dxa" w:w="60"/>
-              <w:left w:type="dxa" w:w="100"/>
-              <w:bottom w:type="dxa" w:w="60"/>
-              <w:right w:type="dxa" w:w="100"/>
-            </w:tcMar>
-          </w:tcPr>
-          <w:p>
-            <w:pPr>
-              <w:spacing w:after="0" w:before="0"/>
-              <w:jc w:val="left"/>
-            </w:pPr>
-            <w:r>
-              <w:rPr>
-                <w:rFonts w:ascii="Times New Roman" w:cs="Times New Roman" w:eastAsia="Times New Roman" w:hAnsi="Times New Roman"/>
-                <w:b w:val="false"/>
-                <w:bCs w:val="false"/>
-                <w:i w:val="false"/>
-                <w:iCs w:val="false"/>
-                <w:color w:val="000000"/>
-                <w:sz w:val="18"/>
-                <w:szCs w:val="18"/>
-              </w:rPr>
-              <w:t xml:space="preserve"/>
-            </w:r>
-          </w:p>
-        </w:tc>
-      </w:tr>
-      <w:tr>
-        <w:tc>
-          <w:tcPr>
-            <w:tcW w:type="pct" w:w="14%"/>
-            <w:tcMar>
-              <w:top w:type="dxa" w:w="60"/>
-              <w:left w:type="dxa" w:w="100"/>
-              <w:bottom w:type="dxa" w:w="60"/>
-              <w:right w:type="dxa" w:w="100"/>
-            </w:tcMar>
-          </w:tcPr>
-          <w:p>
-            <w:pPr>
-              <w:spacing w:after="20" w:before="0"/>
-              <w:jc w:val="left"/>
-            </w:pPr>
-            <w:r>
-              <w:rPr>
-                <w:rFonts w:ascii="Times New Roman" w:cs="Times New Roman" w:eastAsia="Times New Roman" w:hAnsi="Times New Roman"/>
-                <w:b/>
-                <w:bCs/>
-                <w:i w:val="false"/>
-                <w:iCs w:val="false"/>
-                <w:color w:val="000000"/>
-                <w:sz w:val="18"/>
-                <w:szCs w:val="18"/>
-              </w:rPr>
-              <w:t xml:space="preserve">2. Fampahafantarana ny lesona</w:t>
-            </w:r>
-          </w:p>
-        </w:tc>
-        <w:tc>
-          <w:tcPr>
-            <w:tcW w:type="pct" w:w="27%"/>
-            <w:tcMar>
-              <w:top w:type="dxa" w:w="60"/>
-              <w:left w:type="dxa" w:w="100"/>
-              <w:bottom w:type="dxa" w:w="60"/>
-              <w:right w:type="dxa" w:w="100"/>
-            </w:tcMar>
-          </w:tcPr>
-          <w:p>
-            <w:pPr>
-              <w:spacing w:after="20" w:before="0"/>
-              <w:jc w:val="left"/>
-            </w:pPr>
-            <w:r>
-              <w:rPr>
-                <w:rFonts w:ascii="Times New Roman" w:cs="Times New Roman" w:eastAsia="Times New Roman" w:hAnsi="Times New Roman"/>
-                <w:b w:val="false"/>
-                <w:bCs w:val="false"/>
-                <w:i w:val="false"/>
-                <w:iCs w:val="false"/>
-                <w:color w:val="000000"/>
-                <w:sz w:val="18"/>
-                <w:szCs w:val="18"/>
-              </w:rPr>
-              <w:t xml:space="preserve">Androany isika dia hianatra ny lesona hoe : « Famaritana ny Tantara ». Rehefa vita ny seho dia afaka mamaritra ny Tantara ianareo, mahalaza ny toetrany ary manazava ny tombontsoa entin'ny fahaizana tantara.</w:t>
-            </w:r>
-          </w:p>
-        </w:tc>
-        <w:tc>
-          <w:tcPr>
-            <w:tcW w:type="pct" w:w="21%"/>
-            <w:tcMar>
-              <w:top w:type="dxa" w:w="60"/>
-              <w:left w:type="dxa" w:w="100"/>
-              <w:bottom w:type="dxa" w:w="60"/>
-              <w:right w:type="dxa" w:w="100"/>
-            </w:tcMar>
-          </w:tcPr>
-          <w:p>
-            <w:pPr>
-              <w:spacing w:after="20" w:before="0"/>
-              <w:jc w:val="left"/>
-            </w:pPr>
-            <w:r>
-              <w:rPr>
-                <w:rFonts w:ascii="Times New Roman" w:cs="Times New Roman" w:eastAsia="Times New Roman" w:hAnsi="Times New Roman"/>
-                <w:b w:val="false"/>
-                <w:bCs w:val="false"/>
-                <w:i w:val="false"/>
-                <w:iCs w:val="false"/>
-                <w:color w:val="000000"/>
-                <w:sz w:val="18"/>
-                <w:szCs w:val="18"/>
-              </w:rPr>
-              <w:t xml:space="preserve">Mihaino ary mandika ny lohateny ao amin'ny kahie.</w:t>
-            </w:r>
-          </w:p>
-        </w:tc>
-        <w:tc>
-          <w:tcPr>
-            <w:tcW w:type="pct" w:w="13%"/>
-            <w:tcMar>
-              <w:top w:type="dxa" w:w="60"/>
-              <w:left w:type="dxa" w:w="100"/>
-              <w:bottom w:type="dxa" w:w="60"/>
-              <w:right w:type="dxa" w:w="100"/>
-            </w:tcMar>
-          </w:tcPr>
-          <w:p>
-            <w:pPr>
-              <w:spacing w:after="20" w:before="0"/>
-              <w:jc w:val="left"/>
-            </w:pPr>
-            <w:r>
-              <w:rPr>
-                <w:rFonts w:ascii="Times New Roman" w:cs="Times New Roman" w:eastAsia="Times New Roman" w:hAnsi="Times New Roman"/>
-                <w:b w:val="false"/>
-                <w:bCs w:val="false"/>
-                <w:i w:val="false"/>
-                <w:iCs w:val="false"/>
-                <w:color w:val="000000"/>
-                <w:sz w:val="18"/>
-                <w:szCs w:val="18"/>
-              </w:rPr>
-              <w:t xml:space="preserve">Filazana mivantana</w:t>
-            </w:r>
-          </w:p>
-        </w:tc>
-        <w:tc>
-          <w:tcPr>
-            <w:tcW w:type="pct" w:w="13%"/>
-            <w:tcMar>
-              <w:top w:type="dxa" w:w="60"/>
-              <w:left w:type="dxa" w:w="100"/>
-              <w:bottom w:type="dxa" w:w="60"/>
-              <w:right w:type="dxa" w:w="100"/>
-            </w:tcMar>
-          </w:tcPr>
-          <w:p>
-            <w:pPr>
-              <w:spacing w:after="20" w:before="0"/>
-              <w:jc w:val="left"/>
-            </w:pPr>
-            <w:r>
-              <w:rPr>
-                <w:rFonts w:ascii="Times New Roman" w:cs="Times New Roman" w:eastAsia="Times New Roman" w:hAnsi="Times New Roman"/>
-                <w:b w:val="false"/>
-                <w:bCs w:val="false"/>
-                <w:i w:val="false"/>
-                <w:iCs w:val="false"/>
-                <w:color w:val="000000"/>
-                <w:sz w:val="18"/>
-                <w:szCs w:val="18"/>
-              </w:rPr>
-              <w:t xml:space="preserve">Solaitrabe</w:t>
-            </w:r>
-          </w:p>
-        </w:tc>
-        <w:tc>
-          <w:tcPr>
-            <w:tcW w:type="pct" w:w="12%"/>
-            <w:tcMar>
-              <w:top w:type="dxa" w:w="60"/>
-              <w:left w:type="dxa" w:w="100"/>
-              <w:bottom w:type="dxa" w:w="60"/>
-              <w:right w:type="dxa" w:w="100"/>
-            </w:tcMar>
-          </w:tcPr>
-          <w:p>
-            <w:pPr>
-              <w:spacing w:after="0" w:before="0"/>
-              <w:jc w:val="left"/>
-            </w:pPr>
-            <w:r>
-              <w:rPr>
-                <w:rFonts w:ascii="Times New Roman" w:cs="Times New Roman" w:eastAsia="Times New Roman" w:hAnsi="Times New Roman"/>
-                <w:b w:val="false"/>
-                <w:bCs w:val="false"/>
-                <w:i w:val="false"/>
-                <w:iCs w:val="false"/>
-                <w:color w:val="000000"/>
-                <w:sz w:val="18"/>
-                <w:szCs w:val="18"/>
-              </w:rPr>
-              <w:t xml:space="preserve"/>
-            </w:r>
-          </w:p>
-        </w:tc>
-      </w:tr>
-      <w:tr>
-        <w:tc>
-          <w:tcPr>
-            <w:tcW w:type="pct" w:w="14%"/>
-            <w:tcMar>
-              <w:top w:type="dxa" w:w="60"/>
-              <w:left w:type="dxa" w:w="100"/>
-              <w:bottom w:type="dxa" w:w="60"/>
-              <w:right w:type="dxa" w:w="100"/>
-            </w:tcMar>
-          </w:tcPr>
-          <w:p>
-            <w:pPr>
-              <w:spacing w:after="20" w:before="0"/>
-              <w:jc w:val="left"/>
-            </w:pPr>
-            <w:r>
-              <w:rPr>
-                <w:rFonts w:ascii="Times New Roman" w:cs="Times New Roman" w:eastAsia="Times New Roman" w:hAnsi="Times New Roman"/>
-                <w:b/>
-                <w:bCs/>
-                <w:i w:val="false"/>
-                <w:iCs w:val="false"/>
-                <w:color w:val="000000"/>
-                <w:sz w:val="18"/>
-                <w:szCs w:val="18"/>
-              </w:rPr>
-              <w:t xml:space="preserve">3. Fandinihana ny tahirin-kevitra</w:t>
-            </w:r>
-          </w:p>
-        </w:tc>
-        <w:tc>
-          <w:tcPr>
-            <w:tcW w:type="pct" w:w="27%"/>
-            <w:tcMar>
-              <w:top w:type="dxa" w:w="60"/>
-              <w:left w:type="dxa" w:w="100"/>
-              <w:bottom w:type="dxa" w:w="60"/>
-              <w:right w:type="dxa" w:w="100"/>
-            </w:tcMar>
-          </w:tcPr>
-          <w:p>
-            <w:pPr>
-              <w:spacing w:after="20" w:before="0"/>
-              <w:jc w:val="left"/>
-            </w:pPr>
-            <w:r>
-              <w:rPr>
-                <w:rFonts w:ascii="Times New Roman" w:cs="Times New Roman" w:eastAsia="Times New Roman" w:hAnsi="Times New Roman"/>
-                <w:b w:val="false"/>
-                <w:bCs w:val="false"/>
-                <w:i w:val="false"/>
-                <w:iCs w:val="false"/>
-                <w:color w:val="000000"/>
-                <w:sz w:val="18"/>
-                <w:szCs w:val="18"/>
-              </w:rPr>
-              <w:t xml:space="preserve">Mizara ny lahatsoratra (tahirin-kevitra) ny mpampianatra : « Ny tantara dia fandinihana ny zava-mitranga, ny zava-bita, ary ny zavatra mikasika azy… ». Asaina mamaky mangina ny mpianatra, avy eo mamaky mafy ; hazavaina ireo teny sarotra : ny lasa, ny daty, ny vanim-potoana, ny zava-nitranga ara-tantara, ny fahamarinana ara-tantara.</w:t>
-            </w:r>
-          </w:p>
-        </w:tc>
-        <w:tc>
-          <w:tcPr>
-            <w:tcW w:type="pct" w:w="21%"/>
-            <w:tcMar>
-              <w:top w:type="dxa" w:w="60"/>
-              <w:left w:type="dxa" w:w="100"/>
-              <w:bottom w:type="dxa" w:w="60"/>
-              <w:right w:type="dxa" w:w="100"/>
-            </w:tcMar>
-          </w:tcPr>
-          <w:p>
-            <w:pPr>
-              <w:spacing w:after="20" w:before="0"/>
-              <w:jc w:val="left"/>
-            </w:pPr>
-            <w:r>
-              <w:rPr>
-                <w:rFonts w:ascii="Times New Roman" w:cs="Times New Roman" w:eastAsia="Times New Roman" w:hAnsi="Times New Roman"/>
-                <w:b w:val="false"/>
-                <w:bCs w:val="false"/>
-                <w:i w:val="false"/>
-                <w:iCs w:val="false"/>
-                <w:color w:val="000000"/>
-                <w:sz w:val="18"/>
-                <w:szCs w:val="18"/>
-              </w:rPr>
-              <w:t xml:space="preserve">Mamaky ny lahatsoratra, manamarika ireo teny sarotra ary manontany.</w:t>
-            </w:r>
-          </w:p>
-        </w:tc>
-        <w:tc>
-          <w:tcPr>
-            <w:tcW w:type="pct" w:w="13%"/>
-            <w:tcMar>
-              <w:top w:type="dxa" w:w="60"/>
-              <w:left w:type="dxa" w:w="100"/>
-              <w:bottom w:type="dxa" w:w="60"/>
-              <w:right w:type="dxa" w:w="100"/>
-            </w:tcMar>
-          </w:tcPr>
-          <w:p>
-            <w:pPr>
-              <w:spacing w:after="20" w:before="0"/>
-              <w:jc w:val="left"/>
-            </w:pPr>
-            <w:r>
-              <w:rPr>
-                <w:rFonts w:ascii="Times New Roman" w:cs="Times New Roman" w:eastAsia="Times New Roman" w:hAnsi="Times New Roman"/>
-                <w:b w:val="false"/>
-                <w:bCs w:val="false"/>
-                <w:i w:val="false"/>
-                <w:iCs w:val="false"/>
-                <w:color w:val="000000"/>
-                <w:sz w:val="18"/>
-                <w:szCs w:val="18"/>
-              </w:rPr>
-              <w:t xml:space="preserve">Famakiana sy fanadihadiana lahatsoratra</w:t>
-            </w:r>
-          </w:p>
-        </w:tc>
-        <w:tc>
-          <w:tcPr>
-            <w:tcW w:type="pct" w:w="13%"/>
-            <w:tcMar>
-              <w:top w:type="dxa" w:w="60"/>
-              <w:left w:type="dxa" w:w="100"/>
-              <w:bottom w:type="dxa" w:w="60"/>
-              <w:right w:type="dxa" w:w="100"/>
-            </w:tcMar>
-          </w:tcPr>
-          <w:p>
-            <w:pPr>
-              <w:spacing w:after="20" w:before="0"/>
-              <w:jc w:val="left"/>
-            </w:pPr>
-            <w:r>
-              <w:rPr>
-                <w:rFonts w:ascii="Times New Roman" w:cs="Times New Roman" w:eastAsia="Times New Roman" w:hAnsi="Times New Roman"/>
-                <w:b w:val="false"/>
-                <w:bCs w:val="false"/>
-                <w:i w:val="false"/>
-                <w:iCs w:val="false"/>
-                <w:color w:val="000000"/>
-                <w:sz w:val="18"/>
-                <w:szCs w:val="18"/>
-              </w:rPr>
-              <w:t xml:space="preserve">Lahatsoratra (tahirin-kevitra)</w:t>
-            </w:r>
-          </w:p>
-        </w:tc>
-        <w:tc>
-          <w:tcPr>
-            <w:tcW w:type="pct" w:w="12%"/>
-            <w:tcMar>
-              <w:top w:type="dxa" w:w="60"/>
-              <w:left w:type="dxa" w:w="100"/>
-              <w:bottom w:type="dxa" w:w="60"/>
-              <w:right w:type="dxa" w:w="100"/>
-            </w:tcMar>
-          </w:tcPr>
-          <w:p>
-            <w:pPr>
-              <w:spacing w:after="0" w:before="0"/>
-              <w:jc w:val="left"/>
-            </w:pPr>
-            <w:r>
-              <w:rPr>
-                <w:rFonts w:ascii="Times New Roman" w:cs="Times New Roman" w:eastAsia="Times New Roman" w:hAnsi="Times New Roman"/>
-                <w:b w:val="false"/>
-                <w:bCs w:val="false"/>
-                <w:i w:val="false"/>
-                <w:iCs w:val="false"/>
-                <w:color w:val="000000"/>
-                <w:sz w:val="18"/>
-                <w:szCs w:val="18"/>
-              </w:rPr>
-              <w:t xml:space="preserve"/>
-            </w:r>
-          </w:p>
-        </w:tc>
-      </w:tr>
-      <w:tr>
-        <w:tc>
-          <w:tcPr>
-            <w:tcW w:type="pct" w:w="14%"/>
-            <w:tcMar>
-              <w:top w:type="dxa" w:w="60"/>
-              <w:left w:type="dxa" w:w="100"/>
-              <w:bottom w:type="dxa" w:w="60"/>
-              <w:right w:type="dxa" w:w="100"/>
-            </w:tcMar>
-          </w:tcPr>
-          <w:p>
-            <w:pPr>
-              <w:spacing w:after="20" w:before="0"/>
-              <w:jc w:val="left"/>
-            </w:pPr>
-            <w:r>
-              <w:rPr>
-                <w:rFonts w:ascii="Times New Roman" w:cs="Times New Roman" w:eastAsia="Times New Roman" w:hAnsi="Times New Roman"/>
-                <w:b/>
-                <w:bCs/>
-                <w:i w:val="false"/>
-                <w:iCs w:val="false"/>
-                <w:color w:val="000000"/>
-                <w:sz w:val="18"/>
-                <w:szCs w:val="18"/>
-              </w:rPr>
-              <w:t xml:space="preserve">4. Famakafakana</w:t>
-            </w:r>
-          </w:p>
-        </w:tc>
-        <w:tc>
-          <w:tcPr>
-            <w:tcW w:type="pct" w:w="27%"/>
-            <w:tcMar>
-              <w:top w:type="dxa" w:w="60"/>
-              <w:left w:type="dxa" w:w="100"/>
-              <w:bottom w:type="dxa" w:w="60"/>
-              <w:right w:type="dxa" w:w="100"/>
-            </w:tcMar>
-          </w:tcPr>
-          <w:p>
-            <w:pPr>
-              <w:spacing w:after="30" w:before="0"/>
-              <w:jc w:val="left"/>
-            </w:pPr>
-            <w:r>
-              <w:rPr>
-                <w:rFonts w:ascii="Times New Roman" w:cs="Times New Roman" w:eastAsia="Times New Roman" w:hAnsi="Times New Roman"/>
-                <w:b w:val="false"/>
-                <w:bCs w:val="false"/>
-                <w:i/>
-                <w:iCs/>
-                <w:color w:val="000000"/>
-                <w:sz w:val="18"/>
-                <w:szCs w:val="18"/>
-              </w:rPr>
-              <w:t xml:space="preserve">Araka ny lahatsoratra, inona no dinihin'ny Tantara ?</w:t>
-            </w:r>
-          </w:p>
-          <w:p>
-            <w:pPr>
-              <w:spacing w:after="30" w:before="0"/>
-              <w:jc w:val="left"/>
-            </w:pPr>
-            <w:r>
-              <w:rPr>
-                <w:rFonts w:ascii="Times New Roman" w:cs="Times New Roman" w:eastAsia="Times New Roman" w:hAnsi="Times New Roman"/>
-                <w:b w:val="false"/>
-                <w:bCs w:val="false"/>
-                <w:i/>
-                <w:iCs/>
-                <w:color w:val="000000"/>
-                <w:sz w:val="18"/>
-                <w:szCs w:val="18"/>
-              </w:rPr>
-              <w:t xml:space="preserve">Iza no antsoina hoe mpahay tantara ?</w:t>
-            </w:r>
-          </w:p>
-          <w:p>
-            <w:pPr>
-              <w:spacing w:after="30" w:before="0"/>
-              <w:jc w:val="left"/>
-            </w:pPr>
-            <w:r>
-              <w:rPr>
-                <w:rFonts w:ascii="Times New Roman" w:cs="Times New Roman" w:eastAsia="Times New Roman" w:hAnsi="Times New Roman"/>
-                <w:b w:val="false"/>
-                <w:bCs w:val="false"/>
-                <w:i/>
-                <w:iCs/>
-                <w:color w:val="000000"/>
-                <w:sz w:val="18"/>
-                <w:szCs w:val="18"/>
-              </w:rPr>
-              <w:t xml:space="preserve">Ny zava-nitranga ara-tantara ve azo noforonina fotsiny ? Nahoana ?</w:t>
-            </w:r>
-          </w:p>
-          <w:p>
-            <w:pPr>
-              <w:spacing w:after="30" w:before="0"/>
-              <w:jc w:val="left"/>
-            </w:pPr>
-            <w:r>
-              <w:rPr>
-                <w:rFonts w:ascii="Times New Roman" w:cs="Times New Roman" w:eastAsia="Times New Roman" w:hAnsi="Times New Roman"/>
-                <w:b w:val="false"/>
-                <w:bCs w:val="false"/>
-                <w:i/>
-                <w:iCs/>
-                <w:color w:val="000000"/>
-                <w:sz w:val="18"/>
-                <w:szCs w:val="18"/>
-              </w:rPr>
-              <w:t xml:space="preserve">Milazà ohatra roa amin'ny zava-nitranga ara-tantara eto Madagasikara.</w:t>
-            </w:r>
-          </w:p>
-          <w:p>
-            <w:pPr>
-              <w:spacing w:after="30" w:before="0"/>
-              <w:jc w:val="left"/>
-            </w:pPr>
-            <w:r>
-              <w:rPr>
-                <w:rFonts w:ascii="Times New Roman" w:cs="Times New Roman" w:eastAsia="Times New Roman" w:hAnsi="Times New Roman"/>
-                <w:b w:val="false"/>
-                <w:bCs w:val="false"/>
-                <w:i/>
-                <w:iCs/>
-                <w:color w:val="000000"/>
-                <w:sz w:val="18"/>
-                <w:szCs w:val="18"/>
-              </w:rPr>
-              <w:t xml:space="preserve">Inona no soa azontsika avy amin'ny fahaizana ny tantara ?</w:t>
-            </w:r>
-          </w:p>
-        </w:tc>
-        <w:tc>
-          <w:tcPr>
-            <w:tcW w:type="pct" w:w="21%"/>
-            <w:tcMar>
-              <w:top w:type="dxa" w:w="60"/>
-              <w:left w:type="dxa" w:w="100"/>
-              <w:bottom w:type="dxa" w:w="60"/>
-              <w:right w:type="dxa" w:w="100"/>
-            </w:tcMar>
-          </w:tcPr>
-          <w:p>
-            <w:pPr>
-              <w:spacing w:after="40" w:before="0"/>
-              <w:jc w:val="left"/>
-            </w:pPr>
-            <w:r>
-              <w:rPr>
-                <w:rFonts w:ascii="Times New Roman" w:cs="Times New Roman" w:eastAsia="Times New Roman" w:hAnsi="Times New Roman"/>
-                <w:b/>
-                <w:bCs/>
-                <w:i w:val="false"/>
-                <w:iCs w:val="false"/>
-                <w:color w:val="000000"/>
-                <w:sz w:val="18"/>
-                <w:szCs w:val="18"/>
-              </w:rPr>
-              <w:t xml:space="preserve">V.A. : </w:t>
-            </w:r>
-            <w:r>
-              <w:rPr>
-                <w:rFonts w:ascii="Times New Roman" w:cs="Times New Roman" w:eastAsia="Times New Roman" w:hAnsi="Times New Roman"/>
-                <w:b w:val="false"/>
-                <w:bCs w:val="false"/>
-                <w:i w:val="false"/>
-                <w:iCs w:val="false"/>
-                <w:color w:val="000000"/>
-                <w:sz w:val="18"/>
-                <w:szCs w:val="18"/>
-              </w:rPr>
-              <w:t xml:space="preserve">Ny zava-mitranga sy ny zava-bita tamin'ny lasa.</w:t>
-            </w:r>
-          </w:p>
-          <w:p>
-            <w:pPr>
-              <w:spacing w:after="40" w:before="0"/>
-              <w:jc w:val="left"/>
-            </w:pPr>
-            <w:r>
-              <w:rPr>
-                <w:rFonts w:ascii="Times New Roman" w:cs="Times New Roman" w:eastAsia="Times New Roman" w:hAnsi="Times New Roman"/>
-                <w:b/>
-                <w:bCs/>
-                <w:i w:val="false"/>
-                <w:iCs w:val="false"/>
-                <w:color w:val="000000"/>
-                <w:sz w:val="18"/>
-                <w:szCs w:val="18"/>
-              </w:rPr>
-              <w:t xml:space="preserve">V.A. : </w:t>
-            </w:r>
-            <w:r>
-              <w:rPr>
-                <w:rFonts w:ascii="Times New Roman" w:cs="Times New Roman" w:eastAsia="Times New Roman" w:hAnsi="Times New Roman"/>
-                <w:b w:val="false"/>
-                <w:bCs w:val="false"/>
-                <w:i w:val="false"/>
-                <w:iCs w:val="false"/>
-                <w:color w:val="000000"/>
-                <w:sz w:val="18"/>
-                <w:szCs w:val="18"/>
-              </w:rPr>
-              <w:t xml:space="preserve">Ny olona mandinika sy mitantara ny zava-nitranga tamin'ny lasa.</w:t>
-            </w:r>
-          </w:p>
-          <w:p>
-            <w:pPr>
-              <w:spacing w:after="40" w:before="0"/>
-              <w:jc w:val="left"/>
-            </w:pPr>
-            <w:r>
-              <w:rPr>
-                <w:rFonts w:ascii="Times New Roman" w:cs="Times New Roman" w:eastAsia="Times New Roman" w:hAnsi="Times New Roman"/>
-                <w:b/>
-                <w:bCs/>
-                <w:i w:val="false"/>
-                <w:iCs w:val="false"/>
-                <w:color w:val="000000"/>
-                <w:sz w:val="18"/>
-                <w:szCs w:val="18"/>
-              </w:rPr>
-              <w:t xml:space="preserve">V.A. : </w:t>
-            </w:r>
-            <w:r>
-              <w:rPr>
-                <w:rFonts w:ascii="Times New Roman" w:cs="Times New Roman" w:eastAsia="Times New Roman" w:hAnsi="Times New Roman"/>
-                <w:b w:val="false"/>
-                <w:bCs w:val="false"/>
-                <w:i w:val="false"/>
-                <w:iCs w:val="false"/>
-                <w:color w:val="000000"/>
-                <w:sz w:val="18"/>
-                <w:szCs w:val="18"/>
-              </w:rPr>
-              <w:t xml:space="preserve">Tsia : zava-nisy marina izy ary misy porofo ara-tantara.</w:t>
-            </w:r>
-          </w:p>
-          <w:p>
-            <w:pPr>
-              <w:spacing w:after="40" w:before="0"/>
-              <w:jc w:val="left"/>
-            </w:pPr>
-            <w:r>
-              <w:rPr>
-                <w:rFonts w:ascii="Times New Roman" w:cs="Times New Roman" w:eastAsia="Times New Roman" w:hAnsi="Times New Roman"/>
-                <w:b/>
-                <w:bCs/>
-                <w:i w:val="false"/>
-                <w:iCs w:val="false"/>
-                <w:color w:val="000000"/>
-                <w:sz w:val="18"/>
-                <w:szCs w:val="18"/>
-              </w:rPr>
-              <w:t xml:space="preserve">V.A. : </w:t>
-            </w:r>
-            <w:r>
-              <w:rPr>
-                <w:rFonts w:ascii="Times New Roman" w:cs="Times New Roman" w:eastAsia="Times New Roman" w:hAnsi="Times New Roman"/>
-                <w:b w:val="false"/>
-                <w:bCs w:val="false"/>
-                <w:i w:val="false"/>
-                <w:iCs w:val="false"/>
-                <w:color w:val="000000"/>
-                <w:sz w:val="18"/>
-                <w:szCs w:val="18"/>
-              </w:rPr>
-              <w:t xml:space="preserve">Ny fiavian'ny razam-ben'ny Malagasy ; ny tolom-pahafahana malagasy.</w:t>
-            </w:r>
-          </w:p>
-          <w:p>
-            <w:pPr>
-              <w:spacing w:after="40" w:before="0"/>
-              <w:jc w:val="left"/>
-            </w:pPr>
-            <w:r>
-              <w:rPr>
-                <w:rFonts w:ascii="Times New Roman" w:cs="Times New Roman" w:eastAsia="Times New Roman" w:hAnsi="Times New Roman"/>
-                <w:b/>
-                <w:bCs/>
-                <w:i w:val="false"/>
-                <w:iCs w:val="false"/>
-                <w:color w:val="000000"/>
-                <w:sz w:val="18"/>
-                <w:szCs w:val="18"/>
-              </w:rPr>
-              <w:t xml:space="preserve">V.A. : </w:t>
-            </w:r>
-            <w:r>
-              <w:rPr>
-                <w:rFonts w:ascii="Times New Roman" w:cs="Times New Roman" w:eastAsia="Times New Roman" w:hAnsi="Times New Roman"/>
-                <w:b w:val="false"/>
-                <w:bCs w:val="false"/>
-                <w:i w:val="false"/>
-                <w:iCs w:val="false"/>
-                <w:color w:val="000000"/>
-                <w:sz w:val="18"/>
-                <w:szCs w:val="18"/>
-              </w:rPr>
-              <w:t xml:space="preserve">Ahalalana ny fototra niaviana, hanazavana ny ankehitriny ary hanatsarana ny hoavy.</w:t>
-            </w:r>
-          </w:p>
-        </w:tc>
-        <w:tc>
-          <w:tcPr>
-            <w:tcW w:type="pct" w:w="13%"/>
-            <w:tcMar>
-              <w:top w:type="dxa" w:w="60"/>
-              <w:left w:type="dxa" w:w="100"/>
-              <w:bottom w:type="dxa" w:w="60"/>
-              <w:right w:type="dxa" w:w="100"/>
-            </w:tcMar>
-          </w:tcPr>
-          <w:p>
-            <w:pPr>
-              <w:spacing w:after="20" w:before="0"/>
-              <w:jc w:val="left"/>
-            </w:pPr>
-            <w:r>
-              <w:rPr>
-                <w:rFonts w:ascii="Times New Roman" w:cs="Times New Roman" w:eastAsia="Times New Roman" w:hAnsi="Times New Roman"/>
-                <w:b w:val="false"/>
-                <w:bCs w:val="false"/>
-                <w:i w:val="false"/>
-                <w:iCs w:val="false"/>
-                <w:color w:val="000000"/>
-                <w:sz w:val="18"/>
-                <w:szCs w:val="18"/>
-              </w:rPr>
-              <w:t xml:space="preserve">Fanontaniana mitarika</w:t>
-            </w:r>
-          </w:p>
-        </w:tc>
-        <w:tc>
-          <w:tcPr>
-            <w:tcW w:type="pct" w:w="13%"/>
-            <w:tcMar>
-              <w:top w:type="dxa" w:w="60"/>
-              <w:left w:type="dxa" w:w="100"/>
-              <w:bottom w:type="dxa" w:w="60"/>
-              <w:right w:type="dxa" w:w="100"/>
-            </w:tcMar>
-          </w:tcPr>
-          <w:p>
-            <w:pPr>
-              <w:spacing w:after="20" w:before="0"/>
-              <w:jc w:val="left"/>
-            </w:pPr>
-            <w:r>
-              <w:rPr>
-                <w:rFonts w:ascii="Times New Roman" w:cs="Times New Roman" w:eastAsia="Times New Roman" w:hAnsi="Times New Roman"/>
-                <w:b w:val="false"/>
-                <w:bCs w:val="false"/>
-                <w:i w:val="false"/>
-                <w:iCs w:val="false"/>
-                <w:color w:val="000000"/>
-                <w:sz w:val="18"/>
-                <w:szCs w:val="18"/>
-              </w:rPr>
-              <w:t xml:space="preserve">Lahatsoratra nodinihina</w:t>
-            </w:r>
-          </w:p>
-        </w:tc>
-        <w:tc>
-          <w:tcPr>
-            <w:tcW w:type="pct" w:w="12%"/>
-            <w:tcMar>
-              <w:top w:type="dxa" w:w="60"/>
-              <w:left w:type="dxa" w:w="100"/>
-              <w:bottom w:type="dxa" w:w="60"/>
-              <w:right w:type="dxa" w:w="100"/>
-            </w:tcMar>
-          </w:tcPr>
-          <w:p>
-            <w:pPr>
-              <w:spacing w:after="0" w:before="0"/>
-              <w:jc w:val="left"/>
-            </w:pPr>
-            <w:r>
-              <w:rPr>
-                <w:rFonts w:ascii="Times New Roman" w:cs="Times New Roman" w:eastAsia="Times New Roman" w:hAnsi="Times New Roman"/>
-                <w:b w:val="false"/>
-                <w:bCs w:val="false"/>
-                <w:i w:val="false"/>
-                <w:iCs w:val="false"/>
-                <w:color w:val="000000"/>
-                <w:sz w:val="18"/>
-                <w:szCs w:val="18"/>
-              </w:rPr>
-              <w:t xml:space="preserve"/>
-            </w:r>
-          </w:p>
-        </w:tc>
-      </w:tr>
-      <w:tr>
-        <w:tc>
-          <w:tcPr>
-            <w:tcW w:type="pct" w:w="14%"/>
-            <w:tcMar>
-              <w:top w:type="dxa" w:w="60"/>
-              <w:left w:type="dxa" w:w="100"/>
-              <w:bottom w:type="dxa" w:w="60"/>
-              <w:right w:type="dxa" w:w="100"/>
-            </w:tcMar>
-          </w:tcPr>
-          <w:p>
-            <w:pPr>
-              <w:spacing w:after="20" w:before="0"/>
-              <w:jc w:val="left"/>
-            </w:pPr>
-            <w:r>
-              <w:rPr>
-                <w:rFonts w:ascii="Times New Roman" w:cs="Times New Roman" w:eastAsia="Times New Roman" w:hAnsi="Times New Roman"/>
-                <w:b/>
-                <w:bCs/>
-                <w:i w:val="false"/>
-                <w:iCs w:val="false"/>
-                <w:color w:val="000000"/>
-                <w:sz w:val="18"/>
-                <w:szCs w:val="18"/>
-              </w:rPr>
-              <w:t xml:space="preserve">5. Famintinana</w:t>
-            </w:r>
-          </w:p>
-        </w:tc>
-        <w:tc>
-          <w:tcPr>
-            <w:tcW w:type="pct" w:w="27%"/>
-            <w:tcMar>
-              <w:top w:type="dxa" w:w="60"/>
-              <w:left w:type="dxa" w:w="100"/>
-              <w:bottom w:type="dxa" w:w="60"/>
-              <w:right w:type="dxa" w:w="100"/>
-            </w:tcMar>
-          </w:tcPr>
-          <w:p>
-            <w:pPr>
-              <w:spacing w:after="20" w:before="0"/>
-              <w:jc w:val="left"/>
-            </w:pPr>
-            <w:r>
-              <w:rPr>
-                <w:rFonts w:ascii="Times New Roman" w:cs="Times New Roman" w:eastAsia="Times New Roman" w:hAnsi="Times New Roman"/>
-                <w:b w:val="false"/>
-                <w:bCs w:val="false"/>
-                <w:i w:val="false"/>
-                <w:iCs w:val="false"/>
-                <w:color w:val="000000"/>
-                <w:sz w:val="18"/>
-                <w:szCs w:val="18"/>
-              </w:rPr>
-              <w:t xml:space="preserve">Mitarika ny mpianatra handravona : ny Tantara dia siansa mandalina ny lasan'ny olombelona ; manana toetra efatra izy ary mitondra tombontsoa maro ho an'ny fiainana andavanandro.</w:t>
-            </w:r>
-          </w:p>
-        </w:tc>
-        <w:tc>
-          <w:tcPr>
-            <w:tcW w:type="pct" w:w="21%"/>
-            <w:tcMar>
-              <w:top w:type="dxa" w:w="60"/>
-              <w:left w:type="dxa" w:w="100"/>
-              <w:bottom w:type="dxa" w:w="60"/>
-              <w:right w:type="dxa" w:w="100"/>
-            </w:tcMar>
-          </w:tcPr>
-          <w:p>
-            <w:pPr>
-              <w:spacing w:after="20" w:before="0"/>
-              <w:jc w:val="left"/>
-            </w:pPr>
-            <w:r>
-              <w:rPr>
-                <w:rFonts w:ascii="Times New Roman" w:cs="Times New Roman" w:eastAsia="Times New Roman" w:hAnsi="Times New Roman"/>
-                <w:b w:val="false"/>
-                <w:bCs w:val="false"/>
-                <w:i w:val="false"/>
-                <w:iCs w:val="false"/>
-                <w:color w:val="000000"/>
-                <w:sz w:val="18"/>
-                <w:szCs w:val="18"/>
-              </w:rPr>
-              <w:t xml:space="preserve">Mandravona ny lesona ary mandika ny famintinana ao amin'ny kahie.</w:t>
-            </w:r>
-          </w:p>
-        </w:tc>
-        <w:tc>
-          <w:tcPr>
-            <w:tcW w:type="pct" w:w="13%"/>
-            <w:tcMar>
-              <w:top w:type="dxa" w:w="60"/>
-              <w:left w:type="dxa" w:w="100"/>
-              <w:bottom w:type="dxa" w:w="60"/>
-              <w:right w:type="dxa" w:w="100"/>
-            </w:tcMar>
-          </w:tcPr>
-          <w:p>
-            <w:pPr>
-              <w:spacing w:after="20" w:before="0"/>
-              <w:jc w:val="left"/>
-            </w:pPr>
-            <w:r>
-              <w:rPr>
-                <w:rFonts w:ascii="Times New Roman" w:cs="Times New Roman" w:eastAsia="Times New Roman" w:hAnsi="Times New Roman"/>
-                <w:b w:val="false"/>
-                <w:bCs w:val="false"/>
-                <w:i w:val="false"/>
-                <w:iCs w:val="false"/>
-                <w:color w:val="000000"/>
-                <w:sz w:val="18"/>
-                <w:szCs w:val="18"/>
-              </w:rPr>
-              <w:t xml:space="preserve">Fandravonana iombonana</w:t>
-            </w:r>
-          </w:p>
-        </w:tc>
-        <w:tc>
-          <w:tcPr>
-            <w:tcW w:type="pct" w:w="13%"/>
-            <w:tcMar>
-              <w:top w:type="dxa" w:w="60"/>
-              <w:left w:type="dxa" w:w="100"/>
-              <w:bottom w:type="dxa" w:w="60"/>
-              <w:right w:type="dxa" w:w="100"/>
-            </w:tcMar>
-          </w:tcPr>
-          <w:p>
-            <w:pPr>
-              <w:spacing w:after="20" w:before="0"/>
-              <w:jc w:val="left"/>
-            </w:pPr>
-            <w:r>
-              <w:rPr>
-                <w:rFonts w:ascii="Times New Roman" w:cs="Times New Roman" w:eastAsia="Times New Roman" w:hAnsi="Times New Roman"/>
-                <w:b w:val="false"/>
-                <w:bCs w:val="false"/>
-                <w:i w:val="false"/>
-                <w:iCs w:val="false"/>
-                <w:color w:val="000000"/>
-                <w:sz w:val="18"/>
-                <w:szCs w:val="18"/>
-              </w:rPr>
-              <w:t xml:space="preserve">Solaitrabe, kahie</w:t>
-            </w:r>
-          </w:p>
-        </w:tc>
-        <w:tc>
-          <w:tcPr>
-            <w:tcW w:type="pct" w:w="12%"/>
-            <w:tcMar>
-              <w:top w:type="dxa" w:w="60"/>
-              <w:left w:type="dxa" w:w="100"/>
-              <w:bottom w:type="dxa" w:w="60"/>
-              <w:right w:type="dxa" w:w="100"/>
-            </w:tcMar>
-          </w:tcPr>
-          <w:p>
-            <w:pPr>
-              <w:spacing w:after="0" w:before="0"/>
-              <w:jc w:val="left"/>
-            </w:pPr>
-            <w:r>
-              <w:rPr>
-                <w:rFonts w:ascii="Times New Roman" w:cs="Times New Roman" w:eastAsia="Times New Roman" w:hAnsi="Times New Roman"/>
-                <w:b w:val="false"/>
-                <w:bCs w:val="false"/>
-                <w:i w:val="false"/>
-                <w:iCs w:val="false"/>
-                <w:color w:val="000000"/>
-                <w:sz w:val="18"/>
-                <w:szCs w:val="18"/>
-              </w:rPr>
-              <w:t xml:space="preserve"/>
-            </w:r>
-          </w:p>
-        </w:tc>
-      </w:tr>
-      <w:tr>
-        <w:tc>
-          <w:tcPr>
-            <w:tcW w:type="pct" w:w="14%"/>
-            <w:tcMar>
-              <w:top w:type="dxa" w:w="60"/>
-              <w:left w:type="dxa" w:w="100"/>
-              <w:bottom w:type="dxa" w:w="60"/>
-              <w:right w:type="dxa" w:w="100"/>
-            </w:tcMar>
-          </w:tcPr>
-          <w:p>
-            <w:pPr>
-              <w:spacing w:after="20" w:before="0"/>
-              <w:jc w:val="left"/>
-            </w:pPr>
-            <w:r>
-              <w:rPr>
-                <w:rFonts w:ascii="Times New Roman" w:cs="Times New Roman" w:eastAsia="Times New Roman" w:hAnsi="Times New Roman"/>
-                <w:b/>
-                <w:bCs/>
-                <w:i w:val="false"/>
-                <w:iCs w:val="false"/>
-                <w:color w:val="000000"/>
-                <w:sz w:val="18"/>
-                <w:szCs w:val="18"/>
+                <w:sz w:val="22"/>
+                <w:szCs w:val="22"/>
               </w:rPr>
               <w:t xml:space="preserve">6. Fampiharana</w:t>
             </w:r>
@@ -2729,8 +2730,8 @@
                 <w:i w:val="false"/>
                 <w:iCs w:val="false"/>
                 <w:color w:val="000000"/>
-                <w:sz w:val="18"/>
-                <w:szCs w:val="18"/>
+                <w:sz w:val="22"/>
+                <w:szCs w:val="22"/>
               </w:rPr>
               <w:t xml:space="preserve">Asa mitambatra (tsiroaroa)</w:t>
             </w:r>
@@ -2759,8 +2760,8 @@
                 <w:i w:val="false"/>
                 <w:iCs w:val="false"/>
                 <w:color w:val="000000"/>
-                <w:sz w:val="18"/>
-                <w:szCs w:val="18"/>
+                <w:sz w:val="22"/>
+                <w:szCs w:val="22"/>
               </w:rPr>
               <w:t xml:space="preserve">Solaitra kely</w:t>
             </w:r>
@@ -2789,8 +2790,8 @@
                 <w:i w:val="false"/>
                 <w:iCs w:val="false"/>
                 <w:color w:val="000000"/>
-                <w:sz w:val="18"/>
-                <w:szCs w:val="18"/>
+                <w:sz w:val="22"/>
+                <w:szCs w:val="22"/>
               </w:rPr>
               <w:t xml:space="preserve"/>
             </w:r>
@@ -2821,8 +2822,8 @@
                 <w:i w:val="false"/>
                 <w:iCs w:val="false"/>
                 <w:color w:val="000000"/>
-                <w:sz w:val="18"/>
-                <w:szCs w:val="18"/>
+                <w:sz w:val="22"/>
+                <w:szCs w:val="22"/>
               </w:rPr>
               <w:t xml:space="preserve">III. Tombana</w:t>
             </w:r>
@@ -3103,8 +3104,8 @@
                 <w:i w:val="false"/>
                 <w:iCs w:val="false"/>
                 <w:color w:val="000000"/>
-                <w:sz w:val="18"/>
-                <w:szCs w:val="18"/>
+                <w:sz w:val="22"/>
+                <w:szCs w:val="22"/>
               </w:rPr>
               <w:t xml:space="preserve">Asa an-tsoratra mitokana</w:t>
             </w:r>
@@ -3133,8 +3134,8 @@
                 <w:i w:val="false"/>
                 <w:iCs w:val="false"/>
                 <w:color w:val="000000"/>
-                <w:sz w:val="18"/>
-                <w:szCs w:val="18"/>
+                <w:sz w:val="22"/>
+                <w:szCs w:val="22"/>
               </w:rPr>
               <w:t xml:space="preserve">Kahie fanazaran-tena</w:t>
             </w:r>
@@ -3163,8 +3164,8 @@
                 <w:i w:val="false"/>
                 <w:iCs w:val="false"/>
                 <w:color w:val="000000"/>
-                <w:sz w:val="18"/>
-                <w:szCs w:val="18"/>
+                <w:sz w:val="22"/>
+                <w:szCs w:val="22"/>
               </w:rPr>
               <w:t xml:space="preserve"/>
             </w:r>
@@ -3190,8 +3191,8 @@
           <w:i w:val="false"/>
           <w:iCs w:val="false"/>
           <w:color w:val="000000"/>
-          <w:sz w:val="26"/>
-          <w:szCs w:val="26"/>
+          <w:sz w:val="28"/>
+          <w:szCs w:val="28"/>
         </w:rPr>
         <w:t xml:space="preserve">LESONA</w:t>
       </w:r>
@@ -3209,8 +3210,8 @@
           <w:i w:val="false"/>
           <w:iCs w:val="false"/>
           <w:color w:val="C00000"/>
-          <w:sz w:val="28"/>
-          <w:szCs w:val="28"/>
+          <w:sz w:val="30"/>
+          <w:szCs w:val="30"/>
         </w:rPr>
         <w:t xml:space="preserve">Famaritana ny Tantara : ny toetrany sy ny tombontsoa entiny</w:t>
       </w:r>
@@ -3225,7 +3226,7 @@
           <wp:inline distT="0" distB="0" distL="0" distR="0">
             <wp:extent cx="4572000" cy="2495550"/>
             <wp:effectExtent t="0" r="0" b="0" l="0"/>
-            <wp:docPr id="1" name="" descr="" title=""/>
+            <wp:docPr id="1" name="Ny Tantara : mitantara ny lasa mba hanazavana ny ankehitriny sy hanatsarana ny hoavy" descr="Ny Tantara : mitantara ny lasa mba hanazavana ny ankehitriny sy hanatsarana ny hoavy" title="Ny Tantara : mitantara ny lasa mba hanazavana ny ankehitriny sy hanatsarana ny hoavy"/>
             <wp:cNvGraphicFramePr>
               <a:graphicFrameLocks xmlns:a="http://schemas.openxmlformats.org/drawingml/2006/main" noChangeAspect="1"/>
             </wp:cNvGraphicFramePr>
@@ -3274,8 +3275,8 @@
           <w:i/>
           <w:iCs/>
           <w:color w:val="000000"/>
-          <w:sz w:val="18"/>
-          <w:szCs w:val="18"/>
+          <w:sz w:val="22"/>
+          <w:szCs w:val="22"/>
         </w:rPr>
         <w:t xml:space="preserve">Sary 1 — Ny Tantara : mitantara ny lasa mba hanazavana ny ankehitriny sy hanatsarana ny hoavy</w:t>
       </w:r>
@@ -3293,8 +3294,8 @@
           <w:i w:val="false"/>
           <w:iCs w:val="false"/>
           <w:color w:val="1E7B34"/>
-          <w:sz w:val="24"/>
-          <w:szCs w:val="24"/>
+          <w:sz w:val="26"/>
+          <w:szCs w:val="26"/>
         </w:rPr>
         <w:t xml:space="preserve">1. Famaritana ny Tantara</w:t>
       </w:r>
@@ -3307,8 +3308,8 @@
         <w:rPr>
           <w:rFonts w:ascii="Times New Roman" w:cs="Times New Roman" w:eastAsia="Times New Roman" w:hAnsi="Times New Roman"/>
           <w:color w:val="000000"/>
-          <w:sz w:val="22"/>
-          <w:szCs w:val="22"/>
+          <w:sz w:val="24"/>
+          <w:szCs w:val="24"/>
         </w:rPr>
         <w:t xml:space="preserve">Ny </w:t>
       </w:r>
@@ -3318,8 +3319,8 @@
           <w:b/>
           <w:bCs/>
           <w:color w:val="1F4E79"/>
-          <w:sz w:val="22"/>
-          <w:szCs w:val="22"/>
+          <w:sz w:val="24"/>
+          <w:szCs w:val="24"/>
         </w:rPr>
         <w:t xml:space="preserve">TANTARA</w:t>
       </w:r>
@@ -3327,8 +3328,8 @@
         <w:rPr>
           <w:rFonts w:ascii="Times New Roman" w:cs="Times New Roman" w:eastAsia="Times New Roman" w:hAnsi="Times New Roman"/>
           <w:color w:val="000000"/>
-          <w:sz w:val="22"/>
-          <w:szCs w:val="22"/>
+          <w:sz w:val="24"/>
+          <w:szCs w:val="24"/>
         </w:rPr>
         <w:t xml:space="preserve"> dia fandinihana ny zava-mitranga, ny zava-bita ary ny zavatra mikasika azy tamin'ny lasa. Fitaratry ny </w:t>
       </w:r>
@@ -3338,8 +3339,8 @@
           <w:b/>
           <w:bCs/>
           <w:color w:val="1F4E79"/>
-          <w:sz w:val="22"/>
-          <w:szCs w:val="22"/>
+          <w:sz w:val="24"/>
+          <w:szCs w:val="24"/>
         </w:rPr>
         <w:t xml:space="preserve">zava-nitranga</w:t>
       </w:r>
@@ -3347,8 +3348,8 @@
         <w:rPr>
           <w:rFonts w:ascii="Times New Roman" w:cs="Times New Roman" w:eastAsia="Times New Roman" w:hAnsi="Times New Roman"/>
           <w:color w:val="000000"/>
-          <w:sz w:val="22"/>
-          <w:szCs w:val="22"/>
+          <w:sz w:val="24"/>
+          <w:szCs w:val="24"/>
         </w:rPr>
         <w:t xml:space="preserve"> efa lasa izy : mampahafantatra antsika toe-javatra efa nisy marina.</w:t>
       </w:r>
@@ -3361,8 +3362,8 @@
         <w:rPr>
           <w:rFonts w:ascii="Times New Roman" w:cs="Times New Roman" w:eastAsia="Times New Roman" w:hAnsi="Times New Roman"/>
           <w:color w:val="000000"/>
-          <w:sz w:val="22"/>
-          <w:szCs w:val="22"/>
+          <w:sz w:val="24"/>
+          <w:szCs w:val="24"/>
         </w:rPr>
         <w:t xml:space="preserve">Avy amin'ny teny grika hoe « historia », midika hoe « fanadihadiana », ny teny frantsay hoe Histoire. Siansa mandalina ny lasan'ny olombelona àry ny </w:t>
       </w:r>
@@ -3372,8 +3373,8 @@
           <w:b/>
           <w:bCs/>
           <w:color w:val="1F4E79"/>
-          <w:sz w:val="22"/>
-          <w:szCs w:val="22"/>
+          <w:sz w:val="24"/>
+          <w:szCs w:val="24"/>
         </w:rPr>
         <w:t xml:space="preserve">Tantara</w:t>
       </w:r>
@@ -3381,8 +3382,8 @@
         <w:rPr>
           <w:rFonts w:ascii="Times New Roman" w:cs="Times New Roman" w:eastAsia="Times New Roman" w:hAnsi="Times New Roman"/>
           <w:color w:val="000000"/>
-          <w:sz w:val="22"/>
-          <w:szCs w:val="22"/>
+          <w:sz w:val="24"/>
+          <w:szCs w:val="24"/>
         </w:rPr>
         <w:t xml:space="preserve"> : mamakafaka ny </w:t>
       </w:r>
@@ -3392,8 +3393,8 @@
           <w:b/>
           <w:bCs/>
           <w:color w:val="1F4E79"/>
-          <w:sz w:val="22"/>
-          <w:szCs w:val="22"/>
+          <w:sz w:val="24"/>
+          <w:szCs w:val="24"/>
         </w:rPr>
         <w:t xml:space="preserve">zava-nitranga</w:t>
       </w:r>
@@ -3401,8 +3402,8 @@
         <w:rPr>
           <w:rFonts w:ascii="Times New Roman" w:cs="Times New Roman" w:eastAsia="Times New Roman" w:hAnsi="Times New Roman"/>
           <w:color w:val="000000"/>
-          <w:sz w:val="22"/>
-          <w:szCs w:val="22"/>
+          <w:sz w:val="24"/>
+          <w:szCs w:val="24"/>
         </w:rPr>
         <w:t xml:space="preserve"> (fanjakana, ady, revolisiona), ny fivoaran'ny siansa sy ny teknika, ny fomba fiaina ary ny fomba fisainana.</w:t>
       </w:r>
@@ -3415,8 +3416,8 @@
         <w:rPr>
           <w:rFonts w:ascii="Times New Roman" w:cs="Times New Roman" w:eastAsia="Times New Roman" w:hAnsi="Times New Roman"/>
           <w:color w:val="000000"/>
-          <w:sz w:val="22"/>
-          <w:szCs w:val="22"/>
+          <w:sz w:val="24"/>
+          <w:szCs w:val="24"/>
         </w:rPr>
         <w:t xml:space="preserve">Ny olona mandinika sy mi</w:t>
       </w:r>
@@ -3426,8 +3427,8 @@
           <w:b/>
           <w:bCs/>
           <w:color w:val="1F4E79"/>
-          <w:sz w:val="22"/>
-          <w:szCs w:val="22"/>
+          <w:sz w:val="24"/>
+          <w:szCs w:val="24"/>
         </w:rPr>
         <w:t xml:space="preserve">tantara</w:t>
       </w:r>
@@ -3435,8 +3436,8 @@
         <w:rPr>
           <w:rFonts w:ascii="Times New Roman" w:cs="Times New Roman" w:eastAsia="Times New Roman" w:hAnsi="Times New Roman"/>
           <w:color w:val="000000"/>
-          <w:sz w:val="22"/>
-          <w:szCs w:val="22"/>
+          <w:sz w:val="24"/>
+          <w:szCs w:val="24"/>
         </w:rPr>
         <w:t xml:space="preserve"> ireo </w:t>
       </w:r>
@@ -3446,8 +3447,8 @@
           <w:b/>
           <w:bCs/>
           <w:color w:val="1F4E79"/>
-          <w:sz w:val="22"/>
-          <w:szCs w:val="22"/>
+          <w:sz w:val="24"/>
+          <w:szCs w:val="24"/>
         </w:rPr>
         <w:t xml:space="preserve">zava-nitranga</w:t>
       </w:r>
@@ -3455,8 +3456,8 @@
         <w:rPr>
           <w:rFonts w:ascii="Times New Roman" w:cs="Times New Roman" w:eastAsia="Times New Roman" w:hAnsi="Times New Roman"/>
           <w:color w:val="000000"/>
-          <w:sz w:val="22"/>
-          <w:szCs w:val="22"/>
+          <w:sz w:val="24"/>
+          <w:szCs w:val="24"/>
         </w:rPr>
         <w:t xml:space="preserve"> ireo dia antsoina hoe </w:t>
       </w:r>
@@ -3466,8 +3467,8 @@
           <w:b/>
           <w:bCs/>
           <w:color w:val="1F4E79"/>
-          <w:sz w:val="22"/>
-          <w:szCs w:val="22"/>
+          <w:sz w:val="24"/>
+          <w:szCs w:val="24"/>
         </w:rPr>
         <w:t xml:space="preserve">MPAHAY TANTARA</w:t>
       </w:r>
@@ -3475,8 +3476,8 @@
         <w:rPr>
           <w:rFonts w:ascii="Times New Roman" w:cs="Times New Roman" w:eastAsia="Times New Roman" w:hAnsi="Times New Roman"/>
           <w:color w:val="000000"/>
-          <w:sz w:val="22"/>
-          <w:szCs w:val="22"/>
+          <w:sz w:val="24"/>
+          <w:szCs w:val="24"/>
         </w:rPr>
         <w:t xml:space="preserve"> (« historien »).</w:t>
       </w:r>
@@ -3489,8 +3490,8 @@
         <w:rPr>
           <w:rFonts w:ascii="Times New Roman" w:cs="Times New Roman" w:eastAsia="Times New Roman" w:hAnsi="Times New Roman"/>
           <w:color w:val="000000"/>
-          <w:sz w:val="22"/>
-          <w:szCs w:val="22"/>
+          <w:sz w:val="24"/>
+          <w:szCs w:val="24"/>
         </w:rPr>
         <w:t xml:space="preserve">• ohatra amin'ny </w:t>
       </w:r>
@@ -3500,8 +3501,8 @@
           <w:b/>
           <w:bCs/>
           <w:color w:val="1F4E79"/>
-          <w:sz w:val="22"/>
-          <w:szCs w:val="22"/>
+          <w:sz w:val="24"/>
+          <w:szCs w:val="24"/>
         </w:rPr>
         <w:t xml:space="preserve">zava-nitranga</w:t>
       </w:r>
@@ -3509,8 +3510,8 @@
         <w:rPr>
           <w:rFonts w:ascii="Times New Roman" w:cs="Times New Roman" w:eastAsia="Times New Roman" w:hAnsi="Times New Roman"/>
           <w:color w:val="000000"/>
-          <w:sz w:val="22"/>
-          <w:szCs w:val="22"/>
+          <w:sz w:val="24"/>
+          <w:szCs w:val="24"/>
         </w:rPr>
         <w:t xml:space="preserve"> ara-</w:t>
       </w:r>
@@ -3520,8 +3521,8 @@
           <w:b/>
           <w:bCs/>
           <w:color w:val="1F4E79"/>
-          <w:sz w:val="22"/>
-          <w:szCs w:val="22"/>
+          <w:sz w:val="24"/>
+          <w:szCs w:val="24"/>
         </w:rPr>
         <w:t xml:space="preserve">tantara</w:t>
       </w:r>
@@ -3529,8 +3530,8 @@
         <w:rPr>
           <w:rFonts w:ascii="Times New Roman" w:cs="Times New Roman" w:eastAsia="Times New Roman" w:hAnsi="Times New Roman"/>
           <w:color w:val="000000"/>
-          <w:sz w:val="22"/>
-          <w:szCs w:val="22"/>
+          <w:sz w:val="24"/>
+          <w:szCs w:val="24"/>
         </w:rPr>
         <w:t xml:space="preserve"> : ny fiavian'ny razam-ben'ny Malagasy ;</w:t>
       </w:r>
@@ -3543,8 +3544,8 @@
         <w:rPr>
           <w:rFonts w:ascii="Times New Roman" w:cs="Times New Roman" w:eastAsia="Times New Roman" w:hAnsi="Times New Roman"/>
           <w:color w:val="000000"/>
-          <w:sz w:val="22"/>
-          <w:szCs w:val="22"/>
+          <w:sz w:val="24"/>
+          <w:szCs w:val="24"/>
         </w:rPr>
         <w:t xml:space="preserve">• ny mpanjakan'i Madagasikara nifandimby ;</w:t>
       </w:r>
@@ -3557,8 +3558,8 @@
         <w:rPr>
           <w:rFonts w:ascii="Times New Roman" w:cs="Times New Roman" w:eastAsia="Times New Roman" w:hAnsi="Times New Roman"/>
           <w:color w:val="000000"/>
-          <w:sz w:val="22"/>
-          <w:szCs w:val="22"/>
+          <w:sz w:val="24"/>
+          <w:szCs w:val="24"/>
         </w:rPr>
         <w:t xml:space="preserve">• ny tolom-pahafahana malagasy ;</w:t>
       </w:r>
@@ -3571,8 +3572,8 @@
         <w:rPr>
           <w:rFonts w:ascii="Times New Roman" w:cs="Times New Roman" w:eastAsia="Times New Roman" w:hAnsi="Times New Roman"/>
           <w:color w:val="000000"/>
-          <w:sz w:val="22"/>
-          <w:szCs w:val="22"/>
+          <w:sz w:val="24"/>
+          <w:szCs w:val="24"/>
         </w:rPr>
         <w:t xml:space="preserve">• ny ady lehibe voalohany sy faharoa.</w:t>
       </w:r>
@@ -3590,8 +3591,8 @@
           <w:i w:val="false"/>
           <w:iCs w:val="false"/>
           <w:color w:val="1E7B34"/>
-          <w:sz w:val="24"/>
-          <w:szCs w:val="24"/>
+          <w:sz w:val="26"/>
+          <w:szCs w:val="26"/>
         </w:rPr>
         <w:t xml:space="preserve">2. Ny toetran'ny zava-nitranga ara-tantara</w:t>
       </w:r>
@@ -3604,8 +3605,8 @@
         <w:rPr>
           <w:rFonts w:ascii="Times New Roman" w:cs="Times New Roman" w:eastAsia="Times New Roman" w:hAnsi="Times New Roman"/>
           <w:color w:val="000000"/>
-          <w:sz w:val="22"/>
-          <w:szCs w:val="22"/>
+          <w:sz w:val="24"/>
+          <w:szCs w:val="24"/>
         </w:rPr>
         <w:t xml:space="preserve">Tsy ny zavatra rehetra </w:t>
       </w:r>
@@ -3615,8 +3616,8 @@
           <w:b/>
           <w:bCs/>
           <w:color w:val="1F4E79"/>
-          <w:sz w:val="22"/>
-          <w:szCs w:val="22"/>
+          <w:sz w:val="24"/>
+          <w:szCs w:val="24"/>
         </w:rPr>
         <w:t xml:space="preserve">tantara</w:t>
       </w:r>
@@ -3624,8 +3625,8 @@
         <w:rPr>
           <w:rFonts w:ascii="Times New Roman" w:cs="Times New Roman" w:eastAsia="Times New Roman" w:hAnsi="Times New Roman"/>
           <w:color w:val="000000"/>
-          <w:sz w:val="22"/>
-          <w:szCs w:val="22"/>
+          <w:sz w:val="24"/>
+          <w:szCs w:val="24"/>
         </w:rPr>
         <w:t xml:space="preserve">ina no </w:t>
       </w:r>
@@ -3635,8 +3636,8 @@
           <w:b/>
           <w:bCs/>
           <w:color w:val="1F4E79"/>
-          <w:sz w:val="22"/>
-          <w:szCs w:val="22"/>
+          <w:sz w:val="24"/>
+          <w:szCs w:val="24"/>
         </w:rPr>
         <w:t xml:space="preserve">Tantara</w:t>
       </w:r>
@@ -3644,8 +3645,8 @@
         <w:rPr>
           <w:rFonts w:ascii="Times New Roman" w:cs="Times New Roman" w:eastAsia="Times New Roman" w:hAnsi="Times New Roman"/>
           <w:color w:val="000000"/>
-          <w:sz w:val="22"/>
-          <w:szCs w:val="22"/>
+          <w:sz w:val="24"/>
+          <w:szCs w:val="24"/>
         </w:rPr>
         <w:t xml:space="preserve"> ! Manana toetra efatra mampiavaka azy ny </w:t>
       </w:r>
@@ -3655,8 +3656,8 @@
           <w:b/>
           <w:bCs/>
           <w:color w:val="1F4E79"/>
-          <w:sz w:val="22"/>
-          <w:szCs w:val="22"/>
+          <w:sz w:val="24"/>
+          <w:szCs w:val="24"/>
         </w:rPr>
         <w:t xml:space="preserve">zava-nitranga</w:t>
       </w:r>
@@ -3664,8 +3665,8 @@
         <w:rPr>
           <w:rFonts w:ascii="Times New Roman" w:cs="Times New Roman" w:eastAsia="Times New Roman" w:hAnsi="Times New Roman"/>
           <w:color w:val="000000"/>
-          <w:sz w:val="22"/>
-          <w:szCs w:val="22"/>
+          <w:sz w:val="24"/>
+          <w:szCs w:val="24"/>
         </w:rPr>
         <w:t xml:space="preserve"> ara-</w:t>
       </w:r>
@@ -3675,8 +3676,8 @@
           <w:b/>
           <w:bCs/>
           <w:color w:val="1F4E79"/>
-          <w:sz w:val="22"/>
-          <w:szCs w:val="22"/>
+          <w:sz w:val="24"/>
+          <w:szCs w:val="24"/>
         </w:rPr>
         <w:t xml:space="preserve">tantara</w:t>
       </w:r>
@@ -3684,8 +3685,8 @@
         <w:rPr>
           <w:rFonts w:ascii="Times New Roman" w:cs="Times New Roman" w:eastAsia="Times New Roman" w:hAnsi="Times New Roman"/>
           <w:color w:val="000000"/>
-          <w:sz w:val="22"/>
-          <w:szCs w:val="22"/>
+          <w:sz w:val="24"/>
+          <w:szCs w:val="24"/>
         </w:rPr>
         <w:t xml:space="preserve"> :</w:t>
       </w:r>
@@ -3698,8 +3699,8 @@
         <w:rPr>
           <w:rFonts w:ascii="Times New Roman" w:cs="Times New Roman" w:eastAsia="Times New Roman" w:hAnsi="Times New Roman"/>
           <w:color w:val="000000"/>
-          <w:sz w:val="22"/>
-          <w:szCs w:val="22"/>
+          <w:sz w:val="24"/>
+          <w:szCs w:val="24"/>
         </w:rPr>
         <w:t xml:space="preserve">• ZAVA-NISY MARINA izy, niseho teo amin'ny fiarahamonina, teo amin'ny faritra na teo amin'ny firenena iray, eo amin'ny lafiny ara-piarahamonina, ara-toekarena na ara-politika ;</w:t>
       </w:r>
@@ -3712,8 +3713,8 @@
         <w:rPr>
           <w:rFonts w:ascii="Times New Roman" w:cs="Times New Roman" w:eastAsia="Times New Roman" w:hAnsi="Times New Roman"/>
           <w:color w:val="000000"/>
-          <w:sz w:val="22"/>
-          <w:szCs w:val="22"/>
+          <w:sz w:val="24"/>
+          <w:szCs w:val="24"/>
         </w:rPr>
         <w:t xml:space="preserve">• VOAFARITRA MAZAVA ny toerana sy ny fotoana nitrangany (taiza ? oviana ?) ;</w:t>
       </w:r>
@@ -3726,8 +3727,8 @@
         <w:rPr>
           <w:rFonts w:ascii="Times New Roman" w:cs="Times New Roman" w:eastAsia="Times New Roman" w:hAnsi="Times New Roman"/>
           <w:color w:val="000000"/>
-          <w:sz w:val="22"/>
-          <w:szCs w:val="22"/>
+          <w:sz w:val="24"/>
+          <w:szCs w:val="24"/>
         </w:rPr>
         <w:t xml:space="preserve">• MIOVA araka ny fotoana sy ny toerana isehoany ;</w:t>
       </w:r>
@@ -3740,8 +3741,8 @@
         <w:rPr>
           <w:rFonts w:ascii="Times New Roman" w:cs="Times New Roman" w:eastAsia="Times New Roman" w:hAnsi="Times New Roman"/>
           <w:color w:val="000000"/>
-          <w:sz w:val="22"/>
-          <w:szCs w:val="22"/>
+          <w:sz w:val="24"/>
+          <w:szCs w:val="24"/>
         </w:rPr>
         <w:t xml:space="preserve">• MISY </w:t>
       </w:r>
@@ -3751,8 +3752,8 @@
           <w:b/>
           <w:bCs/>
           <w:color w:val="1F4E79"/>
-          <w:sz w:val="22"/>
-          <w:szCs w:val="22"/>
+          <w:sz w:val="24"/>
+          <w:szCs w:val="24"/>
         </w:rPr>
         <w:t xml:space="preserve">POROFO ara-tantara</w:t>
       </w:r>
@@ -3760,8 +3761,8 @@
         <w:rPr>
           <w:rFonts w:ascii="Times New Roman" w:cs="Times New Roman" w:eastAsia="Times New Roman" w:hAnsi="Times New Roman"/>
           <w:color w:val="000000"/>
-          <w:sz w:val="22"/>
-          <w:szCs w:val="22"/>
+          <w:sz w:val="24"/>
+          <w:szCs w:val="24"/>
         </w:rPr>
         <w:t xml:space="preserve"> (soratra, fitaovana, vavolombelona…).</w:t>
       </w:r>
@@ -3774,8 +3775,8 @@
         <w:rPr>
           <w:rFonts w:ascii="Times New Roman" w:cs="Times New Roman" w:eastAsia="Times New Roman" w:hAnsi="Times New Roman"/>
           <w:color w:val="000000"/>
-          <w:sz w:val="22"/>
-          <w:szCs w:val="22"/>
+          <w:sz w:val="24"/>
+          <w:szCs w:val="24"/>
         </w:rPr>
         <w:t xml:space="preserve">• Tandremo : ny angano sy ny arira dia tsy </w:t>
       </w:r>
@@ -3785,8 +3786,8 @@
           <w:b/>
           <w:bCs/>
           <w:color w:val="1F4E79"/>
-          <w:sz w:val="22"/>
-          <w:szCs w:val="22"/>
+          <w:sz w:val="24"/>
+          <w:szCs w:val="24"/>
         </w:rPr>
         <w:t xml:space="preserve">Tantara</w:t>
       </w:r>
@@ -3794,8 +3795,8 @@
         <w:rPr>
           <w:rFonts w:ascii="Times New Roman" w:cs="Times New Roman" w:eastAsia="Times New Roman" w:hAnsi="Times New Roman"/>
           <w:color w:val="000000"/>
-          <w:sz w:val="22"/>
-          <w:szCs w:val="22"/>
+          <w:sz w:val="24"/>
+          <w:szCs w:val="24"/>
         </w:rPr>
         <w:t xml:space="preserve">, satria tsy misy porofo ary tsy voafaritra ny toerana sy ny fotoana nitrangany !</w:t>
       </w:r>
@@ -3813,8 +3814,8 @@
           <w:i w:val="false"/>
           <w:iCs w:val="false"/>
           <w:color w:val="1E7B34"/>
-          <w:sz w:val="24"/>
-          <w:szCs w:val="24"/>
+          <w:sz w:val="26"/>
+          <w:szCs w:val="26"/>
         </w:rPr>
         <w:t xml:space="preserve">3. Ny tombontsoa entin'ny fahaizana tantara</w:t>
       </w:r>
@@ -3827,8 +3828,8 @@
         <w:rPr>
           <w:rFonts w:ascii="Times New Roman" w:cs="Times New Roman" w:eastAsia="Times New Roman" w:hAnsi="Times New Roman"/>
           <w:color w:val="000000"/>
-          <w:sz w:val="22"/>
-          <w:szCs w:val="22"/>
+          <w:sz w:val="24"/>
+          <w:szCs w:val="24"/>
         </w:rPr>
         <w:t xml:space="preserve">Manana ny anjara asany eo amin'ny fiainana andavanandro ny </w:t>
       </w:r>
@@ -3838,8 +3839,8 @@
           <w:b/>
           <w:bCs/>
           <w:color w:val="1F4E79"/>
-          <w:sz w:val="22"/>
-          <w:szCs w:val="22"/>
+          <w:sz w:val="24"/>
+          <w:szCs w:val="24"/>
         </w:rPr>
         <w:t xml:space="preserve">Tantara</w:t>
       </w:r>
@@ -3847,8 +3848,8 @@
         <w:rPr>
           <w:rFonts w:ascii="Times New Roman" w:cs="Times New Roman" w:eastAsia="Times New Roman" w:hAnsi="Times New Roman"/>
           <w:color w:val="000000"/>
-          <w:sz w:val="22"/>
-          <w:szCs w:val="22"/>
+          <w:sz w:val="24"/>
+          <w:szCs w:val="24"/>
         </w:rPr>
         <w:t xml:space="preserve">. Ny fahafantarana ny </w:t>
       </w:r>
@@ -3858,8 +3859,8 @@
           <w:b/>
           <w:bCs/>
           <w:color w:val="1F4E79"/>
-          <w:sz w:val="22"/>
-          <w:szCs w:val="22"/>
+          <w:sz w:val="24"/>
+          <w:szCs w:val="24"/>
         </w:rPr>
         <w:t xml:space="preserve">tantara</w:t>
       </w:r>
@@ -3867,8 +3868,8 @@
         <w:rPr>
           <w:rFonts w:ascii="Times New Roman" w:cs="Times New Roman" w:eastAsia="Times New Roman" w:hAnsi="Times New Roman"/>
           <w:color w:val="000000"/>
-          <w:sz w:val="22"/>
-          <w:szCs w:val="22"/>
+          <w:sz w:val="24"/>
+          <w:szCs w:val="24"/>
         </w:rPr>
         <w:t xml:space="preserve"> dia :</w:t>
       </w:r>
@@ -3881,8 +3882,8 @@
         <w:rPr>
           <w:rFonts w:ascii="Times New Roman" w:cs="Times New Roman" w:eastAsia="Times New Roman" w:hAnsi="Times New Roman"/>
           <w:color w:val="000000"/>
-          <w:sz w:val="22"/>
-          <w:szCs w:val="22"/>
+          <w:sz w:val="24"/>
+          <w:szCs w:val="24"/>
         </w:rPr>
         <w:t xml:space="preserve">• ahafahana mahafantatra ny FOTOTRA NIAVIANA (ohatra : ny </w:t>
       </w:r>
@@ -3892,8 +3893,8 @@
           <w:b/>
           <w:bCs/>
           <w:color w:val="1F4E79"/>
-          <w:sz w:val="22"/>
-          <w:szCs w:val="22"/>
+          <w:sz w:val="24"/>
+          <w:szCs w:val="24"/>
         </w:rPr>
         <w:t xml:space="preserve">tantara</w:t>
       </w:r>
@@ -3901,8 +3902,8 @@
         <w:rPr>
           <w:rFonts w:ascii="Times New Roman" w:cs="Times New Roman" w:eastAsia="Times New Roman" w:hAnsi="Times New Roman"/>
           <w:color w:val="000000"/>
-          <w:sz w:val="22"/>
-          <w:szCs w:val="22"/>
+          <w:sz w:val="24"/>
+          <w:szCs w:val="24"/>
         </w:rPr>
         <w:t xml:space="preserve">n'ny faritra iray, ny fiavian'ny mponina malagasy) ;</w:t>
       </w:r>
@@ -3915,8 +3916,8 @@
         <w:rPr>
           <w:rFonts w:ascii="Times New Roman" w:cs="Times New Roman" w:eastAsia="Times New Roman" w:hAnsi="Times New Roman"/>
           <w:color w:val="000000"/>
-          <w:sz w:val="22"/>
-          <w:szCs w:val="22"/>
+          <w:sz w:val="24"/>
+          <w:szCs w:val="24"/>
         </w:rPr>
         <w:t xml:space="preserve">• ahalalana sy hanazavana ny ZAVA-MISY ANKEHITRINY (ohatra : ny fahaleovantena, ny zon'olombelona, ny fady amin'ny toerana iray) ;</w:t>
       </w:r>
@@ -3929,8 +3930,8 @@
         <w:rPr>
           <w:rFonts w:ascii="Times New Roman" w:cs="Times New Roman" w:eastAsia="Times New Roman" w:hAnsi="Times New Roman"/>
           <w:color w:val="000000"/>
-          <w:sz w:val="22"/>
-          <w:szCs w:val="22"/>
+          <w:sz w:val="24"/>
+          <w:szCs w:val="24"/>
         </w:rPr>
         <w:t xml:space="preserve">• ahitana ny FIVOARANA na ny fiovana eo an-toerana ;</w:t>
       </w:r>
@@ -3943,8 +3944,8 @@
         <w:rPr>
           <w:rFonts w:ascii="Times New Roman" w:cs="Times New Roman" w:eastAsia="Times New Roman" w:hAnsi="Times New Roman"/>
           <w:color w:val="000000"/>
-          <w:sz w:val="22"/>
-          <w:szCs w:val="22"/>
+          <w:sz w:val="24"/>
+          <w:szCs w:val="24"/>
         </w:rPr>
         <w:t xml:space="preserve">• ahaizana MISOROKA ireo tsy nety teo aloha ;</w:t>
       </w:r>
@@ -3957,8 +3958,8 @@
         <w:rPr>
           <w:rFonts w:ascii="Times New Roman" w:cs="Times New Roman" w:eastAsia="Times New Roman" w:hAnsi="Times New Roman"/>
           <w:color w:val="000000"/>
-          <w:sz w:val="22"/>
-          <w:szCs w:val="22"/>
+          <w:sz w:val="24"/>
+          <w:szCs w:val="24"/>
         </w:rPr>
         <w:t xml:space="preserve">• ahaizana ny </w:t>
       </w:r>
@@ -3968,8 +3969,8 @@
           <w:b/>
           <w:bCs/>
           <w:color w:val="1F4E79"/>
-          <w:sz w:val="22"/>
-          <w:szCs w:val="22"/>
+          <w:sz w:val="24"/>
+          <w:szCs w:val="24"/>
         </w:rPr>
         <w:t xml:space="preserve">tantara</w:t>
       </w:r>
@@ -3977,8 +3978,8 @@
         <w:rPr>
           <w:rFonts w:ascii="Times New Roman" w:cs="Times New Roman" w:eastAsia="Times New Roman" w:hAnsi="Times New Roman"/>
           <w:color w:val="000000"/>
-          <w:sz w:val="22"/>
-          <w:szCs w:val="22"/>
+          <w:sz w:val="24"/>
+          <w:szCs w:val="24"/>
         </w:rPr>
         <w:t xml:space="preserve">n'ireo olo-malaza sy ny asa vitany, ka ahafahana MANATSARA NY HOAVY.</w:t>
       </w:r>
@@ -3996,8 +3997,8 @@
           <w:i w:val="false"/>
           <w:iCs w:val="false"/>
           <w:color w:val="1E7B34"/>
-          <w:sz w:val="24"/>
-          <w:szCs w:val="24"/>
+          <w:sz w:val="26"/>
+          <w:szCs w:val="26"/>
         </w:rPr>
         <w:t xml:space="preserve">4. Ohatra voavaha</w:t>
       </w:r>
@@ -4010,8 +4011,8 @@
         <w:rPr>
           <w:rFonts w:ascii="Times New Roman" w:cs="Times New Roman" w:eastAsia="Times New Roman" w:hAnsi="Times New Roman"/>
           <w:color w:val="000000"/>
-          <w:sz w:val="22"/>
-          <w:szCs w:val="22"/>
+          <w:sz w:val="24"/>
+          <w:szCs w:val="24"/>
         </w:rPr>
         <w:t xml:space="preserve">Ohatra 1 — Lazao raha </w:t>
       </w:r>
@@ -4021,8 +4022,8 @@
           <w:b/>
           <w:bCs/>
           <w:color w:val="1F4E79"/>
-          <w:sz w:val="22"/>
-          <w:szCs w:val="22"/>
+          <w:sz w:val="24"/>
+          <w:szCs w:val="24"/>
         </w:rPr>
         <w:t xml:space="preserve">zava-nitranga</w:t>
       </w:r>
@@ -4030,8 +4031,8 @@
         <w:rPr>
           <w:rFonts w:ascii="Times New Roman" w:cs="Times New Roman" w:eastAsia="Times New Roman" w:hAnsi="Times New Roman"/>
           <w:color w:val="000000"/>
-          <w:sz w:val="22"/>
-          <w:szCs w:val="22"/>
+          <w:sz w:val="24"/>
+          <w:szCs w:val="24"/>
         </w:rPr>
         <w:t xml:space="preserve"> ara-</w:t>
       </w:r>
@@ -4041,8 +4042,8 @@
           <w:b/>
           <w:bCs/>
           <w:color w:val="1F4E79"/>
-          <w:sz w:val="22"/>
-          <w:szCs w:val="22"/>
+          <w:sz w:val="24"/>
+          <w:szCs w:val="24"/>
         </w:rPr>
         <w:t xml:space="preserve">tantara</w:t>
       </w:r>
@@ -4050,8 +4051,8 @@
         <w:rPr>
           <w:rFonts w:ascii="Times New Roman" w:cs="Times New Roman" w:eastAsia="Times New Roman" w:hAnsi="Times New Roman"/>
           <w:color w:val="000000"/>
-          <w:sz w:val="22"/>
-          <w:szCs w:val="22"/>
+          <w:sz w:val="24"/>
+          <w:szCs w:val="24"/>
         </w:rPr>
         <w:t xml:space="preserve"> ny « fahaleovantenan'i Madagasikara », ary hamarino amin'ny toetra efatra. Vahaolana : zava-nisy marina izy (niseho teto amin'ny firenena) ; voafaritra mazava ny fotoana sy ny toerana (26 jona 1960, tao Antananarivo) ; niova ny fiainam-pirenena taorian'izay ; misy porofo (soratra ofisialy, sary, vavolombelona). </w:t>
       </w:r>
@@ -4061,8 +4062,8 @@
           <w:b/>
           <w:bCs/>
           <w:color w:val="1F4E79"/>
-          <w:sz w:val="22"/>
-          <w:szCs w:val="22"/>
+          <w:sz w:val="24"/>
+          <w:szCs w:val="24"/>
         </w:rPr>
         <w:t xml:space="preserve">Zava-nitranga</w:t>
       </w:r>
@@ -4070,8 +4071,8 @@
         <w:rPr>
           <w:rFonts w:ascii="Times New Roman" w:cs="Times New Roman" w:eastAsia="Times New Roman" w:hAnsi="Times New Roman"/>
           <w:color w:val="000000"/>
-          <w:sz w:val="22"/>
-          <w:szCs w:val="22"/>
+          <w:sz w:val="24"/>
+          <w:szCs w:val="24"/>
         </w:rPr>
         <w:t xml:space="preserve"> ara-</w:t>
       </w:r>
@@ -4081,8 +4082,8 @@
           <w:b/>
           <w:bCs/>
           <w:color w:val="1F4E79"/>
-          <w:sz w:val="22"/>
-          <w:szCs w:val="22"/>
+          <w:sz w:val="24"/>
+          <w:szCs w:val="24"/>
         </w:rPr>
         <w:t xml:space="preserve">tantara</w:t>
       </w:r>
@@ -4090,8 +4091,8 @@
         <w:rPr>
           <w:rFonts w:ascii="Times New Roman" w:cs="Times New Roman" w:eastAsia="Times New Roman" w:hAnsi="Times New Roman"/>
           <w:color w:val="000000"/>
-          <w:sz w:val="22"/>
-          <w:szCs w:val="22"/>
+          <w:sz w:val="24"/>
+          <w:szCs w:val="24"/>
         </w:rPr>
         <w:t xml:space="preserve"> tokoa àry izy.</w:t>
       </w:r>
@@ -4104,8 +4105,8 @@
         <w:rPr>
           <w:rFonts w:ascii="Times New Roman" w:cs="Times New Roman" w:eastAsia="Times New Roman" w:hAnsi="Times New Roman"/>
           <w:color w:val="000000"/>
-          <w:sz w:val="22"/>
-          <w:szCs w:val="22"/>
+          <w:sz w:val="24"/>
+          <w:szCs w:val="24"/>
         </w:rPr>
         <w:t xml:space="preserve">Ohatra 2 — Ny angano hoe « Ibonia » ve </w:t>
       </w:r>
@@ -4115,8 +4116,8 @@
           <w:b/>
           <w:bCs/>
           <w:color w:val="1F4E79"/>
-          <w:sz w:val="22"/>
-          <w:szCs w:val="22"/>
+          <w:sz w:val="24"/>
+          <w:szCs w:val="24"/>
         </w:rPr>
         <w:t xml:space="preserve">Tantara</w:t>
       </w:r>
@@ -4124,8 +4125,8 @@
         <w:rPr>
           <w:rFonts w:ascii="Times New Roman" w:cs="Times New Roman" w:eastAsia="Times New Roman" w:hAnsi="Times New Roman"/>
           <w:color w:val="000000"/>
-          <w:sz w:val="22"/>
-          <w:szCs w:val="22"/>
+          <w:sz w:val="24"/>
+          <w:szCs w:val="24"/>
         </w:rPr>
         <w:t xml:space="preserve"> sa tsia ? Hazavao. Vahaolana : tsia, tsy </w:t>
       </w:r>
@@ -4135,8 +4136,8 @@
           <w:b/>
           <w:bCs/>
           <w:color w:val="1F4E79"/>
-          <w:sz w:val="22"/>
-          <w:szCs w:val="22"/>
+          <w:sz w:val="24"/>
+          <w:szCs w:val="24"/>
         </w:rPr>
         <w:t xml:space="preserve">Tantara</w:t>
       </w:r>
@@ -4144,8 +4145,8 @@
         <w:rPr>
           <w:rFonts w:ascii="Times New Roman" w:cs="Times New Roman" w:eastAsia="Times New Roman" w:hAnsi="Times New Roman"/>
           <w:color w:val="000000"/>
-          <w:sz w:val="22"/>
-          <w:szCs w:val="22"/>
+          <w:sz w:val="24"/>
+          <w:szCs w:val="24"/>
         </w:rPr>
         <w:t xml:space="preserve"> izy fa angano : tsy voafaritra ny toerana sy ny fotoana nitrangany, ary tsy misy </w:t>
       </w:r>
@@ -4155,8 +4156,8 @@
           <w:b/>
           <w:bCs/>
           <w:color w:val="1F4E79"/>
-          <w:sz w:val="22"/>
-          <w:szCs w:val="22"/>
+          <w:sz w:val="24"/>
+          <w:szCs w:val="24"/>
         </w:rPr>
         <w:t xml:space="preserve">porofo ara-tantara</w:t>
       </w:r>
@@ -4164,8 +4165,8 @@
         <w:rPr>
           <w:rFonts w:ascii="Times New Roman" w:cs="Times New Roman" w:eastAsia="Times New Roman" w:hAnsi="Times New Roman"/>
           <w:color w:val="000000"/>
-          <w:sz w:val="22"/>
-          <w:szCs w:val="22"/>
+          <w:sz w:val="24"/>
+          <w:szCs w:val="24"/>
         </w:rPr>
         <w:t xml:space="preserve">. Kanefa sarobidy ho an'ny kolontsaina malagasy izy ary azon'ny </w:t>
       </w:r>
@@ -4175,8 +4176,8 @@
           <w:b/>
           <w:bCs/>
           <w:color w:val="1F4E79"/>
-          <w:sz w:val="22"/>
-          <w:szCs w:val="22"/>
+          <w:sz w:val="24"/>
+          <w:szCs w:val="24"/>
         </w:rPr>
         <w:t xml:space="preserve">mpahay tantara</w:t>
       </w:r>
@@ -4184,8 +4185,8 @@
         <w:rPr>
           <w:rFonts w:ascii="Times New Roman" w:cs="Times New Roman" w:eastAsia="Times New Roman" w:hAnsi="Times New Roman"/>
           <w:color w:val="000000"/>
-          <w:sz w:val="22"/>
-          <w:szCs w:val="22"/>
+          <w:sz w:val="24"/>
+          <w:szCs w:val="24"/>
         </w:rPr>
         <w:t xml:space="preserve"> dinihina ho loharano ahalalana ny fomba fisainan'ny Ntaolo.</w:t>
       </w:r>
@@ -4219,7 +4220,7 @@
           <wp:inline distT="0" distB="0" distL="0" distR="0">
             <wp:extent cx="4572000" cy="1790700"/>
             <wp:effectExtent t="0" r="0" b="0" l="0"/>
-            <wp:docPr id="1" name="" descr="" title=""/>
+            <wp:docPr id="1" name="Ny dingana mankany amin'ny fahalalana ara-tantara" descr="Ny dingana mankany amin'ny fahalalana ara-tantara" title="Ny dingana mankany amin'ny fahalalana ara-tantara"/>
             <wp:cNvGraphicFramePr>
               <a:graphicFrameLocks xmlns:a="http://schemas.openxmlformats.org/drawingml/2006/main" noChangeAspect="1"/>
             </wp:cNvGraphicFramePr>
@@ -4268,8 +4269,8 @@
           <w:i/>
           <w:iCs/>
           <w:color w:val="000000"/>
-          <w:sz w:val="18"/>
-          <w:szCs w:val="18"/>
+          <w:sz w:val="22"/>
+          <w:szCs w:val="22"/>
         </w:rPr>
         <w:t xml:space="preserve">Sary 2 — Ny dingana mankany amin'ny fahalalana ara-tantara</w:t>
       </w:r>
@@ -4333,8 +4334,8 @@
                 <w:i w:val="false"/>
                 <w:iCs w:val="false"/>
                 <w:color w:val="1F4E79"/>
-                <w:sz w:val="21"/>
-                <w:szCs w:val="21"/>
+                <w:sz w:val="24"/>
+                <w:szCs w:val="24"/>
               </w:rPr>
               <w:t xml:space="preserve">Fantatrao ve ?</w:t>
             </w:r>
@@ -4352,8 +4353,8 @@
                 <w:i w:val="false"/>
                 <w:iCs w:val="false"/>
                 <w:color w:val="000000"/>
-                <w:sz w:val="20"/>
-                <w:szCs w:val="20"/>
+                <w:sz w:val="24"/>
+                <w:szCs w:val="24"/>
               </w:rPr>
               <w:t xml:space="preserve">Ny grika Herodota (Hérodote, taonjato faha-5 talohan'i J.K.) no antsoina hoe « rain'ny Tantara » : izy no voalohany nanadihady sy nandrakitra an-tsoratra ny zava-nitranga, ka avy amin'ny bokiny « Historia » no niavian'ny anaran'ity siansa ity.</w:t>
             </w:r>
@@ -4371,8 +4372,8 @@
                 <w:i w:val="false"/>
                 <w:iCs w:val="false"/>
                 <w:color w:val="000000"/>
-                <w:sz w:val="20"/>
-                <w:szCs w:val="20"/>
+                <w:sz w:val="24"/>
+                <w:szCs w:val="24"/>
               </w:rPr>
               <w:t xml:space="preserve">Ny « Tantara ny Andriana eto Madagasikara », nangonin'ny Mompera Callet nanomboka tamin'ny 1868, dia lovan-tsofina malagasy voarakitra an-tsoratra : boky mihoatra ny pejy 1 200 izay lasa loharano lehibe indrindra ahalalana ny tantaran'ny Imerina !</w:t>
             </w:r>
@@ -4439,8 +4440,8 @@
                 <w:i w:val="false"/>
                 <w:iCs w:val="false"/>
                 <w:color w:val="B25000"/>
-                <w:sz w:val="21"/>
-                <w:szCs w:val="21"/>
+                <w:sz w:val="24"/>
+                <w:szCs w:val="24"/>
               </w:rPr>
               <w:t xml:space="preserve">Tahirin-kevitra hodinihina</w:t>
             </w:r>
@@ -4458,8 +4459,8 @@
                 <w:i w:val="false"/>
                 <w:iCs w:val="false"/>
                 <w:color w:val="000000"/>
-                <w:sz w:val="20"/>
-                <w:szCs w:val="20"/>
+                <w:sz w:val="24"/>
+                <w:szCs w:val="24"/>
               </w:rPr>
               <w:t xml:space="preserve">Vakio ity tahirin-kevitra ity ary valio ny fanontaniana :</w:t>
             </w:r>
@@ -4477,8 +4478,8 @@
                 <w:i/>
                 <w:iCs/>
                 <w:color w:val="000000"/>
-                <w:sz w:val="20"/>
-                <w:szCs w:val="20"/>
+                <w:sz w:val="24"/>
+                <w:szCs w:val="24"/>
               </w:rPr>
               <w:t xml:space="preserve">« Ny tantara dia fandinihana ny zava-mitranga, ny zava-bita, ary ny zavatra mikasika azy. Ny tantara dia zavatra tantaraina, izy io dia fitaratry ny zava-mitranga efa lasa, ary ny olona mandinika sy mitantara io zavatra io dia lazaina hoe mpahay tantara. » (Loharano : FRP Tantara T6, MEN)</w:t>
             </w:r>
@@ -4496,8 +4497,8 @@
                 <w:i w:val="false"/>
                 <w:iCs w:val="false"/>
                 <w:color w:val="000000"/>
-                <w:sz w:val="20"/>
-                <w:szCs w:val="20"/>
+                <w:sz w:val="24"/>
+                <w:szCs w:val="24"/>
               </w:rPr>
               <w:t xml:space="preserve">1. Araka ity lahatsoratra ity, inona no atao hoe Tantara ?</w:t>
             </w:r>
@@ -4515,8 +4516,8 @@
                 <w:i w:val="false"/>
                 <w:iCs w:val="false"/>
                 <w:color w:val="000000"/>
-                <w:sz w:val="20"/>
-                <w:szCs w:val="20"/>
+                <w:sz w:val="24"/>
+                <w:szCs w:val="24"/>
               </w:rPr>
               <w:t xml:space="preserve">2. Iza no antsoina hoe mpahay tantara ?</w:t>
             </w:r>
@@ -4534,8 +4535,8 @@
                 <w:i w:val="false"/>
                 <w:iCs w:val="false"/>
                 <w:color w:val="000000"/>
-                <w:sz w:val="20"/>
-                <w:szCs w:val="20"/>
+                <w:sz w:val="24"/>
+                <w:szCs w:val="24"/>
               </w:rPr>
               <w:t xml:space="preserve">3. Nahoana ny Tantara no lazaina fa « fitaratry ny zava-mitranga efa lasa » ?</w:t>
             </w:r>
@@ -4575,8 +4576,8 @@
           <w:i w:val="false"/>
           <w:iCs w:val="false"/>
           <w:color w:val="1E7B34"/>
-          <w:sz w:val="21"/>
-          <w:szCs w:val="21"/>
+          <w:sz w:val="24"/>
+          <w:szCs w:val="24"/>
         </w:rPr>
         <w:t xml:space="preserve">Rakibolana kely</w:t>
       </w:r>
@@ -4622,8 +4623,8 @@
                 <w:i w:val="false"/>
                 <w:iCs w:val="false"/>
                 <w:color w:val="000000"/>
-                <w:sz w:val="19"/>
-                <w:szCs w:val="19"/>
+                <w:sz w:val="22"/>
+                <w:szCs w:val="22"/>
               </w:rPr>
               <w:t xml:space="preserve">Teny malagasy</w:t>
             </w:r>
@@ -4653,8 +4654,8 @@
                 <w:i w:val="false"/>
                 <w:iCs w:val="false"/>
                 <w:color w:val="000000"/>
-                <w:sz w:val="19"/>
-                <w:szCs w:val="19"/>
+                <w:sz w:val="22"/>
+                <w:szCs w:val="22"/>
               </w:rPr>
               <w:t xml:space="preserve">Terme officiel (français)</w:t>
             </w:r>
@@ -4685,8 +4686,8 @@
                 <w:i w:val="false"/>
                 <w:iCs w:val="false"/>
                 <w:color w:val="000000"/>
-                <w:sz w:val="19"/>
-                <w:szCs w:val="19"/>
+                <w:sz w:val="22"/>
+                <w:szCs w:val="22"/>
               </w:rPr>
               <w:t xml:space="preserve">Tantara</w:t>
             </w:r>
@@ -4715,8 +4716,8 @@
                 <w:i w:val="false"/>
                 <w:iCs w:val="false"/>
                 <w:color w:val="000000"/>
-                <w:sz w:val="19"/>
-                <w:szCs w:val="19"/>
+                <w:sz w:val="22"/>
+                <w:szCs w:val="22"/>
               </w:rPr>
               <w:t xml:space="preserve">Histoire</w:t>
             </w:r>
@@ -4747,8 +4748,8 @@
                 <w:i w:val="false"/>
                 <w:iCs w:val="false"/>
                 <w:color w:val="000000"/>
-                <w:sz w:val="19"/>
-                <w:szCs w:val="19"/>
+                <w:sz w:val="22"/>
+                <w:szCs w:val="22"/>
               </w:rPr>
               <w:t xml:space="preserve">Mpahay tantara</w:t>
             </w:r>
@@ -4777,8 +4778,8 @@
                 <w:i w:val="false"/>
                 <w:iCs w:val="false"/>
                 <w:color w:val="000000"/>
-                <w:sz w:val="19"/>
-                <w:szCs w:val="19"/>
+                <w:sz w:val="22"/>
+                <w:szCs w:val="22"/>
               </w:rPr>
               <w:t xml:space="preserve">Historien</w:t>
             </w:r>
@@ -4809,8 +4810,8 @@
                 <w:i w:val="false"/>
                 <w:iCs w:val="false"/>
                 <w:color w:val="000000"/>
-                <w:sz w:val="19"/>
-                <w:szCs w:val="19"/>
+                <w:sz w:val="22"/>
+                <w:szCs w:val="22"/>
               </w:rPr>
               <w:t xml:space="preserve">Zava-nitranga ara-tantara</w:t>
             </w:r>
@@ -4839,8 +4840,8 @@
                 <w:i w:val="false"/>
                 <w:iCs w:val="false"/>
                 <w:color w:val="000000"/>
-                <w:sz w:val="19"/>
-                <w:szCs w:val="19"/>
+                <w:sz w:val="22"/>
+                <w:szCs w:val="22"/>
               </w:rPr>
               <w:t xml:space="preserve">Événement historique</w:t>
             </w:r>
@@ -4871,8 +4872,8 @@
                 <w:i w:val="false"/>
                 <w:iCs w:val="false"/>
                 <w:color w:val="000000"/>
-                <w:sz w:val="19"/>
-                <w:szCs w:val="19"/>
+                <w:sz w:val="22"/>
+                <w:szCs w:val="22"/>
               </w:rPr>
               <w:t xml:space="preserve">Porofo ara-tantara</w:t>
             </w:r>
@@ -4901,8 +4902,8 @@
                 <w:i w:val="false"/>
                 <w:iCs w:val="false"/>
                 <w:color w:val="000000"/>
-                <w:sz w:val="19"/>
-                <w:szCs w:val="19"/>
+                <w:sz w:val="22"/>
+                <w:szCs w:val="22"/>
               </w:rPr>
               <w:t xml:space="preserve">Preuve historique</w:t>
             </w:r>
@@ -4933,8 +4934,8 @@
                 <w:i w:val="false"/>
                 <w:iCs w:val="false"/>
                 <w:color w:val="000000"/>
-                <w:sz w:val="19"/>
-                <w:szCs w:val="19"/>
+                <w:sz w:val="22"/>
+                <w:szCs w:val="22"/>
               </w:rPr>
               <w:t xml:space="preserve">Lovan-tsofina</w:t>
             </w:r>
@@ -4963,8 +4964,8 @@
                 <w:i w:val="false"/>
                 <w:iCs w:val="false"/>
                 <w:color w:val="000000"/>
-                <w:sz w:val="19"/>
-                <w:szCs w:val="19"/>
+                <w:sz w:val="22"/>
+                <w:szCs w:val="22"/>
               </w:rPr>
               <w:t xml:space="preserve">Tradition orale</w:t>
             </w:r>
@@ -4995,8 +4996,8 @@
                 <w:i w:val="false"/>
                 <w:iCs w:val="false"/>
                 <w:color w:val="000000"/>
-                <w:sz w:val="19"/>
-                <w:szCs w:val="19"/>
+                <w:sz w:val="22"/>
+                <w:szCs w:val="22"/>
               </w:rPr>
               <w:t xml:space="preserve">Vanim-potoana</w:t>
             </w:r>
@@ -5025,8 +5026,8 @@
                 <w:i w:val="false"/>
                 <w:iCs w:val="false"/>
                 <w:color w:val="000000"/>
-                <w:sz w:val="19"/>
-                <w:szCs w:val="19"/>
+                <w:sz w:val="22"/>
+                <w:szCs w:val="22"/>
               </w:rPr>
               <w:t xml:space="preserve">Période, époque</w:t>
             </w:r>
@@ -5052,8 +5053,8 @@
           <w:i w:val="false"/>
           <w:iCs w:val="false"/>
           <w:color w:val="000000"/>
-          <w:sz w:val="26"/>
-          <w:szCs w:val="26"/>
+          <w:sz w:val="28"/>
+          <w:szCs w:val="28"/>
         </w:rPr>
         <w:t xml:space="preserve">FANAZARAN-TENA</w:t>
       </w:r>
@@ -5071,8 +5072,8 @@
           <w:i/>
           <w:iCs/>
           <w:color w:val="000000"/>
-          <w:sz w:val="20"/>
-          <w:szCs w:val="20"/>
+          <w:sz w:val="24"/>
+          <w:szCs w:val="24"/>
         </w:rPr>
         <w:t xml:space="preserve">Totaly : 10 isa</w:t>
       </w:r>
@@ -5090,8 +5091,8 @@
           <w:i w:val="false"/>
           <w:iCs w:val="false"/>
           <w:color w:val="000000"/>
-          <w:sz w:val="22"/>
-          <w:szCs w:val="22"/>
+          <w:sz w:val="26"/>
+          <w:szCs w:val="26"/>
         </w:rPr>
         <w:t xml:space="preserve">Fanazaran-tena faha 1 (3 isa)</w:t>
       </w:r>
@@ -5109,8 +5110,8 @@
           <w:i/>
           <w:iCs/>
           <w:color w:val="000000"/>
-          <w:sz w:val="20"/>
-          <w:szCs w:val="20"/>
+          <w:sz w:val="24"/>
+          <w:szCs w:val="24"/>
         </w:rPr>
         <w:t xml:space="preserve">Fenoy ny banga : ny teny hoe Tantara dia avy amin'ny teny grika hoe ……… izay midika hoe ……… ; ny olona mandinika sy mitantara ny lasa dia antsoina hoe ……… .</w:t>
       </w:r>
@@ -5147,8 +5148,8 @@
           <w:i w:val="false"/>
           <w:iCs w:val="false"/>
           <w:color w:val="000000"/>
-          <w:sz w:val="22"/>
-          <w:szCs w:val="22"/>
+          <w:sz w:val="26"/>
+          <w:szCs w:val="26"/>
         </w:rPr>
         <w:t xml:space="preserve">Fanazaran-tena faha 2 (4 isa)</w:t>
       </w:r>
@@ -5166,8 +5167,8 @@
           <w:i/>
           <w:iCs/>
           <w:color w:val="000000"/>
-          <w:sz w:val="20"/>
-          <w:szCs w:val="20"/>
+          <w:sz w:val="24"/>
+          <w:szCs w:val="24"/>
         </w:rPr>
         <w:t xml:space="preserve">Lazao ireo toetra efatra mampiavaka ny zava-nitranga ara-tantara. (1 isa avy)</w:t>
       </w:r>
@@ -5204,8 +5205,8 @@
           <w:i w:val="false"/>
           <w:iCs w:val="false"/>
           <w:color w:val="000000"/>
-          <w:sz w:val="22"/>
-          <w:szCs w:val="22"/>
+          <w:sz w:val="26"/>
+          <w:szCs w:val="26"/>
         </w:rPr>
         <w:t xml:space="preserve">Fanazaran-tena faha 3 (3 isa)</w:t>
       </w:r>
@@ -5223,8 +5224,8 @@
           <w:i/>
           <w:iCs/>
           <w:color w:val="000000"/>
-          <w:sz w:val="20"/>
-          <w:szCs w:val="20"/>
+          <w:sz w:val="24"/>
+          <w:szCs w:val="24"/>
         </w:rPr>
         <w:t xml:space="preserve">Sokajio : « ny fahaleovantenan'i Madagasikara (1960) » sy « ny anganon'Ibonia ». Iza no zava-nitranga ara-tantara ? Hazavao amin'ny fehezanteny roa.</w:t>
       </w:r>
@@ -5271,6 +5272,25 @@
       <w:pPr>
         <w:spacing w:after="120" w:before="0"/>
         <w:jc w:val="center"/>
+      </w:pPr>
+      <w:r>
+        <w:rPr>
+          <w:rFonts w:ascii="Times New Roman" w:cs="Times New Roman" w:eastAsia="Times New Roman" w:hAnsi="Times New Roman"/>
+          <w:b/>
+          <w:bCs/>
+          <w:i w:val="false"/>
+          <w:iCs w:val="false"/>
+          <w:color w:val="C2185B"/>
+          <w:sz w:val="28"/>
+          <w:szCs w:val="28"/>
+        </w:rPr>
+        <w:t xml:space="preserve">VALINY</w:t>
+      </w:r>
+    </w:p>
+    <w:p>
+      <w:pPr>
+        <w:spacing w:after="40" w:before="0"/>
+        <w:jc w:val="left"/>
       </w:pPr>
       <w:r>
         <w:rPr>
@@ -5283,14 +5303,27 @@
           <w:sz w:val="26"/>
           <w:szCs w:val="26"/>
         </w:rPr>
-        <w:t xml:space="preserve">VALINY</w:t>
-      </w:r>
-    </w:p>
-    <w:p>
-      <w:pPr>
-        <w:spacing w:after="40" w:before="0"/>
+        <w:t xml:space="preserve">Valin'ny fanazaran-tena faha 1</w:t>
+      </w:r>
+    </w:p>
+    <w:p>
+      <w:pPr>
+        <w:spacing w:after="20" w:before="0"/>
         <w:jc w:val="left"/>
       </w:pPr>
+      <w:r>
+        <w:rPr>
+          <w:rFonts w:ascii="Times New Roman" w:cs="Times New Roman" w:eastAsia="Times New Roman" w:hAnsi="Times New Roman"/>
+          <w:b w:val="false"/>
+          <w:bCs w:val="false"/>
+          <w:i w:val="false"/>
+          <w:iCs w:val="false"/>
+          <w:color w:val="000000"/>
+          <w:sz w:val="24"/>
+          <w:szCs w:val="24"/>
+        </w:rPr>
+        <w:t xml:space="preserve">Avy amin'ny teny grika hoe </w:t>
+      </w:r>
       <w:r>
         <w:rPr>
           <w:rFonts w:ascii="Times New Roman" w:cs="Times New Roman" w:eastAsia="Times New Roman" w:hAnsi="Times New Roman"/>
@@ -5299,17 +5332,11 @@
           <w:i w:val="false"/>
           <w:iCs w:val="false"/>
           <w:color w:val="C2185B"/>
-          <w:sz w:val="22"/>
-          <w:szCs w:val="22"/>
-        </w:rPr>
-        <w:t xml:space="preserve">Valin'ny fanazaran-tena faha 1</w:t>
-      </w:r>
-    </w:p>
-    <w:p>
-      <w:pPr>
-        <w:spacing w:after="20" w:before="0"/>
-        <w:jc w:val="left"/>
-      </w:pPr>
+          <w:sz w:val="24"/>
+          <w:szCs w:val="24"/>
+        </w:rPr>
+        <w:t xml:space="preserve">historia</w:t>
+      </w:r>
       <w:r>
         <w:rPr>
           <w:rFonts w:ascii="Times New Roman" w:cs="Times New Roman" w:eastAsia="Times New Roman" w:hAnsi="Times New Roman"/>
@@ -5318,10 +5345,10 @@
           <w:i w:val="false"/>
           <w:iCs w:val="false"/>
           <w:color w:val="000000"/>
-          <w:sz w:val="20"/>
-          <w:szCs w:val="20"/>
-        </w:rPr>
-        <w:t xml:space="preserve">Avy amin'ny teny grika hoe </w:t>
+          <w:sz w:val="24"/>
+          <w:szCs w:val="24"/>
+        </w:rPr>
+        <w:t xml:space="preserve"> izay midika hoe </w:t>
       </w:r>
       <w:r>
         <w:rPr>
@@ -5331,10 +5358,10 @@
           <w:i w:val="false"/>
           <w:iCs w:val="false"/>
           <w:color w:val="C2185B"/>
-          <w:sz w:val="20"/>
-          <w:szCs w:val="20"/>
-        </w:rPr>
-        <w:t xml:space="preserve">historia</w:t>
+          <w:sz w:val="24"/>
+          <w:szCs w:val="24"/>
+        </w:rPr>
+        <w:t xml:space="preserve">fanadihadiana</w:t>
       </w:r>
       <w:r>
         <w:rPr>
@@ -5344,10 +5371,10 @@
           <w:i w:val="false"/>
           <w:iCs w:val="false"/>
           <w:color w:val="000000"/>
-          <w:sz w:val="20"/>
-          <w:szCs w:val="20"/>
-        </w:rPr>
-        <w:t xml:space="preserve"> izay midika hoe </w:t>
+          <w:sz w:val="24"/>
+          <w:szCs w:val="24"/>
+        </w:rPr>
+        <w:t xml:space="preserve"> ; antsoina hoe </w:t>
       </w:r>
       <w:r>
         <w:rPr>
@@ -5357,10 +5384,10 @@
           <w:i w:val="false"/>
           <w:iCs w:val="false"/>
           <w:color w:val="C2185B"/>
-          <w:sz w:val="20"/>
-          <w:szCs w:val="20"/>
-        </w:rPr>
-        <w:t xml:space="preserve">fanadihadiana</w:t>
+          <w:sz w:val="24"/>
+          <w:szCs w:val="24"/>
+        </w:rPr>
+        <w:t xml:space="preserve">mpahay tantara</w:t>
       </w:r>
       <w:r>
         <w:rPr>
@@ -5370,11 +5397,36 @@
           <w:i w:val="false"/>
           <w:iCs w:val="false"/>
           <w:color w:val="000000"/>
-          <w:sz w:val="20"/>
-          <w:szCs w:val="20"/>
-        </w:rPr>
-        <w:t xml:space="preserve"> ; antsoina hoe </w:t>
-      </w:r>
+          <w:sz w:val="24"/>
+          <w:szCs w:val="24"/>
+        </w:rPr>
+        <w:t xml:space="preserve">. (1 isa isaky ny banga)</w:t>
+      </w:r>
+    </w:p>
+    <w:p>
+      <w:pPr>
+        <w:spacing w:after="20" w:before="0"/>
+        <w:jc w:val="left"/>
+      </w:pPr>
+      <w:r>
+        <w:rPr>
+          <w:rFonts w:ascii="Times New Roman" w:cs="Times New Roman" w:eastAsia="Times New Roman" w:hAnsi="Times New Roman"/>
+          <w:b w:val="false"/>
+          <w:bCs w:val="false"/>
+          <w:i w:val="false"/>
+          <w:iCs w:val="false"/>
+          <w:color w:val="000000"/>
+          <w:sz w:val="8"/>
+          <w:szCs w:val="8"/>
+        </w:rPr>
+        <w:t xml:space="preserve"/>
+      </w:r>
+    </w:p>
+    <w:p>
+      <w:pPr>
+        <w:spacing w:after="40" w:before="0"/>
+        <w:jc w:val="left"/>
+      </w:pPr>
       <w:r>
         <w:rPr>
           <w:rFonts w:ascii="Times New Roman" w:cs="Times New Roman" w:eastAsia="Times New Roman" w:hAnsi="Times New Roman"/>
@@ -5383,11 +5435,17 @@
           <w:i w:val="false"/>
           <w:iCs w:val="false"/>
           <w:color w:val="C2185B"/>
-          <w:sz w:val="20"/>
-          <w:szCs w:val="20"/>
-        </w:rPr>
-        <w:t xml:space="preserve">mpahay tantara</w:t>
-      </w:r>
+          <w:sz w:val="26"/>
+          <w:szCs w:val="26"/>
+        </w:rPr>
+        <w:t xml:space="preserve">Valin'ny fanazaran-tena faha 2</w:t>
+      </w:r>
+    </w:p>
+    <w:p>
+      <w:pPr>
+        <w:spacing w:after="20" w:before="0"/>
+        <w:jc w:val="left"/>
+      </w:pPr>
       <w:r>
         <w:rPr>
           <w:rFonts w:ascii="Times New Roman" w:cs="Times New Roman" w:eastAsia="Times New Roman" w:hAnsi="Times New Roman"/>
@@ -5396,36 +5454,11 @@
           <w:i w:val="false"/>
           <w:iCs w:val="false"/>
           <w:color w:val="000000"/>
-          <w:sz w:val="20"/>
-          <w:szCs w:val="20"/>
-        </w:rPr>
-        <w:t xml:space="preserve">. (1 isa isaky ny banga)</w:t>
-      </w:r>
-    </w:p>
-    <w:p>
-      <w:pPr>
-        <w:spacing w:after="20" w:before="0"/>
-        <w:jc w:val="left"/>
-      </w:pPr>
-      <w:r>
-        <w:rPr>
-          <w:rFonts w:ascii="Times New Roman" w:cs="Times New Roman" w:eastAsia="Times New Roman" w:hAnsi="Times New Roman"/>
-          <w:b w:val="false"/>
-          <w:bCs w:val="false"/>
-          <w:i w:val="false"/>
-          <w:iCs w:val="false"/>
-          <w:color w:val="000000"/>
-          <w:sz w:val="8"/>
-          <w:szCs w:val="8"/>
-        </w:rPr>
-        <w:t xml:space="preserve"/>
-      </w:r>
-    </w:p>
-    <w:p>
-      <w:pPr>
-        <w:spacing w:after="40" w:before="0"/>
-        <w:jc w:val="left"/>
-      </w:pPr>
+          <w:sz w:val="24"/>
+          <w:szCs w:val="24"/>
+        </w:rPr>
+        <w:t xml:space="preserve">1. </w:t>
+      </w:r>
       <w:r>
         <w:rPr>
           <w:rFonts w:ascii="Times New Roman" w:cs="Times New Roman" w:eastAsia="Times New Roman" w:hAnsi="Times New Roman"/>
@@ -5434,17 +5467,11 @@
           <w:i w:val="false"/>
           <w:iCs w:val="false"/>
           <w:color w:val="C2185B"/>
-          <w:sz w:val="22"/>
-          <w:szCs w:val="22"/>
-        </w:rPr>
-        <w:t xml:space="preserve">Valin'ny fanazaran-tena faha 2</w:t>
-      </w:r>
-    </w:p>
-    <w:p>
-      <w:pPr>
-        <w:spacing w:after="20" w:before="0"/>
-        <w:jc w:val="left"/>
-      </w:pPr>
+          <w:sz w:val="24"/>
+          <w:szCs w:val="24"/>
+        </w:rPr>
+        <w:t xml:space="preserve">Zava-nisy marina</w:t>
+      </w:r>
       <w:r>
         <w:rPr>
           <w:rFonts w:ascii="Times New Roman" w:cs="Times New Roman" w:eastAsia="Times New Roman" w:hAnsi="Times New Roman"/>
@@ -5453,10 +5480,10 @@
           <w:i w:val="false"/>
           <w:iCs w:val="false"/>
           <w:color w:val="000000"/>
-          <w:sz w:val="20"/>
-          <w:szCs w:val="20"/>
-        </w:rPr>
-        <w:t xml:space="preserve">1. </w:t>
+          <w:sz w:val="24"/>
+          <w:szCs w:val="24"/>
+        </w:rPr>
+        <w:t xml:space="preserve"> ; 2. </w:t>
       </w:r>
       <w:r>
         <w:rPr>
@@ -5466,10 +5493,10 @@
           <w:i w:val="false"/>
           <w:iCs w:val="false"/>
           <w:color w:val="C2185B"/>
-          <w:sz w:val="20"/>
-          <w:szCs w:val="20"/>
-        </w:rPr>
-        <w:t xml:space="preserve">Zava-nisy marina</w:t>
+          <w:sz w:val="24"/>
+          <w:szCs w:val="24"/>
+        </w:rPr>
+        <w:t xml:space="preserve">voafaritra mazava ny toerana sy ny fotoana</w:t>
       </w:r>
       <w:r>
         <w:rPr>
@@ -5479,10 +5506,10 @@
           <w:i w:val="false"/>
           <w:iCs w:val="false"/>
           <w:color w:val="000000"/>
-          <w:sz w:val="20"/>
-          <w:szCs w:val="20"/>
-        </w:rPr>
-        <w:t xml:space="preserve"> ; 2. </w:t>
+          <w:sz w:val="24"/>
+          <w:szCs w:val="24"/>
+        </w:rPr>
+        <w:t xml:space="preserve"> ; 3. </w:t>
       </w:r>
       <w:r>
         <w:rPr>
@@ -5492,10 +5519,10 @@
           <w:i w:val="false"/>
           <w:iCs w:val="false"/>
           <w:color w:val="C2185B"/>
-          <w:sz w:val="20"/>
-          <w:szCs w:val="20"/>
-        </w:rPr>
-        <w:t xml:space="preserve">voafaritra mazava ny toerana sy ny fotoana</w:t>
+          <w:sz w:val="24"/>
+          <w:szCs w:val="24"/>
+        </w:rPr>
+        <w:t xml:space="preserve">miova araka ny fotoana sy ny toerana</w:t>
       </w:r>
       <w:r>
         <w:rPr>
@@ -5505,10 +5532,10 @@
           <w:i w:val="false"/>
           <w:iCs w:val="false"/>
           <w:color w:val="000000"/>
-          <w:sz w:val="20"/>
-          <w:szCs w:val="20"/>
-        </w:rPr>
-        <w:t xml:space="preserve"> ; 3. </w:t>
+          <w:sz w:val="24"/>
+          <w:szCs w:val="24"/>
+        </w:rPr>
+        <w:t xml:space="preserve"> ; 4. </w:t>
       </w:r>
       <w:r>
         <w:rPr>
@@ -5518,10 +5545,10 @@
           <w:i w:val="false"/>
           <w:iCs w:val="false"/>
           <w:color w:val="C2185B"/>
-          <w:sz w:val="20"/>
-          <w:szCs w:val="20"/>
-        </w:rPr>
-        <w:t xml:space="preserve">miova araka ny fotoana sy ny toerana</w:t>
+          <w:sz w:val="24"/>
+          <w:szCs w:val="24"/>
+        </w:rPr>
+        <w:t xml:space="preserve">misy porofo ara-tantara</w:t>
       </w:r>
       <w:r>
         <w:rPr>
@@ -5531,11 +5558,36 @@
           <w:i w:val="false"/>
           <w:iCs w:val="false"/>
           <w:color w:val="000000"/>
-          <w:sz w:val="20"/>
-          <w:szCs w:val="20"/>
-        </w:rPr>
-        <w:t xml:space="preserve"> ; 4. </w:t>
-      </w:r>
+          <w:sz w:val="24"/>
+          <w:szCs w:val="24"/>
+        </w:rPr>
+        <w:t xml:space="preserve">.</w:t>
+      </w:r>
+    </w:p>
+    <w:p>
+      <w:pPr>
+        <w:spacing w:after="20" w:before="0"/>
+        <w:jc w:val="left"/>
+      </w:pPr>
+      <w:r>
+        <w:rPr>
+          <w:rFonts w:ascii="Times New Roman" w:cs="Times New Roman" w:eastAsia="Times New Roman" w:hAnsi="Times New Roman"/>
+          <w:b w:val="false"/>
+          <w:bCs w:val="false"/>
+          <w:i w:val="false"/>
+          <w:iCs w:val="false"/>
+          <w:color w:val="000000"/>
+          <w:sz w:val="8"/>
+          <w:szCs w:val="8"/>
+        </w:rPr>
+        <w:t xml:space="preserve"/>
+      </w:r>
+    </w:p>
+    <w:p>
+      <w:pPr>
+        <w:spacing w:after="40" w:before="0"/>
+        <w:jc w:val="left"/>
+      </w:pPr>
       <w:r>
         <w:rPr>
           <w:rFonts w:ascii="Times New Roman" w:cs="Times New Roman" w:eastAsia="Times New Roman" w:hAnsi="Times New Roman"/>
@@ -5544,11 +5596,17 @@
           <w:i w:val="false"/>
           <w:iCs w:val="false"/>
           <w:color w:val="C2185B"/>
-          <w:sz w:val="20"/>
-          <w:szCs w:val="20"/>
-        </w:rPr>
-        <w:t xml:space="preserve">misy porofo ara-tantara</w:t>
-      </w:r>
+          <w:sz w:val="26"/>
+          <w:szCs w:val="26"/>
+        </w:rPr>
+        <w:t xml:space="preserve">Valin'ny fanazaran-tena faha 3</w:t>
+      </w:r>
+    </w:p>
+    <w:p>
+      <w:pPr>
+        <w:spacing w:after="20" w:before="0"/>
+        <w:jc w:val="left"/>
+      </w:pPr>
       <w:r>
         <w:rPr>
           <w:rFonts w:ascii="Times New Roman" w:cs="Times New Roman" w:eastAsia="Times New Roman" w:hAnsi="Times New Roman"/>
@@ -5557,36 +5615,11 @@
           <w:i w:val="false"/>
           <w:iCs w:val="false"/>
           <w:color w:val="000000"/>
-          <w:sz w:val="20"/>
-          <w:szCs w:val="20"/>
-        </w:rPr>
-        <w:t xml:space="preserve">.</w:t>
-      </w:r>
-    </w:p>
-    <w:p>
-      <w:pPr>
-        <w:spacing w:after="20" w:before="0"/>
-        <w:jc w:val="left"/>
-      </w:pPr>
-      <w:r>
-        <w:rPr>
-          <w:rFonts w:ascii="Times New Roman" w:cs="Times New Roman" w:eastAsia="Times New Roman" w:hAnsi="Times New Roman"/>
-          <w:b w:val="false"/>
-          <w:bCs w:val="false"/>
-          <w:i w:val="false"/>
-          <w:iCs w:val="false"/>
-          <w:color w:val="000000"/>
-          <w:sz w:val="8"/>
-          <w:szCs w:val="8"/>
-        </w:rPr>
-        <w:t xml:space="preserve"/>
-      </w:r>
-    </w:p>
-    <w:p>
-      <w:pPr>
-        <w:spacing w:after="40" w:before="0"/>
-        <w:jc w:val="left"/>
-      </w:pPr>
+          <w:sz w:val="24"/>
+          <w:szCs w:val="24"/>
+        </w:rPr>
+        <w:t xml:space="preserve">Ny </w:t>
+      </w:r>
       <w:r>
         <w:rPr>
           <w:rFonts w:ascii="Times New Roman" w:cs="Times New Roman" w:eastAsia="Times New Roman" w:hAnsi="Times New Roman"/>
@@ -5595,17 +5628,11 @@
           <w:i w:val="false"/>
           <w:iCs w:val="false"/>
           <w:color w:val="C2185B"/>
-          <w:sz w:val="22"/>
-          <w:szCs w:val="22"/>
-        </w:rPr>
-        <w:t xml:space="preserve">Valin'ny fanazaran-tena faha 3</w:t>
-      </w:r>
-    </w:p>
-    <w:p>
-      <w:pPr>
-        <w:spacing w:after="20" w:before="0"/>
-        <w:jc w:val="left"/>
-      </w:pPr>
+          <w:sz w:val="24"/>
+          <w:szCs w:val="24"/>
+        </w:rPr>
+        <w:t xml:space="preserve">fahaleovantena (1960) no zava-nitranga ara-tantara</w:t>
+      </w:r>
       <w:r>
         <w:rPr>
           <w:rFonts w:ascii="Times New Roman" w:cs="Times New Roman" w:eastAsia="Times New Roman" w:hAnsi="Times New Roman"/>
@@ -5614,10 +5641,10 @@
           <w:i w:val="false"/>
           <w:iCs w:val="false"/>
           <w:color w:val="000000"/>
-          <w:sz w:val="20"/>
-          <w:szCs w:val="20"/>
-        </w:rPr>
-        <w:t xml:space="preserve">Ny </w:t>
+          <w:sz w:val="24"/>
+          <w:szCs w:val="24"/>
+        </w:rPr>
+        <w:t xml:space="preserve"> : zava-nisy marina, voafaritra ny daty sy ny toerana, misy porofo (1,5 isa). Ny </w:t>
       </w:r>
       <w:r>
         <w:rPr>
@@ -5627,10 +5654,10 @@
           <w:i w:val="false"/>
           <w:iCs w:val="false"/>
           <w:color w:val="C2185B"/>
-          <w:sz w:val="20"/>
-          <w:szCs w:val="20"/>
-        </w:rPr>
-        <w:t xml:space="preserve">fahaleovantena (1960) no zava-nitranga ara-tantara</w:t>
+          <w:sz w:val="24"/>
+          <w:szCs w:val="24"/>
+        </w:rPr>
+        <w:t xml:space="preserve">anganon'Ibonia dia tsy Tantara</w:t>
       </w:r>
       <w:r>
         <w:rPr>
@@ -5640,24 +5667,17 @@
           <w:i w:val="false"/>
           <w:iCs w:val="false"/>
           <w:color w:val="000000"/>
-          <w:sz w:val="20"/>
-          <w:szCs w:val="20"/>
-        </w:rPr>
-        <w:t xml:space="preserve"> : zava-nisy marina, voafaritra ny daty sy ny toerana, misy porofo (1,5 isa). Ny </w:t>
-      </w:r>
-      <w:r>
-        <w:rPr>
-          <w:rFonts w:ascii="Times New Roman" w:cs="Times New Roman" w:eastAsia="Times New Roman" w:hAnsi="Times New Roman"/>
-          <w:b/>
-          <w:bCs/>
-          <w:i w:val="false"/>
-          <w:iCs w:val="false"/>
-          <w:color w:val="C2185B"/>
-          <w:sz w:val="20"/>
-          <w:szCs w:val="20"/>
-        </w:rPr>
-        <w:t xml:space="preserve">anganon'Ibonia dia tsy Tantara</w:t>
-      </w:r>
+          <w:sz w:val="24"/>
+          <w:szCs w:val="24"/>
+        </w:rPr>
+        <w:t xml:space="preserve"> : tsy misy porofo ary tsy voafaritra ny fotoana nitrangany (1,5 isa).</w:t>
+      </w:r>
+    </w:p>
+    <w:p>
+      <w:pPr>
+        <w:spacing w:after="20" w:before="0"/>
+        <w:jc w:val="left"/>
+      </w:pPr>
       <w:r>
         <w:rPr>
           <w:rFonts w:ascii="Times New Roman" w:cs="Times New Roman" w:eastAsia="Times New Roman" w:hAnsi="Times New Roman"/>
@@ -5666,25 +5686,6 @@
           <w:i w:val="false"/>
           <w:iCs w:val="false"/>
           <w:color w:val="000000"/>
-          <w:sz w:val="20"/>
-          <w:szCs w:val="20"/>
-        </w:rPr>
-        <w:t xml:space="preserve"> : tsy misy porofo ary tsy voafaritra ny fotoana nitrangany (1,5 isa).</w:t>
-      </w:r>
-    </w:p>
-    <w:p>
-      <w:pPr>
-        <w:spacing w:after="20" w:before="0"/>
-        <w:jc w:val="left"/>
-      </w:pPr>
-      <w:r>
-        <w:rPr>
-          <w:rFonts w:ascii="Times New Roman" w:cs="Times New Roman" w:eastAsia="Times New Roman" w:hAnsi="Times New Roman"/>
-          <w:b w:val="false"/>
-          <w:bCs w:val="false"/>
-          <w:i w:val="false"/>
-          <w:iCs w:val="false"/>
-          <w:color w:val="000000"/>
           <w:sz w:val="8"/>
           <w:szCs w:val="8"/>
         </w:rPr>
@@ -5693,7 +5694,7 @@
     </w:p>
     <w:sectPr>
       <w:pgSz w:w="11906" w:h="16838" w:orient="portrait"/>
-      <w:pgMar w:top="900" w:right="1000" w:bottom="900" w:left="1000" w:header="708" w:footer="708" w:gutter="0"/>
+      <w:pgMar w:top="1417" w:right="1417" w:bottom="1417" w:left="1417" w:header="708" w:footer="708" w:gutter="0"/>
       <w:pgNumType/>
       <w:docGrid w:linePitch="360"/>
     </w:sectPr>
@@ -5879,9 +5880,10 @@
   <w:docDefaults>
     <w:rPrDefault>
       <w:rPr>
+        <w:lang w:val="mg-MG" w:eastAsia="mg-MG" w:bidi="mg-MG"/>
         <w:rFonts w:ascii="Times New Roman" w:cs="Times New Roman" w:eastAsia="Times New Roman" w:hAnsi="Times New Roman"/>
-        <w:sz w:val="22"/>
-        <w:szCs w:val="22"/>
+        <w:sz w:val="24"/>
+        <w:szCs w:val="24"/>
       </w:rPr>
     </w:rPrDefault>
     <w:pPrDefault/>

</xml_diff>

<commit_message>
Tantara T6 : suppression de TOUS les encadres Fantatrao ve (rendu + avant-propos) ; journal skills a jour
Co-authored-by: arena-agent <297053741+arena-agent@users.noreply.github.com>
</commit_message>
<xml_diff>
--- a/manuel-tantara-t6/livrables/Echantillon_Seho1_Tantara_T6_JLearn.docx
+++ b/manuel-tantara-t6/livrables/Echantillon_Seho1_Tantara_T6_JLearn.docx
@@ -4275,112 +4275,6 @@
         <w:t xml:space="preserve">Sary 2 — Ny dingana mankany amin'ny fahalalana ara-tantara</w:t>
       </w:r>
     </w:p>
-    <w:p>
-      <w:pPr>
-        <w:spacing w:after="40" w:before="0"/>
-        <w:jc w:val="left"/>
-      </w:pPr>
-      <w:r>
-        <w:rPr>
-          <w:rFonts w:ascii="Times New Roman" w:cs="Times New Roman" w:eastAsia="Times New Roman" w:hAnsi="Times New Roman"/>
-          <w:b w:val="false"/>
-          <w:bCs w:val="false"/>
-          <w:i w:val="false"/>
-          <w:iCs w:val="false"/>
-          <w:color w:val="000000"/>
-          <w:sz w:val="10"/>
-          <w:szCs w:val="10"/>
-        </w:rPr>
-        <w:t xml:space="preserve"/>
-      </w:r>
-    </w:p>
-    <w:tbl>
-      <w:tblPr>
-        <w:tblW w:type="pct" w:w="100%"/>
-        <w:tblBorders>
-          <w:top w:val="single" w:color="auto" w:sz="4"/>
-          <w:left w:val="single" w:color="auto" w:sz="4"/>
-          <w:bottom w:val="single" w:color="auto" w:sz="4"/>
-          <w:right w:val="single" w:color="auto" w:sz="4"/>
-          <w:insideH w:val="single" w:color="auto" w:sz="4"/>
-          <w:insideV w:val="single" w:color="auto" w:sz="4"/>
-        </w:tblBorders>
-      </w:tblPr>
-      <w:tblGrid>
-        <w:gridCol w:w="100"/>
-      </w:tblGrid>
-      <w:tr>
-        <w:tc>
-          <w:tcPr>
-            <w:tcW w:type="pct" w:w="100%"/>
-            <w:shd w:fill="E8F2FB" w:color="auto" w:val="clear"/>
-            <w:tcMar>
-              <w:top w:type="dxa" w:w="60"/>
-              <w:left w:type="dxa" w:w="100"/>
-              <w:bottom w:type="dxa" w:w="60"/>
-              <w:right w:type="dxa" w:w="100"/>
-            </w:tcMar>
-          </w:tcPr>
-          <w:p>
-            <w:pPr>
-              <w:spacing w:after="60" w:before="0"/>
-              <w:jc w:val="left"/>
-            </w:pPr>
-            <w:r>
-              <w:rPr>
-                <w:rFonts w:ascii="Times New Roman" w:cs="Times New Roman" w:eastAsia="Times New Roman" w:hAnsi="Times New Roman"/>
-                <w:b/>
-                <w:bCs/>
-                <w:i w:val="false"/>
-                <w:iCs w:val="false"/>
-                <w:color w:val="1F4E79"/>
-                <w:sz w:val="24"/>
-                <w:szCs w:val="24"/>
-              </w:rPr>
-              <w:t xml:space="preserve">Fantatrao ve ?</w:t>
-            </w:r>
-          </w:p>
-          <w:p>
-            <w:pPr>
-              <w:spacing w:after="40" w:before="0"/>
-              <w:jc w:val="left"/>
-            </w:pPr>
-            <w:r>
-              <w:rPr>
-                <w:rFonts w:ascii="Times New Roman" w:cs="Times New Roman" w:eastAsia="Times New Roman" w:hAnsi="Times New Roman"/>
-                <w:b w:val="false"/>
-                <w:bCs w:val="false"/>
-                <w:i w:val="false"/>
-                <w:iCs w:val="false"/>
-                <w:color w:val="000000"/>
-                <w:sz w:val="24"/>
-                <w:szCs w:val="24"/>
-              </w:rPr>
-              <w:t xml:space="preserve">Ny grika Herodota (Hérodote, taonjato faha-5 talohan'i J.K.) no antsoina hoe « rain'ny Tantara » : izy no voalohany nanadihady sy nandrakitra an-tsoratra ny zava-nitranga, ka avy amin'ny bokiny « Historia » no niavian'ny anaran'ity siansa ity.</w:t>
-            </w:r>
-          </w:p>
-          <w:p>
-            <w:pPr>
-              <w:spacing w:after="40" w:before="0"/>
-              <w:jc w:val="left"/>
-            </w:pPr>
-            <w:r>
-              <w:rPr>
-                <w:rFonts w:ascii="Times New Roman" w:cs="Times New Roman" w:eastAsia="Times New Roman" w:hAnsi="Times New Roman"/>
-                <w:b w:val="false"/>
-                <w:bCs w:val="false"/>
-                <w:i w:val="false"/>
-                <w:iCs w:val="false"/>
-                <w:color w:val="000000"/>
-                <w:sz w:val="24"/>
-                <w:szCs w:val="24"/>
-              </w:rPr>
-              <w:t xml:space="preserve">Ny « Tantara ny Andriana eto Madagasikara », nangonin'ny Mompera Callet nanomboka tamin'ny 1868, dia lovan-tsofina malagasy voarakitra an-tsoratra : boky mihoatra ny pejy 1 200 izay lasa loharano lehibe indrindra ahalalana ny tantaran'ny Imerina !</w:t>
-            </w:r>
-          </w:p>
-        </w:tc>
-      </w:tr>
-    </w:tbl>
     <w:p>
       <w:pPr>
         <w:spacing w:after="40" w:before="0"/>

</xml_diff>